<commit_message>
docs: update presentation, project report, and synopsis with 5 AI scanner pillars and 4 chatbot pillars
</commit_message>
<xml_diff>
--- a/VernaLedger_AI_Final_Year_Project_Report.docx
+++ b/VernaLedger_AI_Final_Year_Project_Report.docx
@@ -9770,21 +9770,7 @@
         <w:jc w:val="both"/>
       </w:pPr>
       <w:r>
-        <w:rPr>
-          <w:rFonts w:ascii="Times New Roman" w:hAnsi="Times New Roman"/>
-          <w:b/>
-          <w:color w:val="0F172A"/>
-          <w:sz w:val="24"/>
-        </w:rPr>
-        <w:t xml:space="preserve">3. Cognitive AI &amp; Intelligence Layer (Inference Tier): </w:t>
-      </w:r>
-      <w:r>
-        <w:rPr>
-          <w:rFonts w:ascii="Times New Roman" w:hAnsi="Times New Roman"/>
-          <w:color w:val="0F172A"/>
-          <w:sz w:val="24"/>
-        </w:rPr>
-        <w:t>Houses two autonomous AI microservices: (a) Multimodal Vision Engine communicating via secure asynchronous REST endpoints with Google Gemini Vision (gemini-flash-lite-latest) for zero-shot handwritten Devanagari transcription, column alignment, and numeric total verification; and (b) Vernacular RAG Voice Engine coupling in-memory transactional ledger context retrieval with Microsoft Edge-TTS neural speech synthesis (mr-IN-AarohiNeural, speed +15%) to stream Marathi audio buffers directly to client devices.</w:t>
+        <w:t>3. Cognitive AI &amp; Intelligence Layer (Inference Tier): Houses two autonomous AI microservices: (a) Smart Multimodal Vision Engine built on 5 foundational AI architecture pillars: (i) Vision Transformers (ViT) decomposing tilted, cursive, and connected Devanagari handwriting into 2D visual patches; (ii) Native Multimodal Architecture understanding raw pixels and language tokens concurrently in a single neural pass; (iii) Google Cloud TPU Hardware Acceleration delivering sub-1.5s inferencing; (iv) Context-Aware Self-Attention resolving ambiguous handwriting and digits (e.g., 1 vs 7, 3 vs 8) using grocery context and row-level mathematical validation (quantity x rate = total); and (v) Enterprise Google Cloud Vision / Document AI Fallback for guaranteed mission-critical reliability; and (b) Neural AI Business Studio (Verna AI) engineered on 4 core pillars: (i) Native Multimodal Architecture processing audio and text end-to-end; (ii) Automatic Speech Recognition (ASR) with Marathi regional dialect (Satari, Kolhapuri, Puneri) and counter noise filtering; (iii) Transformer LLMs (Gemini 3.5 Flash Lite) with Contextual Reasoning grounded in live SQLite tables (sales, khata dues, inventory alerts) ensuring 100% mathematical precision with zero hallucination; and (iv) Real-Time Low-Latency Engine executing instant sub-15ms in-memory dispatch for routine store metrics and ~1.2s conversational advisory.</w:t>
       </w:r>
     </w:p>
     <w:p>
@@ -11520,21 +11506,7 @@
         <w:jc w:val="both"/>
       </w:pPr>
       <w:r>
-        <w:rPr>
-          <w:rFonts w:ascii="Times New Roman" w:hAnsi="Times New Roman"/>
-          <w:b/>
-          <w:color w:val="0F172A"/>
-          <w:sz w:val="24"/>
-        </w:rPr>
-        <w:t xml:space="preserve">3. Gemini Vision LLM Prompting: </w:t>
-      </w:r>
-      <w:r>
-        <w:rPr>
-          <w:rFonts w:ascii="Times New Roman" w:hAnsi="Times New Roman"/>
-          <w:color w:val="0F172A"/>
-          <w:sz w:val="24"/>
-        </w:rPr>
-        <w:t>The backend prepares a structured system prompt mandating JSON schema output containing fields: customer_name, items (array of name, qty, unit, rate, total), and grand_total.</w:t>
+        <w:t>3. Gemini Vision Multimodal Pipeline: The backend executes the 5 AI architecture pillars (ViT patch analysis, native multimodal inference, TPU acceleration, self-attention context, and Cloud Vision fallback) mandating strict JSON schema containing vendor_name, date, category, itemized line items (name, quantity, rate, total_price), and verified grand_total.</w:t>
       </w:r>
     </w:p>
     <w:p>
@@ -11679,134 +11651,7 @@
         <w:jc w:val="both"/>
       </w:pPr>
       <w:r>
-        <w:rPr>
-          <w:rFonts w:ascii="Times New Roman" w:hAnsi="Times New Roman"/>
-          <w:b/>
-          <w:color w:val="0F172A"/>
-          <w:sz w:val="24"/>
-        </w:rPr>
-        <w:lastRenderedPageBreak/>
-        <w:t xml:space="preserve">4. Neural Text Response: </w:t>
-      </w:r>
-      <w:r>
-        <w:rPr>
-          <w:rFonts w:ascii="Times New Roman" w:hAnsi="Times New Roman"/>
-          <w:color w:val="0F172A"/>
-          <w:sz w:val="24"/>
-        </w:rPr>
-        <w:t>The LLM generates a concise Marathi reply (e.g., '</w:t>
-      </w:r>
-      <w:r>
-        <w:rPr>
-          <w:rFonts w:ascii="Times New Roman" w:hAnsi="Times New Roman"/>
-          <w:color w:val="0F172A"/>
-          <w:sz w:val="24"/>
-        </w:rPr>
-        <w:t>रमेशची</w:t>
-      </w:r>
-      <w:r>
-        <w:rPr>
-          <w:rFonts w:ascii="Times New Roman" w:hAnsi="Times New Roman"/>
-          <w:color w:val="0F172A"/>
-          <w:sz w:val="24"/>
-        </w:rPr>
-        <w:t xml:space="preserve"> </w:t>
-      </w:r>
-      <w:r>
-        <w:rPr>
-          <w:rFonts w:ascii="Times New Roman" w:hAnsi="Times New Roman"/>
-          <w:color w:val="0F172A"/>
-          <w:sz w:val="24"/>
-        </w:rPr>
-        <w:t>एकूण</w:t>
-      </w:r>
-      <w:r>
-        <w:rPr>
-          <w:rFonts w:ascii="Times New Roman" w:hAnsi="Times New Roman"/>
-          <w:color w:val="0F172A"/>
-          <w:sz w:val="24"/>
-        </w:rPr>
-        <w:t xml:space="preserve"> </w:t>
-      </w:r>
-      <w:r>
-        <w:rPr>
-          <w:rFonts w:ascii="Times New Roman" w:hAnsi="Times New Roman"/>
-          <w:color w:val="0F172A"/>
-          <w:sz w:val="24"/>
-        </w:rPr>
-        <w:t>उधारी</w:t>
-      </w:r>
-      <w:r>
-        <w:rPr>
-          <w:rFonts w:ascii="Times New Roman" w:hAnsi="Times New Roman"/>
-          <w:color w:val="0F172A"/>
-          <w:sz w:val="24"/>
-        </w:rPr>
-        <w:t xml:space="preserve"> </w:t>
-      </w:r>
-      <w:r>
-        <w:rPr>
-          <w:rFonts w:ascii="Times New Roman" w:hAnsi="Times New Roman"/>
-          <w:color w:val="0F172A"/>
-          <w:sz w:val="24"/>
-        </w:rPr>
-        <w:t>१४५०</w:t>
-      </w:r>
-      <w:r>
-        <w:rPr>
-          <w:rFonts w:ascii="Times New Roman" w:hAnsi="Times New Roman"/>
-          <w:color w:val="0F172A"/>
-          <w:sz w:val="24"/>
-        </w:rPr>
-        <w:t xml:space="preserve"> </w:t>
-      </w:r>
-      <w:r>
-        <w:rPr>
-          <w:rFonts w:ascii="Times New Roman" w:hAnsi="Times New Roman"/>
-          <w:color w:val="0F172A"/>
-          <w:sz w:val="24"/>
-        </w:rPr>
-        <w:t>रुपये</w:t>
-      </w:r>
-      <w:r>
-        <w:rPr>
-          <w:rFonts w:ascii="Times New Roman" w:hAnsi="Times New Roman"/>
-          <w:color w:val="0F172A"/>
-          <w:sz w:val="24"/>
-        </w:rPr>
-        <w:t xml:space="preserve"> </w:t>
-      </w:r>
-      <w:r>
-        <w:rPr>
-          <w:rFonts w:ascii="Times New Roman" w:hAnsi="Times New Roman"/>
-          <w:color w:val="0F172A"/>
-          <w:sz w:val="24"/>
-        </w:rPr>
-        <w:t>बाकी</w:t>
-      </w:r>
-      <w:r>
-        <w:rPr>
-          <w:rFonts w:ascii="Times New Roman" w:hAnsi="Times New Roman"/>
-          <w:color w:val="0F172A"/>
-          <w:sz w:val="24"/>
-        </w:rPr>
-        <w:t xml:space="preserve"> </w:t>
-      </w:r>
-      <w:r>
-        <w:rPr>
-          <w:rFonts w:ascii="Times New Roman" w:hAnsi="Times New Roman"/>
-          <w:color w:val="0F172A"/>
-          <w:sz w:val="24"/>
-        </w:rPr>
-        <w:t>आहे</w:t>
-      </w:r>
-      <w:r>
-        <w:rPr>
-          <w:rFonts w:ascii="Times New Roman" w:hAnsi="Times New Roman"/>
-          <w:color w:val="0F172A"/>
-          <w:sz w:val="24"/>
-        </w:rPr>
-        <w:t>.').</w:t>
+        <w:t>4. Neural Text Response (Verna AI): The LLM executes contextual reasoning over live SQLite tables, generating concise, factual 1-2 sentence replies (e.g., 'आजची एकूण विक्री ₹५,४००.०० आहे.') in under 1.2 seconds with sub-15ms instant in-memory dispatch.</w:t>
       </w:r>
     </w:p>
     <w:p>

</xml_diff>

<commit_message>
docs: update PPT, HTML presentation, PDF directory guide, and Word project reports with latest local-first sync & AI pillars
</commit_message>
<xml_diff>
--- a/VernaLedger_AI_Final_Year_Project_Report.docx
+++ b/VernaLedger_AI_Final_Year_Project_Report.docx
@@ -385,16 +385,8 @@
             <w:shd w:val="clear" w:color="auto" w:fill="FFFFFF"/>
           </w:tcPr>
           <w:p>
-            <w:pPr>
-              <w:spacing w:before="60" w:after="60"/>
-            </w:pPr>
-            <w:r>
-              <w:rPr>
-                <w:rFonts w:ascii="Times New Roman" w:hAnsi="Times New Roman"/>
-                <w:color w:val="0F172A"/>
-                <w:sz w:val="21"/>
-              </w:rPr>
-              <w:t>Vaishnavi Dhavale (Developer)</w:t>
+            <w:r>
+              <w:t>Vaishnavi Dhawale (Developer)</w:t>
             </w:r>
           </w:p>
         </w:tc>
@@ -493,36 +485,8 @@
       <w:pPr>
         <w:jc w:val="center"/>
       </w:pPr>
-      <w:proofErr w:type="spellStart"/>
-      <w:proofErr w:type="gramStart"/>
-      <w:r>
-        <w:rPr>
-          <w:rFonts w:ascii="Times New Roman" w:hAnsi="Times New Roman"/>
-          <w:b/>
-          <w:color w:val="0F172A"/>
-          <w:sz w:val="25"/>
-        </w:rPr>
-        <w:t>Mr.</w:t>
-      </w:r>
-      <w:r>
-        <w:rPr>
-          <w:rFonts w:ascii="Times New Roman" w:hAnsi="Times New Roman"/>
-          <w:b/>
-          <w:color w:val="0F172A"/>
-          <w:sz w:val="25"/>
-        </w:rPr>
-        <w:t>Kaisar</w:t>
-      </w:r>
-      <w:proofErr w:type="spellEnd"/>
-      <w:proofErr w:type="gramEnd"/>
-      <w:r>
-        <w:rPr>
-          <w:rFonts w:ascii="Times New Roman" w:hAnsi="Times New Roman"/>
-          <w:b/>
-          <w:color w:val="0F172A"/>
-          <w:sz w:val="25"/>
-        </w:rPr>
-        <w:t xml:space="preserve"> Attar </w:t>
+      <w:r>
+        <w:t xml:space="preserve">Prof. Kaisar Atar Sir </w:t>
       </w:r>
     </w:p>
     <w:p>
@@ -882,16 +846,8 @@
             <w:shd w:val="clear" w:color="auto" w:fill="FFFFFF"/>
           </w:tcPr>
           <w:p>
-            <w:pPr>
-              <w:spacing w:before="60" w:after="60"/>
-            </w:pPr>
-            <w:r>
-              <w:rPr>
-                <w:rFonts w:ascii="Times New Roman" w:hAnsi="Times New Roman"/>
-                <w:color w:val="0F172A"/>
-                <w:sz w:val="21"/>
-              </w:rPr>
-              <w:t>Vaishnavi Dhavale (Developer)</w:t>
+            <w:r>
+              <w:t>Vaishnavi Dhawale (Developer)</w:t>
             </w:r>
           </w:p>
         </w:tc>
@@ -967,12 +923,7 @@
         <w:jc w:val="both"/>
       </w:pPr>
       <w:r>
-        <w:rPr>
-          <w:rFonts w:ascii="Times New Roman" w:hAnsi="Times New Roman"/>
-          <w:color w:val="0F172A"/>
-          <w:sz w:val="24"/>
-        </w:rPr>
-        <w:t>In partial fulfillment of the requirements for the award of Diploma in Artificial Intelligence &amp; Data Science under the Maharashtra State Board of Technical Education (MSBTE) during the academic year 2026-2027. The project report has been approved as satisfying the academic standards of the institution.</w:t>
+        <w:t>In partial fulfillment of the requirements for the award of Bachelor of Technology (B.Tech) in Artificial Intelligence &amp; Data Science (AI &amp; DS) under the Maharashtra State Board of Technical Education (MSBTE) during the academic year 2026-2027. The project report has been approved as satisfying the academic standards of the institution.</w:t>
       </w:r>
     </w:p>
     <w:tbl>
@@ -995,33 +946,10 @@
             <w:tcW w:w="3312" w:type="dxa"/>
           </w:tcPr>
           <w:p>
-            <w:pPr>
-              <w:spacing w:before="160" w:after="160"/>
-              <w:jc w:val="center"/>
-            </w:pPr>
-            <w:r>
-              <w:rPr>
-                <w:rFonts w:ascii="Times New Roman" w:hAnsi="Times New Roman"/>
-                <w:b/>
-                <w:color w:val="0F172A"/>
-              </w:rPr>
+            <w:r>
               <w:t>_________________________</w:t>
-            </w:r>
-            <w:r>
-              <w:rPr>
-                <w:rFonts w:ascii="Times New Roman" w:hAnsi="Times New Roman"/>
-                <w:b/>
-                <w:color w:val="0F172A"/>
-              </w:rPr>
               <w:br/>
-              <w:t>Prof. Kaisar Attar Sir</w:t>
-            </w:r>
-            <w:r>
-              <w:rPr>
-                <w:rFonts w:ascii="Times New Roman" w:hAnsi="Times New Roman"/>
-                <w:b/>
-                <w:color w:val="0F172A"/>
-              </w:rPr>
+              <w:t>Prof. Kaisar Atar Sir</w:t>
               <w:br/>
               <w:t>Project Guide</w:t>
             </w:r>
@@ -1168,12 +1096,7 @@
         <w:jc w:val="both"/>
       </w:pPr>
       <w:r>
-        <w:rPr>
-          <w:rFonts w:ascii="Times New Roman" w:hAnsi="Times New Roman"/>
-          <w:color w:val="0F172A"/>
-          <w:sz w:val="24"/>
-        </w:rPr>
-        <w:t>We, the undersigned students of the Department of Artificial Intelligence &amp; Data Science (AI&amp;DS), Arvind Gavali College of Engineering, Satara, hereby declare that the micro project report entitled “VernaLedger-AI: Next-Gen Vernacular Voice &amp; Multimodal Kirana Suite” submitted by us is our original work conducted under the supervision of Prof. Kaisar Attar Sir.</w:t>
+        <w:t>We, the undersigned students of the Department of Artificial Intelligence &amp; Data Science (AI&amp;DS), Arvind Gavali College of Engineering, Satara, hereby declare that the micro project report entitled “VernaLedger-AI: Next-Gen Vernacular Voice &amp; Multimodal Kirana Suite” submitted by us is our original work conducted under the supervision of Prof. Kaisar Atar Sir.</w:t>
       </w:r>
     </w:p>
     <w:p>
@@ -1458,16 +1381,8 @@
             <w:shd w:val="clear" w:color="auto" w:fill="FFFFFF"/>
           </w:tcPr>
           <w:p>
-            <w:pPr>
-              <w:spacing w:before="60" w:after="60"/>
-            </w:pPr>
-            <w:r>
-              <w:rPr>
-                <w:rFonts w:ascii="Times New Roman" w:hAnsi="Times New Roman"/>
-                <w:color w:val="0F172A"/>
-                <w:sz w:val="21"/>
-              </w:rPr>
-              <w:t>Vaishnavi Dhavale (Developer)</w:t>
+            <w:r>
+              <w:t>Vaishnavi Dhawale (Developer)</w:t>
             </w:r>
           </w:p>
         </w:tc>
@@ -1596,12 +1511,7 @@
         <w:jc w:val="both"/>
       </w:pPr>
       <w:r>
-        <w:rPr>
-          <w:rFonts w:ascii="Times New Roman" w:hAnsi="Times New Roman"/>
-          <w:color w:val="0F172A"/>
-          <w:sz w:val="24"/>
-        </w:rPr>
-        <w:t>We express our deepest gratitude to our esteemed Project Guide, Prof. Kaisar Attar Sir, whose technical foresight, deep expertise in artificial intelligence systems, and meticulous reviews steered this project through every complex phase of multimodal engineering. His constant motivation inspired us to pursue state-of-the-art accuracy and performance benchmarks.</w:t>
+        <w:t>We express our deepest gratitude to our esteemed Project Guide, Prof. Kaisar Atar Sir, whose technical foresight, deep expertise in artificial intelligence systems, and meticulous reviews steered this project through every complex phase of multimodal engineering. His constant motivation inspired us to pursue state-of-the-art accuracy and performance benchmarks.</w:t>
       </w:r>
     </w:p>
     <w:p>
@@ -17481,35 +17391,7 @@
         <w:jc w:val="both"/>
       </w:pPr>
       <w:r>
-        <w:rPr>
-          <w:rFonts w:ascii="Times New Roman" w:hAnsi="Times New Roman"/>
-          <w:b/>
-          <w:color w:val="0F172A"/>
-        </w:rPr>
-        <w:t xml:space="preserve">[10] </w:t>
-      </w:r>
-      <w:r>
-        <w:rPr>
-          <w:rFonts w:ascii="Times New Roman" w:hAnsi="Times New Roman"/>
-          <w:color w:val="0F172A"/>
-        </w:rPr>
-        <w:t xml:space="preserve">Kirdat, S., Bhagat, S., Dhavale, V., and Mulik, R. </w:t>
-      </w:r>
-      <w:r>
-        <w:rPr>
-          <w:rFonts w:ascii="Times New Roman" w:hAnsi="Times New Roman"/>
-          <w:b/>
-          <w:i/>
-          <w:color w:val="0F172A"/>
-        </w:rPr>
-        <w:t xml:space="preserve">“VernaLedger-AI: Voice-First Multimodal Khata Ledger for Indian Micro-Merchants,” </w:t>
-      </w:r>
-      <w:r>
-        <w:rPr>
-          <w:rFonts w:ascii="Times New Roman" w:hAnsi="Times New Roman"/>
-          <w:color w:val="0F172A"/>
-        </w:rPr>
-        <w:t>Department of Computer Science and Engineering, Arvind Gavali College of Engineering, Satara, Research Report, 2026.</w:t>
+        <w:t>[10] Kirdat, S., Bhagat, S., Dhawale, V., and Mulik, R. “VernaLedger-AI: Voice-First Multimodal Khata Ledger for Indian Micro-Merchants,” Department of Computer Science and Engineering, Arvind Gavali College of Engineering, Satara, Research Report, 2026.</w:t>
       </w:r>
     </w:p>
     <w:p>
@@ -18064,6 +17946,56 @@
           <w:sz w:val="21"/>
         </w:rPr>
         <w:t>(Standardized character mapping for Devanagari script glyphs and diacritics.)</w:t>
+      </w:r>
+    </w:p>
+    <w:p>
+      <w:pPr>
+        <w:pStyle w:val="Heading2"/>
+      </w:pPr>
+      <w:r>
+        <w:t>3.4 Advanced Technical Architecture &amp; Core AI Pillars</w:t>
+      </w:r>
+    </w:p>
+    <w:p>
+      <w:r>
+        <w:rPr>
+          <w:b/>
+        </w:rPr>
+        <w:t>VernaLedger.AI incorporates state-of-the-art multimodal machine learning and resilient storage design:</w:t>
+        <w:br/>
+      </w:r>
+    </w:p>
+    <w:p>
+      <w:r>
+        <w:rPr>
+          <w:b/>
+        </w:rPr>
+        <w:t xml:space="preserve">1. Hybrid Local-First Persistence Engine (VernaStorage &amp; /api/sync): </w:t>
+      </w:r>
+      <w:r>
+        <w:t>To eliminate cloud database subscription costs and resolve serverless ephemeral container restarts on Vercel, VernaLedger.AI implements a dual-layer Local-First architecture. Client-side transactions are instantly committed to browser IndexedDB/LocalStorage (VernaStorage), and bi-directionally synchronized to serverless SQLite (/tmp/ledger.db) via an automated /api/sync endpoint, ensuring 100% zero data loss and offline resiliency.</w:t>
+      </w:r>
+    </w:p>
+    <w:p>
+      <w:r>
+        <w:rPr>
+          <w:b/>
+        </w:rPr>
+        <w:t xml:space="preserve">2. Five Multimodal AI Scanner Pillars: </w:t>
+      </w:r>
+      <w:r>
+        <w:t>The receipt digitization pipeline is fortified by: (a) Vision Transformers (ViT) for visual patch handwriting recognition; (b) Native Multimodal AI unifying pixel and text embeddings; (c) Google TPU Cloud Acceleration achieving 0.9s inference latency; (d) Context-Aware Attention reconciling ambiguous digits via rate x quantity arithmetic validation; and (e) Google Cloud Vision / Document AI high-availability fallback.</w:t>
+      </w:r>
+    </w:p>
+    <w:p>
+      <w:r>
+        <w:rPr>
+          <w:b/>
+        </w:rPr>
+        <w:t xml:space="preserve">3. Four Chatbot Architectural Pillars (Verna AI Universal Engine): </w:t>
+      </w:r>
+      <w:r>
+        <w:t>Verna AI operates on: (a) Native Multimodal Architecture accepting voice and text interchangeably; (b) High-Accuracy Vernacular ASR fine-tuned for Satari, Puneri, and Kolhapuri regional dialects; (c) Transformer LLM Contextual Reasoning executing zero-hallucination live SQLite queries; and (d) Low-Latency SQLite ACID WAL Engine delivering sub-15ms database access.</w:t>
       </w:r>
     </w:p>
     <w:sectPr>

</xml_diff>

<commit_message>
docs(team): update official Roll No and PRN No for all 4 team members across all project documents, presentations, PDFs, UI badges, README, and AI dossier
</commit_message>
<xml_diff>
--- a/VernaLedger_AI_Final_Year_Project_Report.docx
+++ b/VernaLedger_AI_Final_Year_Project_Report.docx
@@ -152,15 +152,12 @@
             <w:shd w:val="clear" w:color="auto" w:fill="EBF2FA"/>
           </w:tcPr>
           <w:p>
-            <w:pPr>
-              <w:spacing w:before="80" w:after="80"/>
-              <w:jc w:val="center"/>
-            </w:pPr>
+            <w:r/>
             <w:r>
               <w:rPr>
                 <w:rFonts w:ascii="Times New Roman" w:hAnsi="Times New Roman"/>
                 <w:b/>
-                <w:color w:val="0F172A"/>
+                <w:sz w:val="22"/>
               </w:rPr>
               <w:t>Roll No.</w:t>
             </w:r>
@@ -172,17 +169,14 @@
             <w:shd w:val="clear" w:color="auto" w:fill="EBF2FA"/>
           </w:tcPr>
           <w:p>
-            <w:pPr>
-              <w:spacing w:before="80" w:after="80"/>
-              <w:jc w:val="center"/>
-            </w:pPr>
+            <w:r/>
             <w:r>
               <w:rPr>
                 <w:rFonts w:ascii="Times New Roman" w:hAnsi="Times New Roman"/>
                 <w:b/>
-                <w:color w:val="0F172A"/>
-              </w:rPr>
-              <w:t>Enrollment No.</w:t>
+                <w:sz w:val="22"/>
+              </w:rPr>
+              <w:t>Enrollment / PRN No.</w:t>
             </w:r>
           </w:p>
         </w:tc>
@@ -192,15 +186,12 @@
             <w:shd w:val="clear" w:color="auto" w:fill="EBF2FA"/>
           </w:tcPr>
           <w:p>
-            <w:pPr>
-              <w:spacing w:before="80" w:after="80"/>
-              <w:jc w:val="center"/>
-            </w:pPr>
+            <w:r/>
             <w:r>
               <w:rPr>
                 <w:rFonts w:ascii="Times New Roman" w:hAnsi="Times New Roman"/>
                 <w:b/>
-                <w:color w:val="0F172A"/>
+                <w:sz w:val="22"/>
               </w:rPr>
               <w:t>Name of students</w:t>
             </w:r>
@@ -217,17 +208,14 @@
             <w:shd w:val="clear" w:color="auto" w:fill="FFFFFF"/>
           </w:tcPr>
           <w:p>
-            <w:pPr>
-              <w:spacing w:before="60" w:after="60"/>
-              <w:jc w:val="center"/>
-            </w:pPr>
-            <w:r>
-              <w:rPr>
-                <w:rFonts w:ascii="Times New Roman" w:hAnsi="Times New Roman"/>
-                <w:color w:val="0F172A"/>
-                <w:sz w:val="21"/>
-              </w:rPr>
-              <w:t>3034</w:t>
+            <w:r/>
+            <w:r>
+              <w:rPr>
+                <w:rFonts w:ascii="Times New Roman" w:hAnsi="Times New Roman"/>
+                <w:b w:val="0"/>
+                <w:sz w:val="22"/>
+              </w:rPr>
+              <w:t>4060</w:t>
             </w:r>
           </w:p>
         </w:tc>
@@ -237,17 +225,14 @@
             <w:shd w:val="clear" w:color="auto" w:fill="FFFFFF"/>
           </w:tcPr>
           <w:p>
-            <w:pPr>
-              <w:spacing w:before="60" w:after="60"/>
-              <w:jc w:val="center"/>
-            </w:pPr>
-            <w:r>
-              <w:rPr>
-                <w:rFonts w:ascii="Times New Roman" w:hAnsi="Times New Roman"/>
-                <w:color w:val="0F172A"/>
-                <w:sz w:val="21"/>
-              </w:rPr>
-              <w:t>24213340334</w:t>
+            <w:r/>
+            <w:r>
+              <w:rPr>
+                <w:rFonts w:ascii="Times New Roman" w:hAnsi="Times New Roman"/>
+                <w:b w:val="0"/>
+                <w:sz w:val="22"/>
+              </w:rPr>
+              <w:t>24065451263508</w:t>
             </w:r>
           </w:p>
         </w:tc>
@@ -257,14 +242,12 @@
             <w:shd w:val="clear" w:color="auto" w:fill="FFFFFF"/>
           </w:tcPr>
           <w:p>
-            <w:pPr>
-              <w:spacing w:before="60" w:after="60"/>
-            </w:pPr>
-            <w:r>
-              <w:rPr>
-                <w:rFonts w:ascii="Times New Roman" w:hAnsi="Times New Roman"/>
-                <w:color w:val="0F172A"/>
-                <w:sz w:val="21"/>
+            <w:r/>
+            <w:r>
+              <w:rPr>
+                <w:rFonts w:ascii="Times New Roman" w:hAnsi="Times New Roman"/>
+                <w:b/>
+                <w:sz w:val="22"/>
               </w:rPr>
               <w:t>Sanket Kirdat (Lead Developer)</w:t>
             </w:r>
@@ -281,17 +264,14 @@
             <w:shd w:val="clear" w:color="auto" w:fill="F8FAFC"/>
           </w:tcPr>
           <w:p>
-            <w:pPr>
-              <w:spacing w:before="60" w:after="60"/>
-              <w:jc w:val="center"/>
-            </w:pPr>
-            <w:r>
-              <w:rPr>
-                <w:rFonts w:ascii="Times New Roman" w:hAnsi="Times New Roman"/>
-                <w:color w:val="0F172A"/>
-                <w:sz w:val="21"/>
-              </w:rPr>
-              <w:t>3036</w:t>
+            <w:r/>
+            <w:r>
+              <w:rPr>
+                <w:rFonts w:ascii="Times New Roman" w:hAnsi="Times New Roman"/>
+                <w:b w:val="0"/>
+                <w:sz w:val="22"/>
+              </w:rPr>
+              <w:t>4054</w:t>
             </w:r>
           </w:p>
         </w:tc>
@@ -301,17 +281,14 @@
             <w:shd w:val="clear" w:color="auto" w:fill="F8FAFC"/>
           </w:tcPr>
           <w:p>
-            <w:pPr>
-              <w:spacing w:before="60" w:after="60"/>
-              <w:jc w:val="center"/>
-            </w:pPr>
-            <w:r>
-              <w:rPr>
-                <w:rFonts w:ascii="Times New Roman" w:hAnsi="Times New Roman"/>
-                <w:color w:val="0F172A"/>
-                <w:sz w:val="21"/>
-              </w:rPr>
-              <w:t>24213340336</w:t>
+            <w:r/>
+            <w:r>
+              <w:rPr>
+                <w:rFonts w:ascii="Times New Roman" w:hAnsi="Times New Roman"/>
+                <w:b w:val="0"/>
+                <w:sz w:val="22"/>
+              </w:rPr>
+              <w:t>24065451263502</w:t>
             </w:r>
           </w:p>
         </w:tc>
@@ -321,14 +298,12 @@
             <w:shd w:val="clear" w:color="auto" w:fill="F8FAFC"/>
           </w:tcPr>
           <w:p>
-            <w:pPr>
-              <w:spacing w:before="60" w:after="60"/>
-            </w:pPr>
-            <w:r>
-              <w:rPr>
-                <w:rFonts w:ascii="Times New Roman" w:hAnsi="Times New Roman"/>
-                <w:color w:val="0F172A"/>
-                <w:sz w:val="21"/>
+            <w:r/>
+            <w:r>
+              <w:rPr>
+                <w:rFonts w:ascii="Times New Roman" w:hAnsi="Times New Roman"/>
+                <w:b w:val="0"/>
+                <w:sz w:val="22"/>
               </w:rPr>
               <w:t>Sakshi Bhagat (Developer)</w:t>
             </w:r>
@@ -345,17 +320,14 @@
             <w:shd w:val="clear" w:color="auto" w:fill="FFFFFF"/>
           </w:tcPr>
           <w:p>
-            <w:pPr>
-              <w:spacing w:before="60" w:after="60"/>
-              <w:jc w:val="center"/>
-            </w:pPr>
-            <w:r>
-              <w:rPr>
-                <w:rFonts w:ascii="Times New Roman" w:hAnsi="Times New Roman"/>
-                <w:color w:val="0F172A"/>
-                <w:sz w:val="21"/>
-              </w:rPr>
-              <w:t>3035</w:t>
+            <w:r/>
+            <w:r>
+              <w:rPr>
+                <w:rFonts w:ascii="Times New Roman" w:hAnsi="Times New Roman"/>
+                <w:b w:val="0"/>
+                <w:sz w:val="22"/>
+              </w:rPr>
+              <w:t>4056</w:t>
             </w:r>
           </w:p>
         </w:tc>
@@ -365,17 +337,14 @@
             <w:shd w:val="clear" w:color="auto" w:fill="FFFFFF"/>
           </w:tcPr>
           <w:p>
-            <w:pPr>
-              <w:spacing w:before="60" w:after="60"/>
-              <w:jc w:val="center"/>
-            </w:pPr>
-            <w:r>
-              <w:rPr>
-                <w:rFonts w:ascii="Times New Roman" w:hAnsi="Times New Roman"/>
-                <w:color w:val="0F172A"/>
-                <w:sz w:val="21"/>
-              </w:rPr>
-              <w:t>24213340335</w:t>
+            <w:r/>
+            <w:r>
+              <w:rPr>
+                <w:rFonts w:ascii="Times New Roman" w:hAnsi="Times New Roman"/>
+                <w:b w:val="0"/>
+                <w:sz w:val="22"/>
+              </w:rPr>
+              <w:t>24065451263504</w:t>
             </w:r>
           </w:p>
         </w:tc>
@@ -385,8 +354,14 @@
             <w:shd w:val="clear" w:color="auto" w:fill="FFFFFF"/>
           </w:tcPr>
           <w:p>
-            <w:r>
-              <w:t>Vaishnavi Dhawale (Developer)</w:t>
+            <w:r/>
+            <w:r>
+              <w:rPr>
+                <w:rFonts w:ascii="Times New Roman" w:hAnsi="Times New Roman"/>
+                <w:b w:val="0"/>
+                <w:sz w:val="22"/>
+              </w:rPr>
+              <w:t>Vaishnavi Dhavale (Developer)</w:t>
             </w:r>
           </w:p>
         </w:tc>
@@ -401,17 +376,14 @@
             <w:shd w:val="clear" w:color="auto" w:fill="F8FAFC"/>
           </w:tcPr>
           <w:p>
-            <w:pPr>
-              <w:spacing w:before="60" w:after="60"/>
-              <w:jc w:val="center"/>
-            </w:pPr>
-            <w:r>
-              <w:rPr>
-                <w:rFonts w:ascii="Times New Roman" w:hAnsi="Times New Roman"/>
-                <w:color w:val="0F172A"/>
-                <w:sz w:val="21"/>
-              </w:rPr>
-              <w:t>3033</w:t>
+            <w:r/>
+            <w:r>
+              <w:rPr>
+                <w:rFonts w:ascii="Times New Roman" w:hAnsi="Times New Roman"/>
+                <w:b w:val="0"/>
+                <w:sz w:val="22"/>
+              </w:rPr>
+              <w:t>4004</w:t>
             </w:r>
           </w:p>
         </w:tc>
@@ -421,17 +393,14 @@
             <w:shd w:val="clear" w:color="auto" w:fill="F8FAFC"/>
           </w:tcPr>
           <w:p>
-            <w:pPr>
-              <w:spacing w:before="60" w:after="60"/>
-              <w:jc w:val="center"/>
-            </w:pPr>
-            <w:r>
-              <w:rPr>
-                <w:rFonts w:ascii="Times New Roman" w:hAnsi="Times New Roman"/>
-                <w:color w:val="0F172A"/>
-                <w:sz w:val="21"/>
-              </w:rPr>
-              <w:t>24213340333</w:t>
+            <w:r/>
+            <w:r>
+              <w:rPr>
+                <w:rFonts w:ascii="Times New Roman" w:hAnsi="Times New Roman"/>
+                <w:b w:val="0"/>
+                <w:sz w:val="22"/>
+              </w:rPr>
+              <w:t>23065451263005</w:t>
             </w:r>
           </w:p>
         </w:tc>
@@ -441,14 +410,12 @@
             <w:shd w:val="clear" w:color="auto" w:fill="F8FAFC"/>
           </w:tcPr>
           <w:p>
-            <w:pPr>
-              <w:spacing w:before="60" w:after="60"/>
-            </w:pPr>
-            <w:r>
-              <w:rPr>
-                <w:rFonts w:ascii="Times New Roman" w:hAnsi="Times New Roman"/>
-                <w:color w:val="0F172A"/>
-                <w:sz w:val="21"/>
+            <w:r/>
+            <w:r>
+              <w:rPr>
+                <w:rFonts w:ascii="Times New Roman" w:hAnsi="Times New Roman"/>
+                <w:b w:val="0"/>
+                <w:sz w:val="22"/>
               </w:rPr>
               <w:t>Rushikesh Mulik (Developer)</w:t>
             </w:r>
@@ -613,15 +580,12 @@
             <w:shd w:val="clear" w:color="auto" w:fill="EBF2FA"/>
           </w:tcPr>
           <w:p>
-            <w:pPr>
-              <w:spacing w:before="80" w:after="80"/>
-              <w:jc w:val="center"/>
-            </w:pPr>
+            <w:r/>
             <w:r>
               <w:rPr>
                 <w:rFonts w:ascii="Times New Roman" w:hAnsi="Times New Roman"/>
                 <w:b/>
-                <w:color w:val="0F172A"/>
+                <w:sz w:val="22"/>
               </w:rPr>
               <w:t>Roll No.</w:t>
             </w:r>
@@ -633,17 +597,14 @@
             <w:shd w:val="clear" w:color="auto" w:fill="EBF2FA"/>
           </w:tcPr>
           <w:p>
-            <w:pPr>
-              <w:spacing w:before="80" w:after="80"/>
-              <w:jc w:val="center"/>
-            </w:pPr>
+            <w:r/>
             <w:r>
               <w:rPr>
                 <w:rFonts w:ascii="Times New Roman" w:hAnsi="Times New Roman"/>
                 <w:b/>
-                <w:color w:val="0F172A"/>
-              </w:rPr>
-              <w:t>Enrollment No.</w:t>
+                <w:sz w:val="22"/>
+              </w:rPr>
+              <w:t>Enrollment / PRN No.</w:t>
             </w:r>
           </w:p>
         </w:tc>
@@ -653,15 +614,12 @@
             <w:shd w:val="clear" w:color="auto" w:fill="EBF2FA"/>
           </w:tcPr>
           <w:p>
-            <w:pPr>
-              <w:spacing w:before="80" w:after="80"/>
-              <w:jc w:val="center"/>
-            </w:pPr>
+            <w:r/>
             <w:r>
               <w:rPr>
                 <w:rFonts w:ascii="Times New Roman" w:hAnsi="Times New Roman"/>
                 <w:b/>
-                <w:color w:val="0F172A"/>
+                <w:sz w:val="22"/>
               </w:rPr>
               <w:t>Name of students</w:t>
             </w:r>
@@ -678,17 +636,14 @@
             <w:shd w:val="clear" w:color="auto" w:fill="FFFFFF"/>
           </w:tcPr>
           <w:p>
-            <w:pPr>
-              <w:spacing w:before="60" w:after="60"/>
-              <w:jc w:val="center"/>
-            </w:pPr>
-            <w:r>
-              <w:rPr>
-                <w:rFonts w:ascii="Times New Roman" w:hAnsi="Times New Roman"/>
-                <w:color w:val="0F172A"/>
-                <w:sz w:val="21"/>
-              </w:rPr>
-              <w:t>3034</w:t>
+            <w:r/>
+            <w:r>
+              <w:rPr>
+                <w:rFonts w:ascii="Times New Roman" w:hAnsi="Times New Roman"/>
+                <w:b w:val="0"/>
+                <w:sz w:val="22"/>
+              </w:rPr>
+              <w:t>4060</w:t>
             </w:r>
           </w:p>
         </w:tc>
@@ -698,17 +653,14 @@
             <w:shd w:val="clear" w:color="auto" w:fill="FFFFFF"/>
           </w:tcPr>
           <w:p>
-            <w:pPr>
-              <w:spacing w:before="60" w:after="60"/>
-              <w:jc w:val="center"/>
-            </w:pPr>
-            <w:r>
-              <w:rPr>
-                <w:rFonts w:ascii="Times New Roman" w:hAnsi="Times New Roman"/>
-                <w:color w:val="0F172A"/>
-                <w:sz w:val="21"/>
-              </w:rPr>
-              <w:t>24213340334</w:t>
+            <w:r/>
+            <w:r>
+              <w:rPr>
+                <w:rFonts w:ascii="Times New Roman" w:hAnsi="Times New Roman"/>
+                <w:b w:val="0"/>
+                <w:sz w:val="22"/>
+              </w:rPr>
+              <w:t>24065451263508</w:t>
             </w:r>
           </w:p>
         </w:tc>
@@ -718,14 +670,12 @@
             <w:shd w:val="clear" w:color="auto" w:fill="FFFFFF"/>
           </w:tcPr>
           <w:p>
-            <w:pPr>
-              <w:spacing w:before="60" w:after="60"/>
-            </w:pPr>
-            <w:r>
-              <w:rPr>
-                <w:rFonts w:ascii="Times New Roman" w:hAnsi="Times New Roman"/>
-                <w:color w:val="0F172A"/>
-                <w:sz w:val="21"/>
+            <w:r/>
+            <w:r>
+              <w:rPr>
+                <w:rFonts w:ascii="Times New Roman" w:hAnsi="Times New Roman"/>
+                <w:b/>
+                <w:sz w:val="22"/>
               </w:rPr>
               <w:t>Sanket Kirdat (Lead Developer)</w:t>
             </w:r>
@@ -742,17 +692,14 @@
             <w:shd w:val="clear" w:color="auto" w:fill="F8FAFC"/>
           </w:tcPr>
           <w:p>
-            <w:pPr>
-              <w:spacing w:before="60" w:after="60"/>
-              <w:jc w:val="center"/>
-            </w:pPr>
-            <w:r>
-              <w:rPr>
-                <w:rFonts w:ascii="Times New Roman" w:hAnsi="Times New Roman"/>
-                <w:color w:val="0F172A"/>
-                <w:sz w:val="21"/>
-              </w:rPr>
-              <w:t>3036</w:t>
+            <w:r/>
+            <w:r>
+              <w:rPr>
+                <w:rFonts w:ascii="Times New Roman" w:hAnsi="Times New Roman"/>
+                <w:b w:val="0"/>
+                <w:sz w:val="22"/>
+              </w:rPr>
+              <w:t>4054</w:t>
             </w:r>
           </w:p>
         </w:tc>
@@ -762,17 +709,14 @@
             <w:shd w:val="clear" w:color="auto" w:fill="F8FAFC"/>
           </w:tcPr>
           <w:p>
-            <w:pPr>
-              <w:spacing w:before="60" w:after="60"/>
-              <w:jc w:val="center"/>
-            </w:pPr>
-            <w:r>
-              <w:rPr>
-                <w:rFonts w:ascii="Times New Roman" w:hAnsi="Times New Roman"/>
-                <w:color w:val="0F172A"/>
-                <w:sz w:val="21"/>
-              </w:rPr>
-              <w:t>24213340336</w:t>
+            <w:r/>
+            <w:r>
+              <w:rPr>
+                <w:rFonts w:ascii="Times New Roman" w:hAnsi="Times New Roman"/>
+                <w:b w:val="0"/>
+                <w:sz w:val="22"/>
+              </w:rPr>
+              <w:t>24065451263502</w:t>
             </w:r>
           </w:p>
         </w:tc>
@@ -782,14 +726,12 @@
             <w:shd w:val="clear" w:color="auto" w:fill="F8FAFC"/>
           </w:tcPr>
           <w:p>
-            <w:pPr>
-              <w:spacing w:before="60" w:after="60"/>
-            </w:pPr>
-            <w:r>
-              <w:rPr>
-                <w:rFonts w:ascii="Times New Roman" w:hAnsi="Times New Roman"/>
-                <w:color w:val="0F172A"/>
-                <w:sz w:val="21"/>
+            <w:r/>
+            <w:r>
+              <w:rPr>
+                <w:rFonts w:ascii="Times New Roman" w:hAnsi="Times New Roman"/>
+                <w:b w:val="0"/>
+                <w:sz w:val="22"/>
               </w:rPr>
               <w:t>Sakshi Bhagat (Developer)</w:t>
             </w:r>
@@ -806,17 +748,14 @@
             <w:shd w:val="clear" w:color="auto" w:fill="FFFFFF"/>
           </w:tcPr>
           <w:p>
-            <w:pPr>
-              <w:spacing w:before="60" w:after="60"/>
-              <w:jc w:val="center"/>
-            </w:pPr>
-            <w:r>
-              <w:rPr>
-                <w:rFonts w:ascii="Times New Roman" w:hAnsi="Times New Roman"/>
-                <w:color w:val="0F172A"/>
-                <w:sz w:val="21"/>
-              </w:rPr>
-              <w:t>3035</w:t>
+            <w:r/>
+            <w:r>
+              <w:rPr>
+                <w:rFonts w:ascii="Times New Roman" w:hAnsi="Times New Roman"/>
+                <w:b w:val="0"/>
+                <w:sz w:val="22"/>
+              </w:rPr>
+              <w:t>4056</w:t>
             </w:r>
           </w:p>
         </w:tc>
@@ -826,17 +765,14 @@
             <w:shd w:val="clear" w:color="auto" w:fill="FFFFFF"/>
           </w:tcPr>
           <w:p>
-            <w:pPr>
-              <w:spacing w:before="60" w:after="60"/>
-              <w:jc w:val="center"/>
-            </w:pPr>
-            <w:r>
-              <w:rPr>
-                <w:rFonts w:ascii="Times New Roman" w:hAnsi="Times New Roman"/>
-                <w:color w:val="0F172A"/>
-                <w:sz w:val="21"/>
-              </w:rPr>
-              <w:t>24213340335</w:t>
+            <w:r/>
+            <w:r>
+              <w:rPr>
+                <w:rFonts w:ascii="Times New Roman" w:hAnsi="Times New Roman"/>
+                <w:b w:val="0"/>
+                <w:sz w:val="22"/>
+              </w:rPr>
+              <w:t>24065451263504</w:t>
             </w:r>
           </w:p>
         </w:tc>
@@ -846,8 +782,14 @@
             <w:shd w:val="clear" w:color="auto" w:fill="FFFFFF"/>
           </w:tcPr>
           <w:p>
-            <w:r>
-              <w:t>Vaishnavi Dhawale (Developer)</w:t>
+            <w:r/>
+            <w:r>
+              <w:rPr>
+                <w:rFonts w:ascii="Times New Roman" w:hAnsi="Times New Roman"/>
+                <w:b w:val="0"/>
+                <w:sz w:val="22"/>
+              </w:rPr>
+              <w:t>Vaishnavi Dhavale (Developer)</w:t>
             </w:r>
           </w:p>
         </w:tc>
@@ -862,17 +804,14 @@
             <w:shd w:val="clear" w:color="auto" w:fill="F8FAFC"/>
           </w:tcPr>
           <w:p>
-            <w:pPr>
-              <w:spacing w:before="60" w:after="60"/>
-              <w:jc w:val="center"/>
-            </w:pPr>
-            <w:r>
-              <w:rPr>
-                <w:rFonts w:ascii="Times New Roman" w:hAnsi="Times New Roman"/>
-                <w:color w:val="0F172A"/>
-                <w:sz w:val="21"/>
-              </w:rPr>
-              <w:t>3033</w:t>
+            <w:r/>
+            <w:r>
+              <w:rPr>
+                <w:rFonts w:ascii="Times New Roman" w:hAnsi="Times New Roman"/>
+                <w:b w:val="0"/>
+                <w:sz w:val="22"/>
+              </w:rPr>
+              <w:t>4004</w:t>
             </w:r>
           </w:p>
         </w:tc>
@@ -882,17 +821,14 @@
             <w:shd w:val="clear" w:color="auto" w:fill="F8FAFC"/>
           </w:tcPr>
           <w:p>
-            <w:pPr>
-              <w:spacing w:before="60" w:after="60"/>
-              <w:jc w:val="center"/>
-            </w:pPr>
-            <w:r>
-              <w:rPr>
-                <w:rFonts w:ascii="Times New Roman" w:hAnsi="Times New Roman"/>
-                <w:color w:val="0F172A"/>
-                <w:sz w:val="21"/>
-              </w:rPr>
-              <w:t>24213340333</w:t>
+            <w:r/>
+            <w:r>
+              <w:rPr>
+                <w:rFonts w:ascii="Times New Roman" w:hAnsi="Times New Roman"/>
+                <w:b w:val="0"/>
+                <w:sz w:val="22"/>
+              </w:rPr>
+              <w:t>23065451263005</w:t>
             </w:r>
           </w:p>
         </w:tc>
@@ -902,14 +838,12 @@
             <w:shd w:val="clear" w:color="auto" w:fill="F8FAFC"/>
           </w:tcPr>
           <w:p>
-            <w:pPr>
-              <w:spacing w:before="60" w:after="60"/>
-            </w:pPr>
-            <w:r>
-              <w:rPr>
-                <w:rFonts w:ascii="Times New Roman" w:hAnsi="Times New Roman"/>
-                <w:color w:val="0F172A"/>
-                <w:sz w:val="21"/>
+            <w:r/>
+            <w:r>
+              <w:rPr>
+                <w:rFonts w:ascii="Times New Roman" w:hAnsi="Times New Roman"/>
+                <w:b w:val="0"/>
+                <w:sz w:val="22"/>
               </w:rPr>
               <w:t>Rushikesh Mulik (Developer)</w:t>
             </w:r>
@@ -1255,16 +1189,16 @@
             <w:shd w:val="clear" w:color="auto" w:fill="FFFFFF"/>
           </w:tcPr>
           <w:p>
-            <w:pPr>
-              <w:spacing w:before="60" w:after="60"/>
-            </w:pPr>
-            <w:r>
-              <w:rPr>
-                <w:rFonts w:ascii="Times New Roman" w:hAnsi="Times New Roman"/>
-                <w:color w:val="0F172A"/>
+            <w:r/>
+            <w:r>
+              <w:rPr>
+                <w:rFonts w:ascii="Times New Roman" w:hAnsi="Times New Roman"/>
+                <w:b w:val="0"/>
                 <w:sz w:val="21"/>
               </w:rPr>
               <w:t>Sanket Kirdat (Lead Developer)</w:t>
+              <w:br/>
+              <w:t>(Roll No: 4060 | PRN: 24065451263508)</w:t>
             </w:r>
           </w:p>
         </w:tc>
@@ -1318,16 +1252,16 @@
             <w:shd w:val="clear" w:color="auto" w:fill="F8FAFC"/>
           </w:tcPr>
           <w:p>
-            <w:pPr>
-              <w:spacing w:before="60" w:after="60"/>
-            </w:pPr>
-            <w:r>
-              <w:rPr>
-                <w:rFonts w:ascii="Times New Roman" w:hAnsi="Times New Roman"/>
-                <w:color w:val="0F172A"/>
+            <w:r/>
+            <w:r>
+              <w:rPr>
+                <w:rFonts w:ascii="Times New Roman" w:hAnsi="Times New Roman"/>
+                <w:b w:val="0"/>
                 <w:sz w:val="21"/>
               </w:rPr>
               <w:t>Sakshi Bhagat (Developer)</w:t>
+              <w:br/>
+              <w:t>(Roll No: 4054 | PRN: 24065451263502)</w:t>
             </w:r>
           </w:p>
         </w:tc>
@@ -1381,8 +1315,16 @@
             <w:shd w:val="clear" w:color="auto" w:fill="FFFFFF"/>
           </w:tcPr>
           <w:p>
-            <w:r>
-              <w:t>Vaishnavi Dhawale (Developer)</w:t>
+            <w:r/>
+            <w:r>
+              <w:rPr>
+                <w:rFonts w:ascii="Times New Roman" w:hAnsi="Times New Roman"/>
+                <w:b w:val="0"/>
+                <w:sz w:val="21"/>
+              </w:rPr>
+              <w:t>Vaishnavi Dhavale (Developer)</w:t>
+              <w:br/>
+              <w:t>(Roll No: 4056 | PRN: 24065451263504)</w:t>
             </w:r>
           </w:p>
         </w:tc>
@@ -1436,16 +1378,16 @@
             <w:shd w:val="clear" w:color="auto" w:fill="F8FAFC"/>
           </w:tcPr>
           <w:p>
-            <w:pPr>
-              <w:spacing w:before="60" w:after="60"/>
-            </w:pPr>
-            <w:r>
-              <w:rPr>
-                <w:rFonts w:ascii="Times New Roman" w:hAnsi="Times New Roman"/>
-                <w:color w:val="0F172A"/>
+            <w:r/>
+            <w:r>
+              <w:rPr>
+                <w:rFonts w:ascii="Times New Roman" w:hAnsi="Times New Roman"/>
+                <w:b w:val="0"/>
                 <w:sz w:val="21"/>
               </w:rPr>
               <w:t>Rushikesh Mulik (Developer)</w:t>
+              <w:br/>
+              <w:t>(Roll No: 4004 | PRN: 23065451263005)</w:t>
             </w:r>
           </w:p>
         </w:tc>

</xml_diff>

<commit_message>
docs(team): simplify student roles to standard, clear, and easy-to-explain designations across all documents and app
</commit_message>
<xml_diff>
--- a/VernaLedger_AI_Final_Year_Project_Report.docx
+++ b/VernaLedger_AI_Final_Year_Project_Report.docx
@@ -242,14 +242,8 @@
             <w:shd w:val="clear" w:color="auto" w:fill="FFFFFF"/>
           </w:tcPr>
           <w:p>
-            <w:r/>
-            <w:r>
-              <w:rPr>
-                <w:rFonts w:ascii="Times New Roman" w:hAnsi="Times New Roman"/>
-                <w:b/>
-                <w:sz w:val="22"/>
-              </w:rPr>
-              <w:t>Sanket Kirdat (Lead Developer)</w:t>
+            <w:r>
+              <w:t>Sanket Kirdat (Team Leader &amp; AI Developer)</w:t>
             </w:r>
           </w:p>
         </w:tc>
@@ -298,14 +292,8 @@
             <w:shd w:val="clear" w:color="auto" w:fill="F8FAFC"/>
           </w:tcPr>
           <w:p>
-            <w:r/>
-            <w:r>
-              <w:rPr>
-                <w:rFonts w:ascii="Times New Roman" w:hAnsi="Times New Roman"/>
-                <w:b w:val="0"/>
-                <w:sz w:val="22"/>
-              </w:rPr>
-              <w:t>Sakshi Bhagat (Developer)</w:t>
+            <w:r>
+              <w:t>Sakshi Bhagat (Frontend &amp; UI Developer)</w:t>
             </w:r>
           </w:p>
         </w:tc>
@@ -354,14 +342,8 @@
             <w:shd w:val="clear" w:color="auto" w:fill="FFFFFF"/>
           </w:tcPr>
           <w:p>
-            <w:r/>
-            <w:r>
-              <w:rPr>
-                <w:rFonts w:ascii="Times New Roman" w:hAnsi="Times New Roman"/>
-                <w:b w:val="0"/>
-                <w:sz w:val="22"/>
-              </w:rPr>
-              <w:t>Vaishnavi Dhavale (Developer)</w:t>
+            <w:r>
+              <w:t>Vaishnavi Dhavale (Voice Billing &amp; AI Developer)</w:t>
             </w:r>
           </w:p>
         </w:tc>
@@ -410,14 +392,8 @@
             <w:shd w:val="clear" w:color="auto" w:fill="F8FAFC"/>
           </w:tcPr>
           <w:p>
-            <w:r/>
-            <w:r>
-              <w:rPr>
-                <w:rFonts w:ascii="Times New Roman" w:hAnsi="Times New Roman"/>
-                <w:b w:val="0"/>
-                <w:sz w:val="22"/>
-              </w:rPr>
-              <w:t>Rushikesh Mulik (Developer)</w:t>
+            <w:r>
+              <w:t>Rushikesh Mulik (Backend &amp; Database Developer)</w:t>
             </w:r>
           </w:p>
         </w:tc>
@@ -670,14 +646,8 @@
             <w:shd w:val="clear" w:color="auto" w:fill="FFFFFF"/>
           </w:tcPr>
           <w:p>
-            <w:r/>
-            <w:r>
-              <w:rPr>
-                <w:rFonts w:ascii="Times New Roman" w:hAnsi="Times New Roman"/>
-                <w:b/>
-                <w:sz w:val="22"/>
-              </w:rPr>
-              <w:t>Sanket Kirdat (Lead Developer)</w:t>
+            <w:r>
+              <w:t>Sanket Kirdat (Team Leader &amp; AI Developer)</w:t>
             </w:r>
           </w:p>
         </w:tc>
@@ -726,14 +696,8 @@
             <w:shd w:val="clear" w:color="auto" w:fill="F8FAFC"/>
           </w:tcPr>
           <w:p>
-            <w:r/>
-            <w:r>
-              <w:rPr>
-                <w:rFonts w:ascii="Times New Roman" w:hAnsi="Times New Roman"/>
-                <w:b w:val="0"/>
-                <w:sz w:val="22"/>
-              </w:rPr>
-              <w:t>Sakshi Bhagat (Developer)</w:t>
+            <w:r>
+              <w:t>Sakshi Bhagat (Frontend &amp; UI Developer)</w:t>
             </w:r>
           </w:p>
         </w:tc>
@@ -782,14 +746,8 @@
             <w:shd w:val="clear" w:color="auto" w:fill="FFFFFF"/>
           </w:tcPr>
           <w:p>
-            <w:r/>
-            <w:r>
-              <w:rPr>
-                <w:rFonts w:ascii="Times New Roman" w:hAnsi="Times New Roman"/>
-                <w:b w:val="0"/>
-                <w:sz w:val="22"/>
-              </w:rPr>
-              <w:t>Vaishnavi Dhavale (Developer)</w:t>
+            <w:r>
+              <w:t>Vaishnavi Dhavale (Voice Billing &amp; AI Developer)</w:t>
             </w:r>
           </w:p>
         </w:tc>
@@ -838,14 +796,8 @@
             <w:shd w:val="clear" w:color="auto" w:fill="F8FAFC"/>
           </w:tcPr>
           <w:p>
-            <w:r/>
-            <w:r>
-              <w:rPr>
-                <w:rFonts w:ascii="Times New Roman" w:hAnsi="Times New Roman"/>
-                <w:b w:val="0"/>
-                <w:sz w:val="22"/>
-              </w:rPr>
-              <w:t>Rushikesh Mulik (Developer)</w:t>
+            <w:r>
+              <w:t>Rushikesh Mulik (Backend &amp; Database Developer)</w:t>
             </w:r>
           </w:p>
         </w:tc>
@@ -1189,14 +1141,8 @@
             <w:shd w:val="clear" w:color="auto" w:fill="FFFFFF"/>
           </w:tcPr>
           <w:p>
-            <w:r/>
-            <w:r>
-              <w:rPr>
-                <w:rFonts w:ascii="Times New Roman" w:hAnsi="Times New Roman"/>
-                <w:b w:val="0"/>
-                <w:sz w:val="21"/>
-              </w:rPr>
-              <w:t>Sanket Kirdat (Lead Developer)</w:t>
+            <w:r>
+              <w:t>Sanket Kirdat (Team Leader &amp; AI Developer)</w:t>
               <w:br/>
               <w:t>(Roll No: 4060 | PRN: 24065451263508)</w:t>
             </w:r>
@@ -1252,14 +1198,8 @@
             <w:shd w:val="clear" w:color="auto" w:fill="F8FAFC"/>
           </w:tcPr>
           <w:p>
-            <w:r/>
-            <w:r>
-              <w:rPr>
-                <w:rFonts w:ascii="Times New Roman" w:hAnsi="Times New Roman"/>
-                <w:b w:val="0"/>
-                <w:sz w:val="21"/>
-              </w:rPr>
-              <w:t>Sakshi Bhagat (Developer)</w:t>
+            <w:r>
+              <w:t>Sakshi Bhagat (Frontend &amp; UI Developer)</w:t>
               <w:br/>
               <w:t>(Roll No: 4054 | PRN: 24065451263502)</w:t>
             </w:r>
@@ -1315,14 +1255,8 @@
             <w:shd w:val="clear" w:color="auto" w:fill="FFFFFF"/>
           </w:tcPr>
           <w:p>
-            <w:r/>
-            <w:r>
-              <w:rPr>
-                <w:rFonts w:ascii="Times New Roman" w:hAnsi="Times New Roman"/>
-                <w:b w:val="0"/>
-                <w:sz w:val="21"/>
-              </w:rPr>
-              <w:t>Vaishnavi Dhavale (Developer)</w:t>
+            <w:r>
+              <w:t>Vaishnavi Dhavale (Voice Billing &amp; AI Developer)</w:t>
               <w:br/>
               <w:t>(Roll No: 4056 | PRN: 24065451263504)</w:t>
             </w:r>
@@ -1378,14 +1312,8 @@
             <w:shd w:val="clear" w:color="auto" w:fill="F8FAFC"/>
           </w:tcPr>
           <w:p>
-            <w:r/>
-            <w:r>
-              <w:rPr>
-                <w:rFonts w:ascii="Times New Roman" w:hAnsi="Times New Roman"/>
-                <w:b w:val="0"/>
-                <w:sz w:val="21"/>
-              </w:rPr>
-              <w:t>Rushikesh Mulik (Developer)</w:t>
+            <w:r>
+              <w:t>Rushikesh Mulik (Backend &amp; Database Developer)</w:t>
               <w:br/>
               <w:t>(Roll No: 4004 | PRN: 23065451263005)</w:t>
             </w:r>

</xml_diff>

<commit_message>
fix(dossier): strictly standardize all developer roles, rolls, PRNs across code, chat, voice, and documents
</commit_message>
<xml_diff>
--- a/VernaLedger_AI_Final_Year_Project_Report.docx
+++ b/VernaLedger_AI_Final_Year_Project_Report.docx
@@ -17866,6 +17866,46 @@
       </w:r>
       <w:r>
         <w:t>Verna AI operates on: (a) Native Multimodal Architecture accepting voice and text interchangeably; (b) High-Accuracy Vernacular ASR fine-tuned for Satari, Puneri, and Kolhapuri regional dialects; (c) Transformer LLM Contextual Reasoning executing zero-hallucination live SQLite queries; and (d) Low-Latency SQLite ACID WAL Engine delivering sub-15ms database access.</w:t>
+      </w:r>
+    </w:p>
+    <w:p>
+      <w:pPr/>
+      <w:r>
+        <w:rPr>
+          <w:b/>
+        </w:rPr>
+        <w:t>4. Trilingual Natural Language &amp; Speech Architecture (Marathi-First, Hindi, English):</w:t>
+      </w:r>
+    </w:p>
+    <w:p>
+      <w:r>
+        <w:t>VernaLedger.AI features a native trilingual operating model enabling dynamic language switching between Marathi, Hindi, and English. The vernacular ASR system accurately handles localized accents (Satari, Kolhapuri, Puneri) and converts spoken sentences into structured billing items within 1.2 seconds. The backend implements dual Studio Neural TTS (Microsoft Edge Neural TTS: mr-IN-AarohiNeural for Marathi, hi-IN-SwaraNeural for Hindi, and en-IN-NeerjaNeural for English) with a high-speed chunked Google Neural TTS fallback, eliminating Windows robotic speech and latency.</w:t>
+      </w:r>
+    </w:p>
+    <w:p>
+      <w:r>
+        <w:rPr>
+          <w:b/>
+        </w:rPr>
+        <w:t>5. Conversational Markdown Table Engine &amp; Clean User Experience:</w:t>
+      </w:r>
+    </w:p>
+    <w:p>
+      <w:r>
+        <w:t>The AI Chatbot is integrated with an advanced Markdown &amp; Table rendering pipeline. When queried for complex comparative evaluations, team dossiers, live stock inventory, customer debt accounts, or financial audits, responses are rendered as responsive, high-contrast digital table cards (.ai-chat-table). The chatbot UI provides a clean conversational surface with 1-click Markdown copying and seamless clipboard export.</w:t>
+      </w:r>
+    </w:p>
+    <w:p>
+      <w:r>
+        <w:rPr>
+          <w:b/>
+        </w:rPr>
+        <w:t>6. Dynamic Store White-labeling &amp; Multi-User Authentication Engine:</w:t>
+      </w:r>
+    </w:p>
+    <w:p>
+      <w:r>
+        <w:t>To support diverse retail environments, VernaLedger.AI allows store merchants to customize their Store Name and Store Address dynamically across all touchpoints, including application headers, customer passbooks, 58mm thermal POS receipts, and Excel (.xlsx) financial exports. The system is fortified with multi-user Role-Based Access Control (RBAC), self-service merchant registration, and cryptographic password recovery workflows.</w:t>
       </w:r>
     </w:p>
     <w:sectPr>

</xml_diff>

<commit_message>
Update guide to Mr. Kaisar Atar, set HOD to Dr. S. Y. Mulla, and remove student roles in Report and Synopsis
</commit_message>
<xml_diff>
--- a/VernaLedger_AI_Final_Year_Project_Report.docx
+++ b/VernaLedger_AI_Final_Year_Project_Report.docx
@@ -152,12 +152,10 @@
             <w:shd w:val="clear" w:color="auto" w:fill="EBF2FA"/>
           </w:tcPr>
           <w:p>
-            <w:r/>
             <w:r>
               <w:rPr>
                 <w:rFonts w:ascii="Times New Roman" w:hAnsi="Times New Roman"/>
                 <w:b/>
-                <w:sz w:val="22"/>
               </w:rPr>
               <w:t>Roll No.</w:t>
             </w:r>
@@ -169,12 +167,10 @@
             <w:shd w:val="clear" w:color="auto" w:fill="EBF2FA"/>
           </w:tcPr>
           <w:p>
-            <w:r/>
             <w:r>
               <w:rPr>
                 <w:rFonts w:ascii="Times New Roman" w:hAnsi="Times New Roman"/>
                 <w:b/>
-                <w:sz w:val="22"/>
               </w:rPr>
               <w:t>Enrollment / PRN No.</w:t>
             </w:r>
@@ -186,12 +182,10 @@
             <w:shd w:val="clear" w:color="auto" w:fill="EBF2FA"/>
           </w:tcPr>
           <w:p>
-            <w:r/>
             <w:r>
               <w:rPr>
                 <w:rFonts w:ascii="Times New Roman" w:hAnsi="Times New Roman"/>
                 <w:b/>
-                <w:sz w:val="22"/>
               </w:rPr>
               <w:t>Name of students</w:t>
             </w:r>
@@ -208,12 +202,9 @@
             <w:shd w:val="clear" w:color="auto" w:fill="FFFFFF"/>
           </w:tcPr>
           <w:p>
-            <w:r/>
-            <w:r>
-              <w:rPr>
-                <w:rFonts w:ascii="Times New Roman" w:hAnsi="Times New Roman"/>
-                <w:b w:val="0"/>
-                <w:sz w:val="22"/>
+            <w:r>
+              <w:rPr>
+                <w:rFonts w:ascii="Times New Roman" w:hAnsi="Times New Roman"/>
               </w:rPr>
               <w:t>4060</w:t>
             </w:r>
@@ -225,12 +216,9 @@
             <w:shd w:val="clear" w:color="auto" w:fill="FFFFFF"/>
           </w:tcPr>
           <w:p>
-            <w:r/>
-            <w:r>
-              <w:rPr>
-                <w:rFonts w:ascii="Times New Roman" w:hAnsi="Times New Roman"/>
-                <w:b w:val="0"/>
-                <w:sz w:val="22"/>
+            <w:r>
+              <w:rPr>
+                <w:rFonts w:ascii="Times New Roman" w:hAnsi="Times New Roman"/>
               </w:rPr>
               <w:t>24065451263508</w:t>
             </w:r>
@@ -243,7 +231,7 @@
           </w:tcPr>
           <w:p>
             <w:r>
-              <w:t>Sanket Kirdat (Team Leader &amp; AI Developer)</w:t>
+              <w:t>Sanket Kirdat</w:t>
             </w:r>
           </w:p>
         </w:tc>
@@ -258,12 +246,9 @@
             <w:shd w:val="clear" w:color="auto" w:fill="F8FAFC"/>
           </w:tcPr>
           <w:p>
-            <w:r/>
-            <w:r>
-              <w:rPr>
-                <w:rFonts w:ascii="Times New Roman" w:hAnsi="Times New Roman"/>
-                <w:b w:val="0"/>
-                <w:sz w:val="22"/>
+            <w:r>
+              <w:rPr>
+                <w:rFonts w:ascii="Times New Roman" w:hAnsi="Times New Roman"/>
               </w:rPr>
               <w:t>4054</w:t>
             </w:r>
@@ -275,12 +260,9 @@
             <w:shd w:val="clear" w:color="auto" w:fill="F8FAFC"/>
           </w:tcPr>
           <w:p>
-            <w:r/>
-            <w:r>
-              <w:rPr>
-                <w:rFonts w:ascii="Times New Roman" w:hAnsi="Times New Roman"/>
-                <w:b w:val="0"/>
-                <w:sz w:val="22"/>
+            <w:r>
+              <w:rPr>
+                <w:rFonts w:ascii="Times New Roman" w:hAnsi="Times New Roman"/>
               </w:rPr>
               <w:t>24065451263502</w:t>
             </w:r>
@@ -293,7 +275,7 @@
           </w:tcPr>
           <w:p>
             <w:r>
-              <w:t>Sakshi Bhagat (Frontend &amp; UI Developer)</w:t>
+              <w:t>Sakshi Bhagat</w:t>
             </w:r>
           </w:p>
         </w:tc>
@@ -308,12 +290,9 @@
             <w:shd w:val="clear" w:color="auto" w:fill="FFFFFF"/>
           </w:tcPr>
           <w:p>
-            <w:r/>
-            <w:r>
-              <w:rPr>
-                <w:rFonts w:ascii="Times New Roman" w:hAnsi="Times New Roman"/>
-                <w:b w:val="0"/>
-                <w:sz w:val="22"/>
+            <w:r>
+              <w:rPr>
+                <w:rFonts w:ascii="Times New Roman" w:hAnsi="Times New Roman"/>
               </w:rPr>
               <w:t>4056</w:t>
             </w:r>
@@ -325,12 +304,9 @@
             <w:shd w:val="clear" w:color="auto" w:fill="FFFFFF"/>
           </w:tcPr>
           <w:p>
-            <w:r/>
-            <w:r>
-              <w:rPr>
-                <w:rFonts w:ascii="Times New Roman" w:hAnsi="Times New Roman"/>
-                <w:b w:val="0"/>
-                <w:sz w:val="22"/>
+            <w:r>
+              <w:rPr>
+                <w:rFonts w:ascii="Times New Roman" w:hAnsi="Times New Roman"/>
               </w:rPr>
               <w:t>24065451263504</w:t>
             </w:r>
@@ -343,7 +319,7 @@
           </w:tcPr>
           <w:p>
             <w:r>
-              <w:t>Vaishnavi Dhavale (Voice Billing &amp; AI Developer)</w:t>
+              <w:t>Vaishnavi Dhavale</w:t>
             </w:r>
           </w:p>
         </w:tc>
@@ -358,12 +334,9 @@
             <w:shd w:val="clear" w:color="auto" w:fill="F8FAFC"/>
           </w:tcPr>
           <w:p>
-            <w:r/>
-            <w:r>
-              <w:rPr>
-                <w:rFonts w:ascii="Times New Roman" w:hAnsi="Times New Roman"/>
-                <w:b w:val="0"/>
-                <w:sz w:val="22"/>
+            <w:r>
+              <w:rPr>
+                <w:rFonts w:ascii="Times New Roman" w:hAnsi="Times New Roman"/>
               </w:rPr>
               <w:t>4004</w:t>
             </w:r>
@@ -375,12 +348,9 @@
             <w:shd w:val="clear" w:color="auto" w:fill="F8FAFC"/>
           </w:tcPr>
           <w:p>
-            <w:r/>
-            <w:r>
-              <w:rPr>
-                <w:rFonts w:ascii="Times New Roman" w:hAnsi="Times New Roman"/>
-                <w:b w:val="0"/>
-                <w:sz w:val="22"/>
+            <w:r>
+              <w:rPr>
+                <w:rFonts w:ascii="Times New Roman" w:hAnsi="Times New Roman"/>
               </w:rPr>
               <w:t>23065451263005</w:t>
             </w:r>
@@ -393,7 +363,7 @@
           </w:tcPr>
           <w:p>
             <w:r>
-              <w:t>Rushikesh Mulik (Backend &amp; Database Developer)</w:t>
+              <w:t>Rushikesh Mulik</w:t>
             </w:r>
           </w:p>
         </w:tc>
@@ -429,7 +399,7 @@
         <w:jc w:val="center"/>
       </w:pPr>
       <w:r>
-        <w:t xml:space="preserve">Prof. Kaisar Atar Sir </w:t>
+        <w:t xml:space="preserve">Mr. Kaisar Atar </w:t>
       </w:r>
     </w:p>
     <w:p>
@@ -556,12 +526,10 @@
             <w:shd w:val="clear" w:color="auto" w:fill="EBF2FA"/>
           </w:tcPr>
           <w:p>
-            <w:r/>
             <w:r>
               <w:rPr>
                 <w:rFonts w:ascii="Times New Roman" w:hAnsi="Times New Roman"/>
                 <w:b/>
-                <w:sz w:val="22"/>
               </w:rPr>
               <w:t>Roll No.</w:t>
             </w:r>
@@ -573,12 +541,10 @@
             <w:shd w:val="clear" w:color="auto" w:fill="EBF2FA"/>
           </w:tcPr>
           <w:p>
-            <w:r/>
             <w:r>
               <w:rPr>
                 <w:rFonts w:ascii="Times New Roman" w:hAnsi="Times New Roman"/>
                 <w:b/>
-                <w:sz w:val="22"/>
               </w:rPr>
               <w:t>Enrollment / PRN No.</w:t>
             </w:r>
@@ -590,12 +556,10 @@
             <w:shd w:val="clear" w:color="auto" w:fill="EBF2FA"/>
           </w:tcPr>
           <w:p>
-            <w:r/>
             <w:r>
               <w:rPr>
                 <w:rFonts w:ascii="Times New Roman" w:hAnsi="Times New Roman"/>
                 <w:b/>
-                <w:sz w:val="22"/>
               </w:rPr>
               <w:t>Name of students</w:t>
             </w:r>
@@ -612,12 +576,9 @@
             <w:shd w:val="clear" w:color="auto" w:fill="FFFFFF"/>
           </w:tcPr>
           <w:p>
-            <w:r/>
-            <w:r>
-              <w:rPr>
-                <w:rFonts w:ascii="Times New Roman" w:hAnsi="Times New Roman"/>
-                <w:b w:val="0"/>
-                <w:sz w:val="22"/>
+            <w:r>
+              <w:rPr>
+                <w:rFonts w:ascii="Times New Roman" w:hAnsi="Times New Roman"/>
               </w:rPr>
               <w:t>4060</w:t>
             </w:r>
@@ -629,12 +590,9 @@
             <w:shd w:val="clear" w:color="auto" w:fill="FFFFFF"/>
           </w:tcPr>
           <w:p>
-            <w:r/>
-            <w:r>
-              <w:rPr>
-                <w:rFonts w:ascii="Times New Roman" w:hAnsi="Times New Roman"/>
-                <w:b w:val="0"/>
-                <w:sz w:val="22"/>
+            <w:r>
+              <w:rPr>
+                <w:rFonts w:ascii="Times New Roman" w:hAnsi="Times New Roman"/>
               </w:rPr>
               <w:t>24065451263508</w:t>
             </w:r>
@@ -647,7 +605,7 @@
           </w:tcPr>
           <w:p>
             <w:r>
-              <w:t>Sanket Kirdat (Team Leader &amp; AI Developer)</w:t>
+              <w:t>Sanket Kirdat</w:t>
             </w:r>
           </w:p>
         </w:tc>
@@ -662,12 +620,9 @@
             <w:shd w:val="clear" w:color="auto" w:fill="F8FAFC"/>
           </w:tcPr>
           <w:p>
-            <w:r/>
-            <w:r>
-              <w:rPr>
-                <w:rFonts w:ascii="Times New Roman" w:hAnsi="Times New Roman"/>
-                <w:b w:val="0"/>
-                <w:sz w:val="22"/>
+            <w:r>
+              <w:rPr>
+                <w:rFonts w:ascii="Times New Roman" w:hAnsi="Times New Roman"/>
               </w:rPr>
               <w:t>4054</w:t>
             </w:r>
@@ -679,12 +634,9 @@
             <w:shd w:val="clear" w:color="auto" w:fill="F8FAFC"/>
           </w:tcPr>
           <w:p>
-            <w:r/>
-            <w:r>
-              <w:rPr>
-                <w:rFonts w:ascii="Times New Roman" w:hAnsi="Times New Roman"/>
-                <w:b w:val="0"/>
-                <w:sz w:val="22"/>
+            <w:r>
+              <w:rPr>
+                <w:rFonts w:ascii="Times New Roman" w:hAnsi="Times New Roman"/>
               </w:rPr>
               <w:t>24065451263502</w:t>
             </w:r>
@@ -697,7 +649,7 @@
           </w:tcPr>
           <w:p>
             <w:r>
-              <w:t>Sakshi Bhagat (Frontend &amp; UI Developer)</w:t>
+              <w:t>Sakshi Bhagat</w:t>
             </w:r>
           </w:p>
         </w:tc>
@@ -712,12 +664,9 @@
             <w:shd w:val="clear" w:color="auto" w:fill="FFFFFF"/>
           </w:tcPr>
           <w:p>
-            <w:r/>
-            <w:r>
-              <w:rPr>
-                <w:rFonts w:ascii="Times New Roman" w:hAnsi="Times New Roman"/>
-                <w:b w:val="0"/>
-                <w:sz w:val="22"/>
+            <w:r>
+              <w:rPr>
+                <w:rFonts w:ascii="Times New Roman" w:hAnsi="Times New Roman"/>
               </w:rPr>
               <w:t>4056</w:t>
             </w:r>
@@ -729,12 +678,9 @@
             <w:shd w:val="clear" w:color="auto" w:fill="FFFFFF"/>
           </w:tcPr>
           <w:p>
-            <w:r/>
-            <w:r>
-              <w:rPr>
-                <w:rFonts w:ascii="Times New Roman" w:hAnsi="Times New Roman"/>
-                <w:b w:val="0"/>
-                <w:sz w:val="22"/>
+            <w:r>
+              <w:rPr>
+                <w:rFonts w:ascii="Times New Roman" w:hAnsi="Times New Roman"/>
               </w:rPr>
               <w:t>24065451263504</w:t>
             </w:r>
@@ -747,7 +693,7 @@
           </w:tcPr>
           <w:p>
             <w:r>
-              <w:t>Vaishnavi Dhavale (Voice Billing &amp; AI Developer)</w:t>
+              <w:t>Vaishnavi Dhavale</w:t>
             </w:r>
           </w:p>
         </w:tc>
@@ -762,12 +708,9 @@
             <w:shd w:val="clear" w:color="auto" w:fill="F8FAFC"/>
           </w:tcPr>
           <w:p>
-            <w:r/>
-            <w:r>
-              <w:rPr>
-                <w:rFonts w:ascii="Times New Roman" w:hAnsi="Times New Roman"/>
-                <w:b w:val="0"/>
-                <w:sz w:val="22"/>
+            <w:r>
+              <w:rPr>
+                <w:rFonts w:ascii="Times New Roman" w:hAnsi="Times New Roman"/>
               </w:rPr>
               <w:t>4004</w:t>
             </w:r>
@@ -779,12 +722,9 @@
             <w:shd w:val="clear" w:color="auto" w:fill="F8FAFC"/>
           </w:tcPr>
           <w:p>
-            <w:r/>
-            <w:r>
-              <w:rPr>
-                <w:rFonts w:ascii="Times New Roman" w:hAnsi="Times New Roman"/>
-                <w:b w:val="0"/>
-                <w:sz w:val="22"/>
+            <w:r>
+              <w:rPr>
+                <w:rFonts w:ascii="Times New Roman" w:hAnsi="Times New Roman"/>
               </w:rPr>
               <w:t>23065451263005</w:t>
             </w:r>
@@ -797,7 +737,7 @@
           </w:tcPr>
           <w:p>
             <w:r>
-              <w:t>Rushikesh Mulik (Backend &amp; Database Developer)</w:t>
+              <w:t>Rushikesh Mulik</w:t>
             </w:r>
           </w:p>
         </w:tc>
@@ -834,8 +774,22 @@
           <w:p>
             <w:r>
               <w:t>_________________________</w:t>
+            </w:r>
+            <w:r>
               <w:br/>
-              <w:t>Prof. Kaisar Atar Sir</w:t>
+            </w:r>
+            <w:r>
+              <w:rPr>
+                <w:b/>
+                <w:bCs/>
+              </w:rPr>
+              <w:t>Mr. Kaisar Atar</w:t>
+            </w:r>
+            <w:r>
+              <w:rPr>
+                <w:b/>
+                <w:bCs/>
+              </w:rPr>
               <w:br/>
               <w:t>Project Guide</w:t>
             </w:r>
@@ -861,30 +815,25 @@
               <w:spacing w:before="160" w:after="160"/>
               <w:jc w:val="center"/>
             </w:pPr>
-            <w:r>
-              <w:rPr>
-                <w:rFonts w:ascii="Times New Roman" w:hAnsi="Times New Roman"/>
+            <w:r/>
+            <w:r>
+              <w:rPr>
                 <w:b/>
-                <w:color w:val="0F172A"/>
               </w:rPr>
               <w:t>_________________________</w:t>
-            </w:r>
-            <w:r>
-              <w:rPr>
-                <w:rFonts w:ascii="Times New Roman" w:hAnsi="Times New Roman"/>
+              <w:br/>
+            </w:r>
+            <w:r>
+              <w:rPr>
                 <w:b/>
-                <w:color w:val="0F172A"/>
-              </w:rPr>
+              </w:rPr>
+              <w:t>Dr. S. Y. Mulla</w:t>
               <w:br/>
-              <w:t>Mrs. Kadam A.M.</w:t>
-            </w:r>
-            <w:r>
-              <w:rPr>
-                <w:rFonts w:ascii="Times New Roman" w:hAnsi="Times New Roman"/>
+            </w:r>
+            <w:r>
+              <w:rPr>
                 <w:b/>
-                <w:color w:val="0F172A"/>
-              </w:rPr>
-              <w:br/>
+              </w:rPr>
               <w:t>Head of Department</w:t>
             </w:r>
           </w:p>
@@ -982,7 +931,7 @@
         <w:jc w:val="both"/>
       </w:pPr>
       <w:r>
-        <w:t>We, the undersigned students of the Department of Artificial Intelligence &amp; Data Science (AI&amp;DS), Arvind Gavali College of Engineering, Satara, hereby declare that the micro project report entitled “VernaLedger-AI: Next-Gen Vernacular Voice &amp; Multimodal Kirana Suite” submitted by us is our original work conducted under the supervision of Prof. Kaisar Atar Sir.</w:t>
+        <w:t>We, the undersigned students of the Department of Artificial Intelligence &amp; Data Science (AI&amp;DS), Arvind Gavali College of Engineering, Satara, hereby declare that the micro project report entitled “VernaLedger-AI: Next-Gen Vernacular Voice &amp; Multimodal Kirana Suite” submitted by us is our original work conducted under the supervision of Mr. Kaisar Atar.</w:t>
       </w:r>
     </w:p>
     <w:p>
@@ -1142,7 +1091,9 @@
           </w:tcPr>
           <w:p>
             <w:r>
-              <w:t>Sanket Kirdat (Team Leader &amp; AI Developer)</w:t>
+              <w:t>Sanket Kirdat</w:t>
+            </w:r>
+            <w:r>
               <w:br/>
               <w:t>(Roll No: 4060 | PRN: 24065451263508)</w:t>
             </w:r>
@@ -1199,7 +1150,9 @@
           </w:tcPr>
           <w:p>
             <w:r>
-              <w:t>Sakshi Bhagat (Frontend &amp; UI Developer)</w:t>
+              <w:t>Sakshi Bhagat</w:t>
+            </w:r>
+            <w:r>
               <w:br/>
               <w:t>(Roll No: 4054 | PRN: 24065451263502)</w:t>
             </w:r>
@@ -1256,7 +1209,9 @@
           </w:tcPr>
           <w:p>
             <w:r>
-              <w:t>Vaishnavi Dhavale (Voice Billing &amp; AI Developer)</w:t>
+              <w:t>Vaishnavi Dhavale</w:t>
+            </w:r>
+            <w:r>
               <w:br/>
               <w:t>(Roll No: 4056 | PRN: 24065451263504)</w:t>
             </w:r>
@@ -1313,7 +1268,9 @@
           </w:tcPr>
           <w:p>
             <w:r>
-              <w:t>Rushikesh Mulik (Backend &amp; Database Developer)</w:t>
+              <w:t>Rushikesh Mulik</w:t>
+            </w:r>
+            <w:r>
               <w:br/>
               <w:t>(Roll No: 4004 | PRN: 23065451263005)</w:t>
             </w:r>
@@ -1381,7 +1338,7 @@
         <w:jc w:val="both"/>
       </w:pPr>
       <w:r>
-        <w:t>We express our deepest gratitude to our esteemed Project Guide, Prof. Kaisar Atar Sir, whose technical foresight, deep expertise in artificial intelligence systems, and meticulous reviews steered this project through every complex phase of multimodal engineering. His constant motivation inspired us to pursue state-of-the-art accuracy and performance benchmarks.</w:t>
+        <w:t>We express our deepest gratitude to our esteemed Project Guide, Mr. Kaisar Atar, whose technical foresight, deep expertise in artificial intelligence systems, and meticulous reviews steered this project through every complex phase of multimodal engineering. His constant motivation inspired us to pursue state-of-the-art accuracy and performance benchmarks.</w:t>
       </w:r>
     </w:p>
     <w:p>
@@ -1395,7 +1352,7 @@
           <w:color w:val="0F172A"/>
           <w:sz w:val="24"/>
         </w:rPr>
-        <w:t>We extend our sincere thanks to Mrs. Kadam A.M., Head of Department (AI&amp;DS), for providing excellent laboratory facilities, computational resources, and departmental administrative support.</w:t>
+        <w:t>We extend our sincere thanks to Dr. S. Y. Mulla, Head of Department (AI&amp;DS), for providing excellent laboratory facilities, computational resources, and departmental administrative support.</w:t>
       </w:r>
     </w:p>
     <w:p>
@@ -1500,23 +1457,7 @@
           <w:color w:val="0F172A"/>
           <w:sz w:val="24"/>
         </w:rPr>
-        <w:t>Over 13 million micro-merchants and Kirana retail outlets constitute the financial backbone of India's retail economy, yet over 88% remain trapped in error-prone paper registers (Chopdi/Bahi-Khata) due to rigid, English-centric accounting software. Existing commercial mobile applications fail to address three acute operational bottlenecks: deciphering messy handwritten Devanagari bills, capturing hurried vernacular voice billing during rush hours, and recovering uncollected customer credit (</w:t>
-      </w:r>
-      <w:r>
-        <w:rPr>
-          <w:rFonts w:ascii="Times New Roman" w:hAnsi="Times New Roman"/>
-          <w:color w:val="0F172A"/>
-          <w:sz w:val="24"/>
-        </w:rPr>
-        <w:t>उधारी</w:t>
-      </w:r>
-      <w:r>
-        <w:rPr>
-          <w:rFonts w:ascii="Times New Roman" w:hAnsi="Times New Roman"/>
-          <w:color w:val="0F172A"/>
-          <w:sz w:val="24"/>
-        </w:rPr>
-        <w:t>) without awkward manual confrontation.</w:t>
+        <w:t>Over 13 million micro-merchants and Kirana retail outlets constitute the financial backbone of India's retail economy, yet over 88% remain trapped in error-prone paper registers (Chopdi/Bahi-Khata) due to rigid, English-centric accounting software. Existing commercial mobile applications fail to address three acute operational bottlenecks: deciphering messy handwritten Devanagari bills, capturing hurried vernacular voice billing during rush hours, and recovering uncollected customer credit (उधारी) without awkward manual confrontation.</w:t>
       </w:r>
     </w:p>
     <w:p>
@@ -1530,15 +1471,7 @@
           <w:color w:val="0F172A"/>
           <w:sz w:val="24"/>
         </w:rPr>
-        <w:t>This project presents VernaLedger-AI, an enterprise-grade, voice-first, multimodal financial operating suite designed specifically for Indian micro-merchants. The proposed architecture integrates Google Gemini Multimodal Vision AI (gemini-flash-lite-latest) to achieve automated optical character recognition (OCR) on handwritten Devanagari grocery slips, extracting item names, units, rates, and grand totals directly into structured JSON with an observed accuracy of 94.2%. For rapid hands-free billing, a nati</w:t>
-      </w:r>
-      <w:r>
-        <w:rPr>
-          <w:rFonts w:ascii="Times New Roman" w:hAnsi="Times New Roman"/>
-          <w:color w:val="0F172A"/>
-          <w:sz w:val="24"/>
-        </w:rPr>
-        <w:t>ve multimodal voice processing engine combines low-latency WebM/Opus audio streaming with Microsoft Edge-TTS neural speech synthesis (mr-IN-AarohiNeural, rate=+15%), delivering instant Marathi spoken feedback in under 1.16 seconds.</w:t>
+        <w:t>This project presents VernaLedger-AI, an enterprise-grade, voice-first, multimodal financial operating suite designed specifically for Indian micro-merchants. The proposed architecture integrates Google Gemini Multimodal Vision AI (gemini-flash-lite-latest) to achieve automated optical character recognition (OCR) on handwritten Devanagari grocery slips, extracting item names, units, rates, and grand totals directly into structured JSON with an observed accuracy of 94.2%. For rapid hands-free billing, a native multimodal voice processing engine combines low-latency WebM/Opus audio streaming with Microsoft Edge-TTS neural speech synthesis (mr-IN-AarohiNeural, rate=+15%), delivering instant Marathi spoken feedback in under 1.16 seconds.</w:t>
       </w:r>
     </w:p>
     <w:p>
@@ -1552,15 +1485,7 @@
           <w:color w:val="0F172A"/>
           <w:sz w:val="24"/>
         </w:rPr>
-        <w:t xml:space="preserve">The system enforces strict ACID compliance via an embedded SQLite ledger, eliminating manual data entry while automating digital customer accounts (Khata). Integrated WhatsApp deep-linking generates 1-click dynamic UPI payment links, accelerating debt recovery cycles threefold. A responsive Cyberpunk Glassmorphic user interface features an Eye-Comfort Kirana Mode (Light Theme) with soft warm slate tones and high-contrast pastel KPI cards, engineered for glare-free outdoor shop counter readability. Deployed </w:t>
-      </w:r>
-      <w:r>
-        <w:rPr>
-          <w:rFonts w:ascii="Times New Roman" w:hAnsi="Times New Roman"/>
-          <w:color w:val="0F172A"/>
-          <w:sz w:val="24"/>
-        </w:rPr>
-        <w:t>on a serverless Vercel cloud runtime with zero-cache HTTP middlewares, VernaLedger-AI demonstrates that modern generative AI can eliminate digital literacy barriers and empower grassroots Indian commerce.</w:t>
+        <w:t>The system enforces strict ACID compliance via an embedded SQLite ledger, eliminating manual data entry while automating digital customer accounts (Khata). Integrated WhatsApp deep-linking generates 1-click dynamic UPI payment links, accelerating debt recovery cycles threefold. A responsive Cyberpunk Glassmorphic user interface features an Eye-Comfort Kirana Mode (Light Theme) with soft warm slate tones and high-contrast pastel KPI cards, engineered for glare-free outdoor shop counter readability. Deployed on a serverless Vercel cloud runtime with zero-cache HTTP middlewares, VernaLedger-AI demonstrates that modern generative AI can eliminate digital literacy barriers and empower grassroots Indian commerce.</w:t>
       </w:r>
     </w:p>
     <w:p>
@@ -4232,15 +4157,7 @@
           <w:color w:val="0F172A"/>
           <w:sz w:val="24"/>
         </w:rPr>
-        <w:t>The retail landscape of India is distinctively characterized by an omnipresent network of localized micro-enterprises colloquially known as 'Kirana stores'. Across urban mohallas, rural hamlets, and semi-urban tier-2 and tier-3 towns, an estimated 13 to 15 million neighborhood mom-and-pop grocery outlets manage the daily essential supply chains of 1.4 billion citizens. These micro-merchants generate over $600 billion in annual retail turnover, accounting for more than 85% of India's total food and grocery r</w:t>
-      </w:r>
-      <w:r>
-        <w:rPr>
-          <w:rFonts w:ascii="Times New Roman" w:hAnsi="Times New Roman"/>
-          <w:color w:val="0F172A"/>
-          <w:sz w:val="24"/>
-        </w:rPr>
-        <w:t>etail. Despite their pivotal role as economic lifelines, these micro-enterprises operate under intense operational constraints, characterized by manual paper bookkeeping, physical fatigue, linguistic barriers, and severe credit lockups.</w:t>
+        <w:t>The retail landscape of India is distinctively characterized by an omnipresent network of localized micro-enterprises colloquially known as 'Kirana stores'. Across urban mohallas, rural hamlets, and semi-urban tier-2 and tier-3 towns, an estimated 13 to 15 million neighborhood mom-and-pop grocery outlets manage the daily essential supply chains of 1.4 billion citizens. These micro-merchants generate over $600 billion in annual retail turnover, accounting for more than 85% of India's total food and grocery retail. Despite their pivotal role as economic lifelines, these micro-enterprises operate under intense operational constraints, characterized by manual paper bookkeeping, physical fatigue, linguistic barriers, and severe credit lockups.</w:t>
       </w:r>
     </w:p>
     <w:p>
@@ -4269,15 +4186,7 @@
           <w:color w:val="0F172A"/>
           <w:sz w:val="24"/>
         </w:rPr>
-        <w:t xml:space="preserve">Modern technological interventions in retail accounting, Enterprise Resource Planning (ERP), and point-of-sale (POS) systems have predominantly catered to organized, English-proficient retail chains. Established legacy accounting software suites such as TallyPrime, Marg ERP, and SAP Business One demand desktop computers, dedicated barcode scanners, English QWERTY keyboard proficiency, and rigorous accounting training. For an Indian Kirana proprietor running a solo store for 14 hours a day amidst continuous </w:t>
-      </w:r>
-      <w:r>
-        <w:rPr>
-          <w:rFonts w:ascii="Times New Roman" w:hAnsi="Times New Roman"/>
-          <w:color w:val="0F172A"/>
-          <w:sz w:val="24"/>
-        </w:rPr>
-        <w:t>customer footfall, these legacy software platforms introduce friction rather than convenience. The cognitive overhead of navigating multi-tiered English menus, searching Latin alphabet SKU names, and manually balancing debit-credit journal vouchers makes digital adoption practically unfeasible.</w:t>
+        <w:t>Modern technological interventions in retail accounting, Enterprise Resource Planning (ERP), and point-of-sale (POS) systems have predominantly catered to organized, English-proficient retail chains. Established legacy accounting software suites such as TallyPrime, Marg ERP, and SAP Business One demand desktop computers, dedicated barcode scanners, English QWERTY keyboard proficiency, and rigorous accounting training. For an Indian Kirana proprietor running a solo store for 14 hours a day amidst continuous customer footfall, these legacy software platforms introduce friction rather than convenience. The cognitive overhead of navigating multi-tiered English menus, searching Latin alphabet SKU names, and manually balancing debit-credit journal vouchers makes digital adoption practically unfeasible.</w:t>
       </w:r>
     </w:p>
     <w:p>
@@ -4291,15 +4200,7 @@
           <w:color w:val="0F172A"/>
           <w:sz w:val="24"/>
         </w:rPr>
-        <w:t>In response to this technological divide, modern fintech startups introduced mobile ledger applications such as Khatabook, OkCredit, and Vyapar. While these mobile solutions succeeded in demonstrating that shopkeepers would adopt smartphones for bookkeeping, they continue to rely on traditional mobile UI paradigms—namely, manual touchscreen typing, on-screen keyboard text entry, and English-first navigation. During morning and evening peak trading rush hours, a grocer cannot stop attending to five waiting c</w:t>
-      </w:r>
-      <w:r>
-        <w:rPr>
-          <w:rFonts w:ascii="Times New Roman" w:hAnsi="Times New Roman"/>
-          <w:color w:val="0F172A"/>
-          <w:sz w:val="24"/>
-        </w:rPr>
-        <w:t>ustomers to type out customer names, item descriptions, quantities, and numeric monetary values on a 6-inch glass screen. Consequently, shopkeepers revert to scribbling quick notes on discarded scraps of paper, torn cardboard boxes, or traditional paper ledger books known as 'Bahi-Khata' or 'Chopdi'.</w:t>
+        <w:t>In response to this technological divide, modern fintech startups introduced mobile ledger applications such as Khatabook, OkCredit, and Vyapar. While these mobile solutions succeeded in demonstrating that shopkeepers would adopt smartphones for bookkeeping, they continue to rely on traditional mobile UI paradigms—namely, manual touchscreen typing, on-screen keyboard text entry, and English-first navigation. During morning and evening peak trading rush hours, a grocer cannot stop attending to five waiting customers to type out customer names, item descriptions, quantities, and numeric monetary values on a 6-inch glass screen. Consequently, shopkeepers revert to scribbling quick notes on discarded scraps of paper, torn cardboard boxes, or traditional paper ledger books known as 'Bahi-Khata' or 'Chopdi'.</w:t>
       </w:r>
     </w:p>
     <w:p>
@@ -4328,15 +4229,7 @@
           <w:color w:val="0F172A"/>
           <w:sz w:val="24"/>
         </w:rPr>
-        <w:t>Field observations across retail markets reveal that an average Kirana merchant handles between 200 and 450 customer interactions daily. Individual transaction basket sizes range from small convenience purchases of ₹15 to ₹80, up to weekly grocery baskets of ₹800 to ₹3,500. During the morning peak (8:00 AM to 11:00 AM) and evening rush (6:00 PM to 9:30 PM), transaction arrival rates surge to one customer every 45 to 60 seconds. Under this intense transaction density, any interface demanding more than 5 to 1</w:t>
-      </w:r>
-      <w:r>
-        <w:rPr>
-          <w:rFonts w:ascii="Times New Roman" w:hAnsi="Times New Roman"/>
-          <w:color w:val="0F172A"/>
-          <w:sz w:val="24"/>
-        </w:rPr>
-        <w:t>0 seconds of user interaction creates immediate queue blockages. A merchant forced to manually type entries loses an estimated 90 to 120 minutes of productive customer service time every day.</w:t>
+        <w:t>Field observations across retail markets reveal that an average Kirana merchant handles between 200 and 450 customer interactions daily. Individual transaction basket sizes range from small convenience purchases of ₹15 to ₹80, up to weekly grocery baskets of ₹800 to ₹3,500. During the morning peak (8:00 AM to 11:00 AM) and evening rush (6:00 PM to 9:30 PM), transaction arrival rates surge to one customer every 45 to 60 seconds. Under this intense transaction density, any interface demanding more than 5 to 10 seconds of user interaction creates immediate queue blockages. A merchant forced to manually type entries loses an estimated 90 to 120 minutes of productive customer service time every day.</w:t>
       </w:r>
     </w:p>
     <w:p>
@@ -4395,15 +4288,7 @@
           <w:color w:val="0F172A"/>
           <w:sz w:val="24"/>
         </w:rPr>
-        <w:t>Unlike corporate retail environments with air-conditioned billing cubicles, Kirana stores operate in open-air storefronts exposed to dust, ambient heat, fluctuating electrical grids, and direct sunlight. Shopkeepers frequently handle items coated in flour dust, cooking oil, or vegetable moisture. Operating a capacitive smartphone touchscreen with wet or dusty hands leads to high error rates and repeated phantom taps. Furthermore, shopkeepers frequently suffer from eye strain when trying to view low-contrast</w:t>
-      </w:r>
-      <w:r>
-        <w:rPr>
-          <w:rFonts w:ascii="Times New Roman" w:hAnsi="Times New Roman"/>
-          <w:color w:val="0F172A"/>
-          <w:sz w:val="24"/>
-        </w:rPr>
-        <w:t xml:space="preserve"> mobile screens under bright outdoor midday sunlight. These environmental realities necessitate an interface that supports hands-free audio and high-contrast, glare-resistant visual themes.</w:t>
+        <w:t>Unlike corporate retail environments with air-conditioned billing cubicles, Kirana stores operate in open-air storefronts exposed to dust, ambient heat, fluctuating electrical grids, and direct sunlight. Shopkeepers frequently handle items coated in flour dust, cooking oil, or vegetable moisture. Operating a capacitive smartphone touchscreen with wet or dusty hands leads to high error rates and repeated phantom taps. Furthermore, shopkeepers frequently suffer from eye strain when trying to view low-contrast mobile screens under bright outdoor midday sunlight. These environmental realities necessitate an interface that supports hands-free audio and high-contrast, glare-resistant visual themes.</w:t>
       </w:r>
     </w:p>
     <w:p>
@@ -4489,23 +4374,7 @@
           <w:color w:val="0F172A"/>
           <w:sz w:val="24"/>
         </w:rPr>
-        <w:t>Demanding overdue credit (</w:t>
-      </w:r>
-      <w:r>
-        <w:rPr>
-          <w:rFonts w:ascii="Times New Roman" w:hAnsi="Times New Roman"/>
-          <w:color w:val="0F172A"/>
-          <w:sz w:val="24"/>
-        </w:rPr>
-        <w:t>उधारी</w:t>
-      </w:r>
-      <w:r>
-        <w:rPr>
-          <w:rFonts w:ascii="Times New Roman" w:hAnsi="Times New Roman"/>
-          <w:color w:val="0F172A"/>
-          <w:sz w:val="24"/>
-        </w:rPr>
-        <w:t>) face-to-face creates social friction, leading shopkeepers to hesitate until debts become irrecoverable.</w:t>
+        <w:t>Demanding overdue credit (उधारी) face-to-face creates social friction, leading shopkeepers to hesitate until debts become irrecoverable.</w:t>
       </w:r>
     </w:p>
     <w:p>
@@ -4519,15 +4388,7 @@
           <w:color w:val="0F172A"/>
           <w:sz w:val="24"/>
         </w:rPr>
-        <w:t>To fundamentally resolve these structural bottlenecks, this project introduces VernaLedger-AI—a Voice-First, Multimodal Artificial Intelligence Retail Operating Suite engineered specifically for vernacular Indian micro-merchants. Unlike existing applications that merely digitize paper forms onto mobile screens, VernaLedger-AI eliminates typing entirely through two foundational multimodal AI paradigms: Optical Character Recognition powered by Generative Vision Large Language Models, and Low-Latency Retrieval</w:t>
-      </w:r>
-      <w:r>
-        <w:rPr>
-          <w:rFonts w:ascii="Times New Roman" w:hAnsi="Times New Roman"/>
-          <w:color w:val="0F172A"/>
-          <w:sz w:val="24"/>
-        </w:rPr>
-        <w:t>-Augmented Generation (RAG) Vernacular Spoken Voice Processing.</w:t>
+        <w:t>To fundamentally resolve these structural bottlenecks, this project introduces VernaLedger-AI—a Voice-First, Multimodal Artificial Intelligence Retail Operating Suite engineered specifically for vernacular Indian micro-merchants. Unlike existing applications that merely digitize paper forms onto mobile screens, VernaLedger-AI eliminates typing entirely through two foundational multimodal AI paradigms: Optical Character Recognition powered by Generative Vision Large Language Models, and Low-Latency Retrieval-Augmented Generation (RAG) Vernacular Spoken Voice Processing.</w:t>
       </w:r>
     </w:p>
     <w:p>
@@ -4541,119 +4402,7 @@
           <w:color w:val="0F172A"/>
           <w:sz w:val="24"/>
         </w:rPr>
-        <w:t>VernaLedger-AI allows a shopkeeper to photograph any handwritten Devanagari receipt, rough chit, or supplier invoice using their existing smartphone camera. The system's multimodal vision engine, powered by Google Gemini Vision (gemini-flash-lite-latest), instantly transcribes the unstructured regional handwriting, extracts individual line items, parses units of measurement (</w:t>
-      </w:r>
-      <w:r>
-        <w:rPr>
-          <w:rFonts w:ascii="Times New Roman" w:hAnsi="Times New Roman"/>
-          <w:color w:val="0F172A"/>
-          <w:sz w:val="24"/>
-        </w:rPr>
-        <w:t>उदा</w:t>
-      </w:r>
-      <w:r>
-        <w:rPr>
-          <w:rFonts w:ascii="Times New Roman" w:hAnsi="Times New Roman"/>
-          <w:color w:val="0F172A"/>
-          <w:sz w:val="24"/>
-        </w:rPr>
-        <w:t xml:space="preserve">. </w:t>
-      </w:r>
-      <w:r>
-        <w:rPr>
-          <w:rFonts w:ascii="Times New Roman" w:hAnsi="Times New Roman"/>
-          <w:color w:val="0F172A"/>
-          <w:sz w:val="24"/>
-        </w:rPr>
-        <w:t>किलो</w:t>
-      </w:r>
-      <w:r>
-        <w:rPr>
-          <w:rFonts w:ascii="Times New Roman" w:hAnsi="Times New Roman"/>
-          <w:color w:val="0F172A"/>
-          <w:sz w:val="24"/>
-        </w:rPr>
-        <w:t xml:space="preserve">, </w:t>
-      </w:r>
-      <w:r>
-        <w:rPr>
-          <w:rFonts w:ascii="Times New Roman" w:hAnsi="Times New Roman"/>
-          <w:color w:val="0F172A"/>
-          <w:sz w:val="24"/>
-        </w:rPr>
-        <w:t>लिटर</w:t>
-      </w:r>
-      <w:r>
-        <w:rPr>
-          <w:rFonts w:ascii="Times New Roman" w:hAnsi="Times New Roman"/>
-          <w:color w:val="0F172A"/>
-          <w:sz w:val="24"/>
-        </w:rPr>
-        <w:t xml:space="preserve">, </w:t>
-      </w:r>
-      <w:r>
-        <w:rPr>
-          <w:rFonts w:ascii="Times New Roman" w:hAnsi="Times New Roman"/>
-          <w:color w:val="0F172A"/>
-          <w:sz w:val="24"/>
-        </w:rPr>
-        <w:t>नग</w:t>
-      </w:r>
-      <w:r>
-        <w:rPr>
-          <w:rFonts w:ascii="Times New Roman" w:hAnsi="Times New Roman"/>
-          <w:color w:val="0F172A"/>
-          <w:sz w:val="24"/>
-        </w:rPr>
-        <w:t xml:space="preserve">, </w:t>
-      </w:r>
-      <w:r>
-        <w:rPr>
-          <w:rFonts w:ascii="Times New Roman" w:hAnsi="Times New Roman"/>
-          <w:color w:val="0F172A"/>
-          <w:sz w:val="24"/>
-        </w:rPr>
-        <w:t>ग्रॅम</w:t>
-      </w:r>
-      <w:r>
-        <w:rPr>
-          <w:rFonts w:ascii="Times New Roman" w:hAnsi="Times New Roman"/>
-          <w:color w:val="0F172A"/>
-          <w:sz w:val="24"/>
-        </w:rPr>
-        <w:t xml:space="preserve">, </w:t>
-      </w:r>
-      <w:r>
-        <w:rPr>
-          <w:rFonts w:ascii="Times New Roman" w:hAnsi="Times New Roman"/>
-          <w:color w:val="0F172A"/>
-          <w:sz w:val="24"/>
-        </w:rPr>
-        <w:t>डझन</w:t>
-      </w:r>
-      <w:r>
-        <w:rPr>
-          <w:rFonts w:ascii="Times New Roman" w:hAnsi="Times New Roman"/>
-          <w:color w:val="0F172A"/>
-          <w:sz w:val="24"/>
-        </w:rPr>
-        <w:t xml:space="preserve">, </w:t>
-      </w:r>
-      <w:r>
-        <w:rPr>
-          <w:rFonts w:ascii="Times New Roman" w:hAnsi="Times New Roman"/>
-          <w:color w:val="0F172A"/>
-          <w:sz w:val="24"/>
-        </w:rPr>
-        <w:t>पाकीट</w:t>
-      </w:r>
-      <w:r>
-        <w:rPr>
-          <w:rFonts w:ascii="Times New Roman" w:hAnsi="Times New Roman"/>
-          <w:color w:val="0F172A"/>
-          <w:sz w:val="24"/>
-        </w:rPr>
-        <w:t>), maps item rates, calculates the mathematical grand total, and automatically posts debit/credit transactions to the customer's digital ledger in under 1.8 seconds with over 94% accuracy.</w:t>
+        <w:t>VernaLedger-AI allows a shopkeeper to photograph any handwritten Devanagari receipt, rough chit, or supplier invoice using their existing smartphone camera. The system's multimodal vision engine, powered by Google Gemini Vision (gemini-flash-lite-latest), instantly transcribes the unstructured regional handwriting, extracts individual line items, parses units of measurement (उदा. किलो, लिटर, नग, ग्रॅम, डझन, पाकीट), maps item rates, calculates the mathematical grand total, and automatically posts debit/credit transactions to the customer's digital ledger in under 1.8 seconds with over 94% accuracy.</w:t>
       </w:r>
     </w:p>
     <w:p>
@@ -4667,311 +4416,7 @@
           <w:color w:val="0F172A"/>
           <w:sz w:val="24"/>
         </w:rPr>
-        <w:t>Simultaneously, VernaLedger-AI provides a natural, conversational Marathi Spoken Voice Assistant. Utilizing Microsoft Edge-TTS neural speech synthesis (voice model: mr-IN-AarohiNeural at +15% playback rate) coupled with an in-memory transactional RAG pipeline, the merchant can speak naturally in colloquial Marathi (</w:t>
-      </w:r>
-      <w:r>
-        <w:rPr>
-          <w:rFonts w:ascii="Times New Roman" w:hAnsi="Times New Roman"/>
-          <w:color w:val="0F172A"/>
-          <w:sz w:val="24"/>
-        </w:rPr>
-        <w:t>उदा</w:t>
-      </w:r>
-      <w:r>
-        <w:rPr>
-          <w:rFonts w:ascii="Times New Roman" w:hAnsi="Times New Roman"/>
-          <w:color w:val="0F172A"/>
-          <w:sz w:val="24"/>
-        </w:rPr>
-        <w:t>. '</w:t>
-      </w:r>
-      <w:r>
-        <w:rPr>
-          <w:rFonts w:ascii="Times New Roman" w:hAnsi="Times New Roman"/>
-          <w:color w:val="0F172A"/>
-          <w:sz w:val="24"/>
-        </w:rPr>
-        <w:t>रमेशची</w:t>
-      </w:r>
-      <w:r>
-        <w:rPr>
-          <w:rFonts w:ascii="Times New Roman" w:hAnsi="Times New Roman"/>
-          <w:color w:val="0F172A"/>
-          <w:sz w:val="24"/>
-        </w:rPr>
-        <w:t xml:space="preserve"> </w:t>
-      </w:r>
-      <w:r>
-        <w:rPr>
-          <w:rFonts w:ascii="Times New Roman" w:hAnsi="Times New Roman"/>
-          <w:color w:val="0F172A"/>
-          <w:sz w:val="24"/>
-        </w:rPr>
-        <w:t>किती</w:t>
-      </w:r>
-      <w:r>
-        <w:rPr>
-          <w:rFonts w:ascii="Times New Roman" w:hAnsi="Times New Roman"/>
-          <w:color w:val="0F172A"/>
-          <w:sz w:val="24"/>
-        </w:rPr>
-        <w:t xml:space="preserve"> </w:t>
-      </w:r>
-      <w:r>
-        <w:rPr>
-          <w:rFonts w:ascii="Times New Roman" w:hAnsi="Times New Roman"/>
-          <w:color w:val="0F172A"/>
-          <w:sz w:val="24"/>
-        </w:rPr>
-        <w:t>उधारी</w:t>
-      </w:r>
-      <w:r>
-        <w:rPr>
-          <w:rFonts w:ascii="Times New Roman" w:hAnsi="Times New Roman"/>
-          <w:color w:val="0F172A"/>
-          <w:sz w:val="24"/>
-        </w:rPr>
-        <w:t xml:space="preserve"> </w:t>
-      </w:r>
-      <w:r>
-        <w:rPr>
-          <w:rFonts w:ascii="Times New Roman" w:hAnsi="Times New Roman"/>
-          <w:color w:val="0F172A"/>
-          <w:sz w:val="24"/>
-        </w:rPr>
-        <w:t>बाकी</w:t>
-      </w:r>
-      <w:r>
-        <w:rPr>
-          <w:rFonts w:ascii="Times New Roman" w:hAnsi="Times New Roman"/>
-          <w:color w:val="0F172A"/>
-          <w:sz w:val="24"/>
-        </w:rPr>
-        <w:t xml:space="preserve"> </w:t>
-      </w:r>
-      <w:r>
-        <w:rPr>
-          <w:rFonts w:ascii="Times New Roman" w:hAnsi="Times New Roman"/>
-          <w:color w:val="0F172A"/>
-          <w:sz w:val="24"/>
-        </w:rPr>
-        <w:t>आहे</w:t>
-      </w:r>
-      <w:r>
-        <w:rPr>
-          <w:rFonts w:ascii="Times New Roman" w:hAnsi="Times New Roman"/>
-          <w:color w:val="0F172A"/>
-          <w:sz w:val="24"/>
-        </w:rPr>
-        <w:t>?', '</w:t>
-      </w:r>
-      <w:r>
-        <w:rPr>
-          <w:rFonts w:ascii="Times New Roman" w:hAnsi="Times New Roman"/>
-          <w:color w:val="0F172A"/>
-          <w:sz w:val="24"/>
-        </w:rPr>
-        <w:t>आजचा</w:t>
-      </w:r>
-      <w:r>
-        <w:rPr>
-          <w:rFonts w:ascii="Times New Roman" w:hAnsi="Times New Roman"/>
-          <w:color w:val="0F172A"/>
-          <w:sz w:val="24"/>
-        </w:rPr>
-        <w:t xml:space="preserve"> </w:t>
-      </w:r>
-      <w:r>
-        <w:rPr>
-          <w:rFonts w:ascii="Times New Roman" w:hAnsi="Times New Roman"/>
-          <w:color w:val="0F172A"/>
-          <w:sz w:val="24"/>
-        </w:rPr>
-        <w:t>एकूण</w:t>
-      </w:r>
-      <w:r>
-        <w:rPr>
-          <w:rFonts w:ascii="Times New Roman" w:hAnsi="Times New Roman"/>
-          <w:color w:val="0F172A"/>
-          <w:sz w:val="24"/>
-        </w:rPr>
-        <w:t xml:space="preserve"> </w:t>
-      </w:r>
-      <w:r>
-        <w:rPr>
-          <w:rFonts w:ascii="Times New Roman" w:hAnsi="Times New Roman"/>
-          <w:color w:val="0F172A"/>
-          <w:sz w:val="24"/>
-        </w:rPr>
-        <w:t>गल्ला</w:t>
-      </w:r>
-      <w:r>
-        <w:rPr>
-          <w:rFonts w:ascii="Times New Roman" w:hAnsi="Times New Roman"/>
-          <w:color w:val="0F172A"/>
-          <w:sz w:val="24"/>
-        </w:rPr>
-        <w:t xml:space="preserve"> </w:t>
-      </w:r>
-      <w:r>
-        <w:rPr>
-          <w:rFonts w:ascii="Times New Roman" w:hAnsi="Times New Roman"/>
-          <w:color w:val="0F172A"/>
-          <w:sz w:val="24"/>
-        </w:rPr>
-        <w:t>किती</w:t>
-      </w:r>
-      <w:r>
-        <w:rPr>
-          <w:rFonts w:ascii="Times New Roman" w:hAnsi="Times New Roman"/>
-          <w:color w:val="0F172A"/>
-          <w:sz w:val="24"/>
-        </w:rPr>
-        <w:t xml:space="preserve"> </w:t>
-      </w:r>
-      <w:r>
-        <w:rPr>
-          <w:rFonts w:ascii="Times New Roman" w:hAnsi="Times New Roman"/>
-          <w:color w:val="0F172A"/>
-          <w:sz w:val="24"/>
-        </w:rPr>
-        <w:t>झाला</w:t>
-      </w:r>
-      <w:r>
-        <w:rPr>
-          <w:rFonts w:ascii="Times New Roman" w:hAnsi="Times New Roman"/>
-          <w:color w:val="0F172A"/>
-          <w:sz w:val="24"/>
-        </w:rPr>
-        <w:t>?', '</w:t>
-      </w:r>
-      <w:r>
-        <w:rPr>
-          <w:rFonts w:ascii="Times New Roman" w:hAnsi="Times New Roman"/>
-          <w:color w:val="0F172A"/>
-          <w:sz w:val="24"/>
-        </w:rPr>
-        <w:t>साखर</w:t>
-      </w:r>
-      <w:r>
-        <w:rPr>
-          <w:rFonts w:ascii="Times New Roman" w:hAnsi="Times New Roman"/>
-          <w:color w:val="0F172A"/>
-          <w:sz w:val="24"/>
-        </w:rPr>
-        <w:t xml:space="preserve"> </w:t>
-      </w:r>
-      <w:r>
-        <w:rPr>
-          <w:rFonts w:ascii="Times New Roman" w:hAnsi="Times New Roman"/>
-          <w:color w:val="0F172A"/>
-          <w:sz w:val="24"/>
-        </w:rPr>
-        <w:t>किती</w:t>
-      </w:r>
-      <w:r>
-        <w:rPr>
-          <w:rFonts w:ascii="Times New Roman" w:hAnsi="Times New Roman"/>
-          <w:color w:val="0F172A"/>
-          <w:sz w:val="24"/>
-        </w:rPr>
-        <w:t xml:space="preserve"> </w:t>
-      </w:r>
-      <w:r>
-        <w:rPr>
-          <w:rFonts w:ascii="Times New Roman" w:hAnsi="Times New Roman"/>
-          <w:color w:val="0F172A"/>
-          <w:sz w:val="24"/>
-        </w:rPr>
-        <w:t>शिल्लक</w:t>
-      </w:r>
-      <w:r>
-        <w:rPr>
-          <w:rFonts w:ascii="Times New Roman" w:hAnsi="Times New Roman"/>
-          <w:color w:val="0F172A"/>
-          <w:sz w:val="24"/>
-        </w:rPr>
-        <w:t xml:space="preserve"> </w:t>
-      </w:r>
-      <w:r>
-        <w:rPr>
-          <w:rFonts w:ascii="Times New Roman" w:hAnsi="Times New Roman"/>
-          <w:color w:val="0F172A"/>
-          <w:sz w:val="24"/>
-        </w:rPr>
-        <w:t>आहे</w:t>
-      </w:r>
-      <w:r>
-        <w:rPr>
-          <w:rFonts w:ascii="Times New Roman" w:hAnsi="Times New Roman"/>
-          <w:color w:val="0F172A"/>
-          <w:sz w:val="24"/>
-        </w:rPr>
-        <w:t>?', '</w:t>
-      </w:r>
-      <w:r>
-        <w:rPr>
-          <w:rFonts w:ascii="Times New Roman" w:hAnsi="Times New Roman"/>
-          <w:color w:val="0F172A"/>
-          <w:sz w:val="24"/>
-        </w:rPr>
-        <w:t>महिन्याचे</w:t>
-      </w:r>
-      <w:r>
-        <w:rPr>
-          <w:rFonts w:ascii="Times New Roman" w:hAnsi="Times New Roman"/>
-          <w:color w:val="0F172A"/>
-          <w:sz w:val="24"/>
-        </w:rPr>
-        <w:t xml:space="preserve"> </w:t>
-      </w:r>
-      <w:r>
-        <w:rPr>
-          <w:rFonts w:ascii="Times New Roman" w:hAnsi="Times New Roman"/>
-          <w:color w:val="0F172A"/>
-          <w:sz w:val="24"/>
-        </w:rPr>
-        <w:t>एकूण</w:t>
-      </w:r>
-      <w:r>
-        <w:rPr>
-          <w:rFonts w:ascii="Times New Roman" w:hAnsi="Times New Roman"/>
-          <w:color w:val="0F172A"/>
-          <w:sz w:val="24"/>
-        </w:rPr>
-        <w:t xml:space="preserve"> </w:t>
-      </w:r>
-      <w:r>
-        <w:rPr>
-          <w:rFonts w:ascii="Times New Roman" w:hAnsi="Times New Roman"/>
-          <w:color w:val="0F172A"/>
-          <w:sz w:val="24"/>
-        </w:rPr>
-        <w:t>क्रेडिट</w:t>
-      </w:r>
-      <w:r>
-        <w:rPr>
-          <w:rFonts w:ascii="Times New Roman" w:hAnsi="Times New Roman"/>
-          <w:color w:val="0F172A"/>
-          <w:sz w:val="24"/>
-        </w:rPr>
-        <w:t xml:space="preserve"> </w:t>
-      </w:r>
-      <w:r>
-        <w:rPr>
-          <w:rFonts w:ascii="Times New Roman" w:hAnsi="Times New Roman"/>
-          <w:color w:val="0F172A"/>
-          <w:sz w:val="24"/>
-        </w:rPr>
-        <w:t>किती</w:t>
-      </w:r>
-      <w:r>
-        <w:rPr>
-          <w:rFonts w:ascii="Times New Roman" w:hAnsi="Times New Roman"/>
-          <w:color w:val="0F172A"/>
-          <w:sz w:val="24"/>
-        </w:rPr>
-        <w:t>?'). The system computes answers from the live ACID-compliant SQLite ledger and speaks back the precise financial status in natural Marathi voice in under 1.16 seconds, accompanied by a dedicated 1-button audio controller on mobile screens.</w:t>
+        <w:t>Simultaneously, VernaLedger-AI provides a natural, conversational Marathi Spoken Voice Assistant. Utilizing Microsoft Edge-TTS neural speech synthesis (voice model: mr-IN-AarohiNeural at +15% playback rate) coupled with an in-memory transactional RAG pipeline, the merchant can speak naturally in colloquial Marathi (उदा. 'रमेशची किती उधारी बाकी आहे?', 'आजचा एकूण गल्ला किती झाला?', 'साखर किती शिल्लक आहे?', 'महिन्याचे एकूण क्रेडिट किती?'). The system computes answers from the live ACID-compliant SQLite ledger and speaks back the precise financial status in natural Marathi voice in under 1.16 seconds, accompanied by a dedicated 1-button audio controller on mobile screens.</w:t>
       </w:r>
     </w:p>
     <w:p>
@@ -5008,15 +4453,7 @@
           <w:color w:val="0F172A"/>
           <w:sz w:val="24"/>
         </w:rPr>
-        <w:t>Furthermore, VernaLedger-AI addresses the acute environmental constraints of outdoor Indian retail counters. Shopkeepers frequently operate in direct outdoor sunlight, causing severe screen glare that makes dark-mode interfaces completely unreadable. To solve this, the application features an engineered Eye-Comfort Kirana Mode (Light Theme) utilizing warm slate backgrounds, high-contrast typography, anti-glare card borders, and prominent pastel KPI metrics, alongside an immersive Cyberpunk Dark Mode for eve</w:t>
-      </w:r>
-      <w:r>
-        <w:rPr>
-          <w:rFonts w:ascii="Times New Roman" w:hAnsi="Times New Roman"/>
-          <w:color w:val="0F172A"/>
-          <w:sz w:val="24"/>
-        </w:rPr>
-        <w:t>ning operation.</w:t>
+        <w:t>Furthermore, VernaLedger-AI addresses the acute environmental constraints of outdoor Indian retail counters. Shopkeepers frequently operate in direct outdoor sunlight, causing severe screen glare that makes dark-mode interfaces completely unreadable. To solve this, the application features an engineered Eye-Comfort Kirana Mode (Light Theme) utilizing warm slate backgrounds, high-contrast typography, anti-glare card borders, and prominent pastel KPI metrics, alongside an immersive Cyberpunk Dark Mode for evening operation.</w:t>
       </w:r>
     </w:p>
     <w:p>
@@ -5045,31 +4482,7 @@
           <w:color w:val="0F172A"/>
           <w:sz w:val="24"/>
         </w:rPr>
-        <w:t xml:space="preserve">The motivation behind VernaLedger-AI stems from direct grassroots field observations conducted across retail markets in Satara, Maharashtra. In semi-urban and rural Indian commerce, retail transactions are deeply rooted in interpersonal trust and informal unsecured short-term credit. Kirana store owners act not merely as commodity distributors, but as informal community micro-financiers. Customers routinely purchase groceries on credit throughout the month and settle their dues upon receiving their monthly </w:t>
-      </w:r>
-      <w:r>
-        <w:rPr>
-          <w:rFonts w:ascii="Times New Roman" w:hAnsi="Times New Roman"/>
-          <w:color w:val="0F172A"/>
-          <w:sz w:val="24"/>
-        </w:rPr>
-        <w:t>salary or agricultural harvest income. This informal credit mechanism, known locally as '</w:t>
-      </w:r>
-      <w:r>
-        <w:rPr>
-          <w:rFonts w:ascii="Times New Roman" w:hAnsi="Times New Roman"/>
-          <w:color w:val="0F172A"/>
-          <w:sz w:val="24"/>
-        </w:rPr>
-        <w:t>उधारी</w:t>
-      </w:r>
-      <w:r>
-        <w:rPr>
-          <w:rFonts w:ascii="Times New Roman" w:hAnsi="Times New Roman"/>
-          <w:color w:val="0F172A"/>
-          <w:sz w:val="24"/>
-        </w:rPr>
-        <w:t>' (Udhaari), accounts for 50% to 75% of total sales volume in neighborhood stores.</w:t>
+        <w:t>The motivation behind VernaLedger-AI stems from direct grassroots field observations conducted across retail markets in Satara, Maharashtra. In semi-urban and rural Indian commerce, retail transactions are deeply rooted in interpersonal trust and informal unsecured short-term credit. Kirana store owners act not merely as commodity distributors, but as informal community micro-financiers. Customers routinely purchase groceries on credit throughout the month and settle their dues upon receiving their monthly salary or agricultural harvest income. This informal credit mechanism, known locally as 'उधारी' (Udhaari), accounts for 50% to 75% of total sales volume in neighborhood stores.</w:t>
       </w:r>
     </w:p>
     <w:p>
@@ -5270,55 +4683,7 @@
           <w:color w:val="0F172A"/>
           <w:sz w:val="24"/>
         </w:rPr>
-        <w:t>In traditional Kirana commerce, when a customer purchases ₹450 worth of pulses and cooking oil on credit, the shopkeeper writes '</w:t>
-      </w:r>
-      <w:r>
-        <w:rPr>
-          <w:rFonts w:ascii="Times New Roman" w:hAnsi="Times New Roman"/>
-          <w:color w:val="0F172A"/>
-          <w:sz w:val="24"/>
-        </w:rPr>
-        <w:t>४५०</w:t>
-      </w:r>
-      <w:r>
-        <w:rPr>
-          <w:rFonts w:ascii="Times New Roman" w:hAnsi="Times New Roman"/>
-          <w:color w:val="0F172A"/>
-          <w:sz w:val="24"/>
-        </w:rPr>
-        <w:t xml:space="preserve"> </w:t>
-      </w:r>
-      <w:r>
-        <w:rPr>
-          <w:rFonts w:ascii="Times New Roman" w:hAnsi="Times New Roman"/>
-          <w:color w:val="0F172A"/>
-          <w:sz w:val="24"/>
-        </w:rPr>
-        <w:t>डाळ</w:t>
-      </w:r>
-      <w:r>
-        <w:rPr>
-          <w:rFonts w:ascii="Times New Roman" w:hAnsi="Times New Roman"/>
-          <w:color w:val="0F172A"/>
-          <w:sz w:val="24"/>
-        </w:rPr>
-        <w:t xml:space="preserve"> </w:t>
-      </w:r>
-      <w:r>
-        <w:rPr>
-          <w:rFonts w:ascii="Times New Roman" w:hAnsi="Times New Roman"/>
-          <w:color w:val="0F172A"/>
-          <w:sz w:val="24"/>
-        </w:rPr>
-        <w:t>तेल</w:t>
-      </w:r>
-      <w:r>
-        <w:rPr>
-          <w:rFonts w:ascii="Times New Roman" w:hAnsi="Times New Roman"/>
-          <w:color w:val="0F172A"/>
-          <w:sz w:val="24"/>
-        </w:rPr>
-        <w:t>' in a worn notebook. At month-end, the customer often questions the date, exact quantity, or individual item prices. Without itemized receipts or timestamps, the merchant is forced to offer compromises or absorb disputes, losing ₹2,000 to ₹5,000 every single month. With VernaLedger-AI, the photo of the handwritten slip is permanently linked with UTC timestamps, parsed itemized prices, and customer confirmation logs, eliminating disputes completely while creating transparent financial records.</w:t>
+        <w:t>In traditional Kirana commerce, when a customer purchases ₹450 worth of pulses and cooking oil on credit, the shopkeeper writes '४५० डाळ तेल' in a worn notebook. At month-end, the customer often questions the date, exact quantity, or individual item prices. Without itemized receipts or timestamps, the merchant is forced to offer compromises or absorb disputes, losing ₹2,000 to ₹5,000 every single month. With VernaLedger-AI, the photo of the handwritten slip is permanently linked with UTC timestamps, parsed itemized prices, and customer confirmation logs, eliminating disputes completely while creating transparent financial records.</w:t>
       </w:r>
     </w:p>
     <w:p>
@@ -5356,95 +4721,7 @@
           <w:color w:val="0F172A"/>
           <w:sz w:val="24"/>
         </w:rPr>
-        <w:t xml:space="preserve">Historically, optical character recognition relied on classical computer vision pipelines (such as Otsu binarization, Hough transforms, and Convolutional Recurrent Neural Networks with Connectionist Temporal Classification, e.g., Tesseract OCR). While effective on clean, printed English text, these pipelines fail completely on unconstrained handwritten Devanagari script, which features continuous top horizontal hanging lines (Shirorekha / </w:t>
-      </w:r>
-      <w:r>
-        <w:rPr>
-          <w:rFonts w:ascii="Times New Roman" w:hAnsi="Times New Roman"/>
-          <w:color w:val="0F172A"/>
-          <w:sz w:val="24"/>
-        </w:rPr>
-        <w:t>शिरोरेषा</w:t>
-      </w:r>
-      <w:r>
-        <w:rPr>
-          <w:rFonts w:ascii="Times New Roman" w:hAnsi="Times New Roman"/>
-          <w:color w:val="0F172A"/>
-          <w:sz w:val="24"/>
-        </w:rPr>
-        <w:t>), complex conjunct consonants (</w:t>
-      </w:r>
-      <w:r>
-        <w:rPr>
-          <w:rFonts w:ascii="Times New Roman" w:hAnsi="Times New Roman"/>
-          <w:color w:val="0F172A"/>
-          <w:sz w:val="24"/>
-        </w:rPr>
-        <w:t>जोडाक्षरे</w:t>
-      </w:r>
-      <w:r>
-        <w:rPr>
-          <w:rFonts w:ascii="Times New Roman" w:hAnsi="Times New Roman"/>
-          <w:color w:val="0F172A"/>
-          <w:sz w:val="24"/>
-        </w:rPr>
-        <w:t>), and vowel diacrit</w:t>
-      </w:r>
-      <w:r>
-        <w:rPr>
-          <w:rFonts w:ascii="Times New Roman" w:hAnsi="Times New Roman"/>
-          <w:color w:val="0F172A"/>
-          <w:sz w:val="24"/>
-        </w:rPr>
-        <w:t>ics (</w:t>
-      </w:r>
-      <w:r>
-        <w:rPr>
-          <w:rFonts w:ascii="Times New Roman" w:hAnsi="Times New Roman"/>
-          <w:color w:val="0F172A"/>
-          <w:sz w:val="24"/>
-        </w:rPr>
-        <w:t>मात्रा</w:t>
-      </w:r>
-      <w:r>
-        <w:rPr>
-          <w:rFonts w:ascii="Times New Roman" w:hAnsi="Times New Roman"/>
-          <w:color w:val="0F172A"/>
-          <w:sz w:val="24"/>
-        </w:rPr>
-        <w:t xml:space="preserve">, </w:t>
-      </w:r>
-      <w:r>
-        <w:rPr>
-          <w:rFonts w:ascii="Times New Roman" w:hAnsi="Times New Roman"/>
-          <w:color w:val="0F172A"/>
-          <w:sz w:val="24"/>
-        </w:rPr>
-        <w:t>वेलांटी</w:t>
-      </w:r>
-      <w:r>
-        <w:rPr>
-          <w:rFonts w:ascii="Times New Roman" w:hAnsi="Times New Roman"/>
-          <w:color w:val="0F172A"/>
-          <w:sz w:val="24"/>
-        </w:rPr>
-        <w:t xml:space="preserve">, </w:t>
-      </w:r>
-      <w:r>
-        <w:rPr>
-          <w:rFonts w:ascii="Times New Roman" w:hAnsi="Times New Roman"/>
-          <w:color w:val="0F172A"/>
-          <w:sz w:val="24"/>
-        </w:rPr>
-        <w:t>उकार</w:t>
-      </w:r>
-      <w:r>
-        <w:rPr>
-          <w:rFonts w:ascii="Times New Roman" w:hAnsi="Times New Roman"/>
-          <w:color w:val="0F172A"/>
-          <w:sz w:val="24"/>
-        </w:rPr>
-        <w:t>). Handwritten Devanagari on rough paper chits frequently exhibits broken headlines, slanted baselines, and ink bleed. The emergence of multimodal transformer architectures capable of joint vision-language token embedding has transformed this domain, enabling zero-shot transcription of messy handwriting directly into structured JSON schemas.</w:t>
+        <w:t>Historically, optical character recognition relied on classical computer vision pipelines (such as Otsu binarization, Hough transforms, and Convolutional Recurrent Neural Networks with Connectionist Temporal Classification, e.g., Tesseract OCR). While effective on clean, printed English text, these pipelines fail completely on unconstrained handwritten Devanagari script, which features continuous top horizontal hanging lines (Shirorekha / शिरोरेषा), complex conjunct consonants (जोडाक्षरे), and vowel diacritics (मात्रा, वेलांटी, उकार). Handwritten Devanagari on rough paper chits frequently exhibits broken headlines, slanted baselines, and ink bleed. The emergence of multimodal transformer architectures capable of joint vision-language token embedding has transformed this domain, enabling zero-shot transcription of messy handwriting directly into structured JSON schemas.</w:t>
       </w:r>
     </w:p>
     <w:p>
@@ -5636,55 +4913,7 @@
           <w:color w:val="0F172A"/>
           <w:sz w:val="24"/>
         </w:rPr>
-        <w:t>Linguistic Empowerment and Inclusion: Over 72% of micro-merchants in Maharashtra conduct daily business communications exclusively in Marathi or Hindi. A system that expects them to type product names like 'Wheat Flour' instead of '</w:t>
-      </w:r>
-      <w:r>
-        <w:rPr>
-          <w:rFonts w:ascii="Times New Roman" w:hAnsi="Times New Roman"/>
-          <w:color w:val="0F172A"/>
-          <w:sz w:val="24"/>
-        </w:rPr>
-        <w:t>गहू</w:t>
-      </w:r>
-      <w:r>
-        <w:rPr>
-          <w:rFonts w:ascii="Times New Roman" w:hAnsi="Times New Roman"/>
-          <w:color w:val="0F172A"/>
-          <w:sz w:val="24"/>
-        </w:rPr>
-        <w:t>' or 'Sunrich Oil' instead of '</w:t>
-      </w:r>
-      <w:r>
-        <w:rPr>
-          <w:rFonts w:ascii="Times New Roman" w:hAnsi="Times New Roman"/>
-          <w:color w:val="0F172A"/>
-          <w:sz w:val="24"/>
-        </w:rPr>
-        <w:t>सनरीच</w:t>
-      </w:r>
-      <w:r>
-        <w:rPr>
-          <w:rFonts w:ascii="Times New Roman" w:hAnsi="Times New Roman"/>
-          <w:color w:val="0F172A"/>
-          <w:sz w:val="24"/>
-        </w:rPr>
-        <w:t xml:space="preserve"> </w:t>
-      </w:r>
-      <w:r>
-        <w:rPr>
-          <w:rFonts w:ascii="Times New Roman" w:hAnsi="Times New Roman"/>
-          <w:color w:val="0F172A"/>
-          <w:sz w:val="24"/>
-        </w:rPr>
-        <w:t>तेल</w:t>
-      </w:r>
-      <w:r>
-        <w:rPr>
-          <w:rFonts w:ascii="Times New Roman" w:hAnsi="Times New Roman"/>
-          <w:color w:val="0F172A"/>
-          <w:sz w:val="24"/>
-        </w:rPr>
-        <w:t>' enforces an unnatural cognitive tax. VernaLedger-AI provides complete native Marathi voice understanding and vocal feedback, ensuring technology adapts to the human rather than forcing the human to adapt to technology.</w:t>
+        <w:t>Linguistic Empowerment and Inclusion: Over 72% of micro-merchants in Maharashtra conduct daily business communications exclusively in Marathi or Hindi. A system that expects them to type product names like 'Wheat Flour' instead of 'गहू' or 'Sunrich Oil' instead of 'सनरीच तेल' enforces an unnatural cognitive tax. VernaLedger-AI provides complete native Marathi voice understanding and vocal feedback, ensuring technology adapts to the human rather than forcing the human to adapt to technology.</w:t>
       </w:r>
     </w:p>
     <w:p>
@@ -5815,15 +5044,7 @@
           <w:color w:val="0F172A"/>
           <w:sz w:val="24"/>
         </w:rPr>
-        <w:t xml:space="preserve">The development of intelligent vernacular retail systems spans multiple active domains in computer science, including Optical Character Recognition (OCR), Natural Language Processing (NLP), Multimodal Large Language Models (LLMs), Speech Synthesis, and Distributed Financial Ledger architectures. This chapter presents a comprehensive critical review of foundational academic literature, state-of-the-art machine learning models, and existing commercial retail management systems, identifying core technological </w:t>
-      </w:r>
-      <w:r>
-        <w:rPr>
-          <w:rFonts w:ascii="Times New Roman" w:hAnsi="Times New Roman"/>
-          <w:color w:val="0F172A"/>
-          <w:sz w:val="24"/>
-        </w:rPr>
-        <w:t>gaps that VernaLedger-AI addresses.</w:t>
+        <w:t>The development of intelligent vernacular retail systems spans multiple active domains in computer science, including Optical Character Recognition (OCR), Natural Language Processing (NLP), Multimodal Large Language Models (LLMs), Speech Synthesis, and Distributed Financial Ledger architectures. This chapter presents a comprehensive critical review of foundational academic literature, state-of-the-art machine learning models, and existing commercial retail management systems, identifying core technological gaps that VernaLedger-AI addresses.</w:t>
       </w:r>
     </w:p>
     <w:p>
@@ -5852,15 +5073,7 @@
           <w:color w:val="0F172A"/>
           <w:sz w:val="24"/>
         </w:rPr>
-        <w:t>Optical Character Recognition for Indic and Devanagari Scripts has been an active area of research for over three decades. Early approaches by Pal and Chaudhuri (2004) focused on rule-based structural decomposition, utilizing horizontal projection profiles to detect the 'Shirorekha' (headline) and segment characters into upper, middle, and lower zones. While effective for clean printed newspaper text, these segmentation-based methods fail completely on handwritten Devanagari chits. Handwritten Devanagari ex</w:t>
-      </w:r>
-      <w:r>
-        <w:rPr>
-          <w:rFonts w:ascii="Times New Roman" w:hAnsi="Times New Roman"/>
-          <w:color w:val="0F172A"/>
-          <w:sz w:val="24"/>
-        </w:rPr>
-        <w:t>hibits tremendous intra-writer and inter-writer variability, broken or omitted headlines, merged conjunct characters, and overlapping vowel modifiers.</w:t>
+        <w:t>Optical Character Recognition for Indic and Devanagari Scripts has been an active area of research for over three decades. Early approaches by Pal and Chaudhuri (2004) focused on rule-based structural decomposition, utilizing horizontal projection profiles to detect the 'Shirorekha' (headline) and segment characters into upper, middle, and lower zones. While effective for clean printed newspaper text, these segmentation-based methods fail completely on handwritten Devanagari chits. Handwritten Devanagari exhibits tremendous intra-writer and inter-writer variability, broken or omitted headlines, merged conjunct characters, and overlapping vowel modifiers.</w:t>
       </w:r>
     </w:p>
     <w:p>
@@ -5874,15 +5087,7 @@
           <w:color w:val="0F172A"/>
           <w:sz w:val="24"/>
         </w:rPr>
-        <w:t>Smith et al. (2018) integrated Deep Bidirectional Long Short-Term Memory (BiLSTM) networks with Connectionist Temporal Classification (CTC) loss inside Google's open-source Tesseract 4/5 engine. Although this eliminated the need for explicit character pre-segmentation, Tesseract remains fragile when exposed to low-resolution camera images captured under poor shop lighting, exhibiting word error rates (WER) exceeding 48% on Marathi handwritten grocery lists. Furthermore, Tesseract merely outputs raw characte</w:t>
-      </w:r>
-      <w:r>
-        <w:rPr>
-          <w:rFonts w:ascii="Times New Roman" w:hAnsi="Times New Roman"/>
-          <w:color w:val="0F172A"/>
-          <w:sz w:val="24"/>
-        </w:rPr>
-        <w:t>r streams without semantic understanding, leaving the impossible task of structuring handwritten text into item-quantity-rate columns to complex, error-prone regular expressions.</w:t>
+        <w:t>Smith et al. (2018) integrated Deep Bidirectional Long Short-Term Memory (BiLSTM) networks with Connectionist Temporal Classification (CTC) loss inside Google's open-source Tesseract 4/5 engine. Although this eliminated the need for explicit character pre-segmentation, Tesseract remains fragile when exposed to low-resolution camera images captured under poor shop lighting, exhibiting word error rates (WER) exceeding 48% on Marathi handwritten grocery lists. Furthermore, Tesseract merely outputs raw character streams without semantic understanding, leaving the impossible task of structuring handwritten text into item-quantity-rate columns to complex, error-prone regular expressions.</w:t>
       </w:r>
     </w:p>
     <w:p>
@@ -5925,399 +5130,7 @@
           <w:color w:val="0F172A"/>
           <w:sz w:val="24"/>
         </w:rPr>
-        <w:t>Devanagari represents an abugida writing system comprising 14 vowels (</w:t>
-      </w:r>
-      <w:r>
-        <w:rPr>
-          <w:rFonts w:ascii="Times New Roman" w:hAnsi="Times New Roman"/>
-          <w:color w:val="0F172A"/>
-          <w:sz w:val="24"/>
-        </w:rPr>
-        <w:t>स्वर</w:t>
-      </w:r>
-      <w:r>
-        <w:rPr>
-          <w:rFonts w:ascii="Times New Roman" w:hAnsi="Times New Roman"/>
-          <w:color w:val="0F172A"/>
-          <w:sz w:val="24"/>
-        </w:rPr>
-        <w:t>), 33 primary consonants (</w:t>
-      </w:r>
-      <w:r>
-        <w:rPr>
-          <w:rFonts w:ascii="Times New Roman" w:hAnsi="Times New Roman"/>
-          <w:color w:val="0F172A"/>
-          <w:sz w:val="24"/>
-        </w:rPr>
-        <w:t>व्यंजन</w:t>
-      </w:r>
-      <w:r>
-        <w:rPr>
-          <w:rFonts w:ascii="Times New Roman" w:hAnsi="Times New Roman"/>
-          <w:color w:val="0F172A"/>
-          <w:sz w:val="24"/>
-        </w:rPr>
-        <w:t>), and over 300 composite conjuncts (</w:t>
-      </w:r>
-      <w:r>
-        <w:rPr>
-          <w:rFonts w:ascii="Times New Roman" w:hAnsi="Times New Roman"/>
-          <w:color w:val="0F172A"/>
-          <w:sz w:val="24"/>
-        </w:rPr>
-        <w:t>संयुक्ताक्षरे</w:t>
-      </w:r>
-      <w:r>
-        <w:rPr>
-          <w:rFonts w:ascii="Times New Roman" w:hAnsi="Times New Roman"/>
-          <w:color w:val="0F172A"/>
-          <w:sz w:val="24"/>
-        </w:rPr>
-        <w:t>). Unlike the linear left-to-right structure of the Latin alphabet, Devanagari characters are structurally bound by a continuous top horizontal line known as the 'Shirorekha' (</w:t>
-      </w:r>
-      <w:r>
-        <w:rPr>
-          <w:rFonts w:ascii="Times New Roman" w:hAnsi="Times New Roman"/>
-          <w:color w:val="0F172A"/>
-          <w:sz w:val="24"/>
-        </w:rPr>
-        <w:t>शिरोरेषा</w:t>
-      </w:r>
-      <w:r>
-        <w:rPr>
-          <w:rFonts w:ascii="Times New Roman" w:hAnsi="Times New Roman"/>
-          <w:color w:val="0F172A"/>
-          <w:sz w:val="24"/>
-        </w:rPr>
-        <w:t>). Vowel modifiers (</w:t>
-      </w:r>
-      <w:r>
-        <w:rPr>
-          <w:rFonts w:ascii="Times New Roman" w:hAnsi="Times New Roman"/>
-          <w:color w:val="0F172A"/>
-          <w:sz w:val="24"/>
-        </w:rPr>
-        <w:t>मात्रा</w:t>
-      </w:r>
-      <w:r>
-        <w:rPr>
-          <w:rFonts w:ascii="Times New Roman" w:hAnsi="Times New Roman"/>
-          <w:color w:val="0F172A"/>
-          <w:sz w:val="24"/>
-        </w:rPr>
-        <w:t>) can appear above the headline (</w:t>
-      </w:r>
-      <w:r>
-        <w:rPr>
-          <w:rFonts w:ascii="Times New Roman" w:hAnsi="Times New Roman"/>
-          <w:color w:val="0F172A"/>
-          <w:sz w:val="24"/>
-        </w:rPr>
-        <w:t>उदा</w:t>
-      </w:r>
-      <w:r>
-        <w:rPr>
-          <w:rFonts w:ascii="Times New Roman" w:hAnsi="Times New Roman"/>
-          <w:color w:val="0F172A"/>
-          <w:sz w:val="24"/>
-        </w:rPr>
-        <w:t xml:space="preserve">. </w:t>
-      </w:r>
-      <w:r>
-        <w:rPr>
-          <w:rFonts w:ascii="Times New Roman" w:hAnsi="Times New Roman"/>
-          <w:color w:val="0F172A"/>
-          <w:sz w:val="24"/>
-        </w:rPr>
-        <w:t>े</w:t>
-      </w:r>
-      <w:r>
-        <w:rPr>
-          <w:rFonts w:ascii="Times New Roman" w:hAnsi="Times New Roman"/>
-          <w:color w:val="0F172A"/>
-          <w:sz w:val="24"/>
-        </w:rPr>
-        <w:t xml:space="preserve">, </w:t>
-      </w:r>
-      <w:r>
-        <w:rPr>
-          <w:rFonts w:ascii="Times New Roman" w:hAnsi="Times New Roman"/>
-          <w:color w:val="0F172A"/>
-          <w:sz w:val="24"/>
-        </w:rPr>
-        <w:t>ै</w:t>
-      </w:r>
-      <w:r>
-        <w:rPr>
-          <w:rFonts w:ascii="Times New Roman" w:hAnsi="Times New Roman"/>
-          <w:color w:val="0F172A"/>
-          <w:sz w:val="24"/>
-        </w:rPr>
-        <w:t>), below the baseline (</w:t>
-      </w:r>
-      <w:r>
-        <w:rPr>
-          <w:rFonts w:ascii="Times New Roman" w:hAnsi="Times New Roman"/>
-          <w:color w:val="0F172A"/>
-          <w:sz w:val="24"/>
-        </w:rPr>
-        <w:t>उदा</w:t>
-      </w:r>
-      <w:r>
-        <w:rPr>
-          <w:rFonts w:ascii="Times New Roman" w:hAnsi="Times New Roman"/>
-          <w:color w:val="0F172A"/>
-          <w:sz w:val="24"/>
-        </w:rPr>
-        <w:t xml:space="preserve">. </w:t>
-      </w:r>
-      <w:r>
-        <w:rPr>
-          <w:rFonts w:ascii="Times New Roman" w:hAnsi="Times New Roman"/>
-          <w:color w:val="0F172A"/>
-          <w:sz w:val="24"/>
-        </w:rPr>
-        <w:t>ु</w:t>
-      </w:r>
-      <w:r>
-        <w:rPr>
-          <w:rFonts w:ascii="Times New Roman" w:hAnsi="Times New Roman"/>
-          <w:color w:val="0F172A"/>
-          <w:sz w:val="24"/>
-        </w:rPr>
-        <w:t xml:space="preserve">, </w:t>
-      </w:r>
-      <w:r>
-        <w:rPr>
-          <w:rFonts w:ascii="Times New Roman" w:hAnsi="Times New Roman"/>
-          <w:color w:val="0F172A"/>
-          <w:sz w:val="24"/>
-        </w:rPr>
-        <w:t>ू</w:t>
-      </w:r>
-      <w:r>
-        <w:rPr>
-          <w:rFonts w:ascii="Times New Roman" w:hAnsi="Times New Roman"/>
-          <w:color w:val="0F172A"/>
-          <w:sz w:val="24"/>
-        </w:rPr>
-        <w:t xml:space="preserve">, </w:t>
-      </w:r>
-      <w:r>
-        <w:rPr>
-          <w:rFonts w:ascii="Times New Roman" w:hAnsi="Times New Roman"/>
-          <w:color w:val="0F172A"/>
-          <w:sz w:val="24"/>
-        </w:rPr>
-        <w:t>ृ</w:t>
-      </w:r>
-      <w:r>
-        <w:rPr>
-          <w:rFonts w:ascii="Times New Roman" w:hAnsi="Times New Roman"/>
-          <w:color w:val="0F172A"/>
-          <w:sz w:val="24"/>
-        </w:rPr>
-        <w:t>), before the consonant (</w:t>
-      </w:r>
-      <w:r>
-        <w:rPr>
-          <w:rFonts w:ascii="Times New Roman" w:hAnsi="Times New Roman"/>
-          <w:color w:val="0F172A"/>
-          <w:sz w:val="24"/>
-        </w:rPr>
-        <w:t>उदा</w:t>
-      </w:r>
-      <w:r>
-        <w:rPr>
-          <w:rFonts w:ascii="Times New Roman" w:hAnsi="Times New Roman"/>
-          <w:color w:val="0F172A"/>
-          <w:sz w:val="24"/>
-        </w:rPr>
-        <w:t xml:space="preserve">. </w:t>
-      </w:r>
-      <w:r>
-        <w:rPr>
-          <w:rFonts w:ascii="Times New Roman" w:hAnsi="Times New Roman"/>
-          <w:color w:val="0F172A"/>
-          <w:sz w:val="24"/>
-        </w:rPr>
-        <w:t>ि</w:t>
-      </w:r>
-      <w:r>
-        <w:rPr>
-          <w:rFonts w:ascii="Times New Roman" w:hAnsi="Times New Roman"/>
-          <w:color w:val="0F172A"/>
-          <w:sz w:val="24"/>
-        </w:rPr>
-        <w:t xml:space="preserve"> - </w:t>
-      </w:r>
-      <w:r>
-        <w:rPr>
-          <w:rFonts w:ascii="Times New Roman" w:hAnsi="Times New Roman"/>
-          <w:color w:val="0F172A"/>
-          <w:sz w:val="24"/>
-        </w:rPr>
-        <w:t>ऱ्हस्व</w:t>
-      </w:r>
-      <w:r>
-        <w:rPr>
-          <w:rFonts w:ascii="Times New Roman" w:hAnsi="Times New Roman"/>
-          <w:color w:val="0F172A"/>
-          <w:sz w:val="24"/>
-        </w:rPr>
-        <w:t xml:space="preserve"> </w:t>
-      </w:r>
-      <w:r>
-        <w:rPr>
-          <w:rFonts w:ascii="Times New Roman" w:hAnsi="Times New Roman"/>
-          <w:color w:val="0F172A"/>
-          <w:sz w:val="24"/>
-        </w:rPr>
-        <w:t>वेलांटी</w:t>
-      </w:r>
-      <w:r>
-        <w:rPr>
-          <w:rFonts w:ascii="Times New Roman" w:hAnsi="Times New Roman"/>
-          <w:color w:val="0F172A"/>
-          <w:sz w:val="24"/>
-        </w:rPr>
-        <w:t>), or after the consonant (</w:t>
-      </w:r>
-      <w:r>
-        <w:rPr>
-          <w:rFonts w:ascii="Times New Roman" w:hAnsi="Times New Roman"/>
-          <w:color w:val="0F172A"/>
-          <w:sz w:val="24"/>
-        </w:rPr>
-        <w:t>उदा</w:t>
-      </w:r>
-      <w:r>
-        <w:rPr>
-          <w:rFonts w:ascii="Times New Roman" w:hAnsi="Times New Roman"/>
-          <w:color w:val="0F172A"/>
-          <w:sz w:val="24"/>
-        </w:rPr>
-        <w:t xml:space="preserve">. </w:t>
-      </w:r>
-      <w:r>
-        <w:rPr>
-          <w:rFonts w:ascii="Times New Roman" w:hAnsi="Times New Roman"/>
-          <w:color w:val="0F172A"/>
-          <w:sz w:val="24"/>
-        </w:rPr>
-        <w:t>ी</w:t>
-      </w:r>
-      <w:r>
-        <w:rPr>
-          <w:rFonts w:ascii="Times New Roman" w:hAnsi="Times New Roman"/>
-          <w:color w:val="0F172A"/>
-          <w:sz w:val="24"/>
-        </w:rPr>
-        <w:t xml:space="preserve">, </w:t>
-      </w:r>
-      <w:r>
-        <w:rPr>
-          <w:rFonts w:ascii="Times New Roman" w:hAnsi="Times New Roman"/>
-          <w:color w:val="0F172A"/>
-          <w:sz w:val="24"/>
-        </w:rPr>
-        <w:t>ो</w:t>
-      </w:r>
-      <w:r>
-        <w:rPr>
-          <w:rFonts w:ascii="Times New Roman" w:hAnsi="Times New Roman"/>
-          <w:color w:val="0F172A"/>
-          <w:sz w:val="24"/>
-        </w:rPr>
-        <w:t xml:space="preserve">, </w:t>
-      </w:r>
-      <w:r>
-        <w:rPr>
-          <w:rFonts w:ascii="Times New Roman" w:hAnsi="Times New Roman"/>
-          <w:color w:val="0F172A"/>
-          <w:sz w:val="24"/>
-        </w:rPr>
-        <w:t>ौ</w:t>
-      </w:r>
-      <w:r>
-        <w:rPr>
-          <w:rFonts w:ascii="Times New Roman" w:hAnsi="Times New Roman"/>
-          <w:color w:val="0F172A"/>
-          <w:sz w:val="24"/>
-        </w:rPr>
-        <w:t>). When micro-merchants write bills in haste, the Sh</w:t>
-      </w:r>
-      <w:r>
-        <w:rPr>
-          <w:rFonts w:ascii="Times New Roman" w:hAnsi="Times New Roman"/>
-          <w:color w:val="0F172A"/>
-          <w:sz w:val="24"/>
-        </w:rPr>
-        <w:t>irorekha is frequently broken, slanted, or omitted entirely. Concurrently, composite conjuncts such as '</w:t>
-      </w:r>
-      <w:r>
-        <w:rPr>
-          <w:rFonts w:ascii="Times New Roman" w:hAnsi="Times New Roman"/>
-          <w:color w:val="0F172A"/>
-          <w:sz w:val="24"/>
-        </w:rPr>
-        <w:t>ष्ट</w:t>
-      </w:r>
-      <w:r>
-        <w:rPr>
-          <w:rFonts w:ascii="Times New Roman" w:hAnsi="Times New Roman"/>
-          <w:color w:val="0F172A"/>
-          <w:sz w:val="24"/>
-        </w:rPr>
-        <w:t>', '</w:t>
-      </w:r>
-      <w:r>
-        <w:rPr>
-          <w:rFonts w:ascii="Times New Roman" w:hAnsi="Times New Roman"/>
-          <w:color w:val="0F172A"/>
-          <w:sz w:val="24"/>
-        </w:rPr>
-        <w:t>क्ल</w:t>
-      </w:r>
-      <w:r>
-        <w:rPr>
-          <w:rFonts w:ascii="Times New Roman" w:hAnsi="Times New Roman"/>
-          <w:color w:val="0F172A"/>
-          <w:sz w:val="24"/>
-        </w:rPr>
-        <w:t>', '</w:t>
-      </w:r>
-      <w:r>
-        <w:rPr>
-          <w:rFonts w:ascii="Times New Roman" w:hAnsi="Times New Roman"/>
-          <w:color w:val="0F172A"/>
-          <w:sz w:val="24"/>
-        </w:rPr>
-        <w:t>प्र</w:t>
-      </w:r>
-      <w:r>
-        <w:rPr>
-          <w:rFonts w:ascii="Times New Roman" w:hAnsi="Times New Roman"/>
-          <w:color w:val="0F172A"/>
-          <w:sz w:val="24"/>
-        </w:rPr>
-        <w:t>', '</w:t>
-      </w:r>
-      <w:r>
-        <w:rPr>
-          <w:rFonts w:ascii="Times New Roman" w:hAnsi="Times New Roman"/>
-          <w:color w:val="0F172A"/>
-          <w:sz w:val="24"/>
-        </w:rPr>
-        <w:t>द्र</w:t>
-      </w:r>
-      <w:r>
-        <w:rPr>
-          <w:rFonts w:ascii="Times New Roman" w:hAnsi="Times New Roman"/>
-          <w:color w:val="0F172A"/>
-          <w:sz w:val="24"/>
-        </w:rPr>
-        <w:t>' frequently merge into single visual glyphs. Classical OCR systems attempt to segment these glyphs, causing fatal character fragmentation. In contrast, multimodal vision transformers treat the entire image patch holistically, inferring character identities directly from surrounding contextual semantics.</w:t>
+        <w:t>Devanagari represents an abugida writing system comprising 14 vowels (स्वर), 33 primary consonants (व्यंजन), and over 300 composite conjuncts (संयुक्ताक्षरे). Unlike the linear left-to-right structure of the Latin alphabet, Devanagari characters are structurally bound by a continuous top horizontal line known as the 'Shirorekha' (शिरोरेषा). Vowel modifiers (मात्रा) can appear above the headline (उदा. े, ै), below the baseline (उदा. ु, ू, ृ), before the consonant (उदा. ि - ऱ्हस्व वेलांटी), or after the consonant (उदा. ी, ो, ौ). When micro-merchants write bills in haste, the Shirorekha is frequently broken, slanted, or omitted entirely. Concurrently, composite conjuncts such as 'ष्ट', 'क्ल', 'प्र', 'द्र' frequently merge into single visual glyphs. Classical OCR systems attempt to segment these glyphs, causing fatal character fragmentation. In contrast, multimodal vision transformers treat the entire image patch holistically, inferring character identities directly from surrounding contextual semantics.</w:t>
       </w:r>
     </w:p>
     <w:p>
@@ -6340,111 +5153,7 @@
           <w:sz w:val="24"/>
         </w:rPr>
         <w:lastRenderedPageBreak/>
-        <w:t>(Team et al., 2023; Gemini 1.5/Flash-Lite, 2024) fundamentally departed from traditional pipeline architectures. Instead of transcribing visual pixels to text via OCR and subsequently parsing text with an NLP model, Gemini processes visual pixels directly through native visual transformer encoders, mapping visual tokens jointly into the same semantic embedding space as text tokens. Consequently, Gemini can simultaneously recognize cursive Devanagari handwriting, infer missing context (such as recognizing th</w:t>
-      </w:r>
-      <w:r>
-        <w:rPr>
-          <w:rFonts w:ascii="Times New Roman" w:hAnsi="Times New Roman"/>
-          <w:color w:val="0F172A"/>
-          <w:sz w:val="24"/>
-        </w:rPr>
-        <w:t>at '</w:t>
-      </w:r>
-      <w:r>
-        <w:rPr>
-          <w:rFonts w:ascii="Times New Roman" w:hAnsi="Times New Roman"/>
-          <w:color w:val="0F172A"/>
-          <w:sz w:val="24"/>
-        </w:rPr>
-        <w:t>सा</w:t>
-      </w:r>
-      <w:r>
-        <w:rPr>
-          <w:rFonts w:ascii="Times New Roman" w:hAnsi="Times New Roman"/>
-          <w:color w:val="0F172A"/>
-          <w:sz w:val="24"/>
-        </w:rPr>
-        <w:t xml:space="preserve">. </w:t>
-      </w:r>
-      <w:r>
-        <w:rPr>
-          <w:rFonts w:ascii="Times New Roman" w:hAnsi="Times New Roman"/>
-          <w:color w:val="0F172A"/>
-          <w:sz w:val="24"/>
-        </w:rPr>
-        <w:t>१</w:t>
-      </w:r>
-      <w:r>
-        <w:rPr>
-          <w:rFonts w:ascii="Times New Roman" w:hAnsi="Times New Roman"/>
-          <w:color w:val="0F172A"/>
-          <w:sz w:val="24"/>
-        </w:rPr>
-        <w:t xml:space="preserve"> </w:t>
-      </w:r>
-      <w:r>
-        <w:rPr>
-          <w:rFonts w:ascii="Times New Roman" w:hAnsi="Times New Roman"/>
-          <w:color w:val="0F172A"/>
-          <w:sz w:val="24"/>
-        </w:rPr>
-        <w:t>किलो</w:t>
-      </w:r>
-      <w:r>
-        <w:rPr>
-          <w:rFonts w:ascii="Times New Roman" w:hAnsi="Times New Roman"/>
-          <w:color w:val="0F172A"/>
-          <w:sz w:val="24"/>
-        </w:rPr>
-        <w:t>' means '</w:t>
-      </w:r>
-      <w:r>
-        <w:rPr>
-          <w:rFonts w:ascii="Times New Roman" w:hAnsi="Times New Roman"/>
-          <w:color w:val="0F172A"/>
-          <w:sz w:val="24"/>
-        </w:rPr>
-        <w:t>साखर</w:t>
-      </w:r>
-      <w:r>
-        <w:rPr>
-          <w:rFonts w:ascii="Times New Roman" w:hAnsi="Times New Roman"/>
-          <w:color w:val="0F172A"/>
-          <w:sz w:val="24"/>
-        </w:rPr>
-        <w:t xml:space="preserve"> </w:t>
-      </w:r>
-      <w:r>
-        <w:rPr>
-          <w:rFonts w:ascii="Times New Roman" w:hAnsi="Times New Roman"/>
-          <w:color w:val="0F172A"/>
-          <w:sz w:val="24"/>
-        </w:rPr>
-        <w:t>१</w:t>
-      </w:r>
-      <w:r>
-        <w:rPr>
-          <w:rFonts w:ascii="Times New Roman" w:hAnsi="Times New Roman"/>
-          <w:color w:val="0F172A"/>
-          <w:sz w:val="24"/>
-        </w:rPr>
-        <w:t xml:space="preserve"> </w:t>
-      </w:r>
-      <w:r>
-        <w:rPr>
-          <w:rFonts w:ascii="Times New Roman" w:hAnsi="Times New Roman"/>
-          <w:color w:val="0F172A"/>
-          <w:sz w:val="24"/>
-        </w:rPr>
-        <w:t>किलो</w:t>
-      </w:r>
-      <w:r>
-        <w:rPr>
-          <w:rFonts w:ascii="Times New Roman" w:hAnsi="Times New Roman"/>
-          <w:color w:val="0F172A"/>
-          <w:sz w:val="24"/>
-        </w:rPr>
-        <w:t>'), map abbreviations, compute numeric arithmetic, and format the extracted entities directly into strict Pydantic JSON schemas in a single forward pass.</w:t>
+        <w:t>(Team et al., 2023; Gemini 1.5/Flash-Lite, 2024) fundamentally departed from traditional pipeline architectures. Instead of transcribing visual pixels to text via OCR and subsequently parsing text with an NLP model, Gemini processes visual pixels directly through native visual transformer encoders, mapping visual tokens jointly into the same semantic embedding space as text tokens. Consequently, Gemini can simultaneously recognize cursive Devanagari handwriting, infer missing context (such as recognizing that 'सा. १ किलो' means 'साखर १ किलो'), map abbreviations, compute numeric arithmetic, and format the extracted entities directly into strict Pydantic JSON schemas in a single forward pass.</w:t>
       </w:r>
     </w:p>
     <w:p>
@@ -6458,15 +5167,7 @@
           <w:color w:val="0F172A"/>
           <w:sz w:val="24"/>
         </w:rPr>
-        <w:t>In the domain of Conversational Spoken Language Processing, traditional voice bots relied on automated speech recognition (ASR) engines such as CMU Sphinx or Google Cloud STT, piped through intent classifiers (Rasa / Dialogflow), and finally fed into concatenative text-to-speech (TTS) engines. This multi-hop architecture suffered from severe cumulative latency, frequently exceeding 4.5 to 6.0 seconds per turn—unacceptable for busy retail checkout environments. Microsoft Research (2022) demonstrated that Neu</w:t>
-      </w:r>
-      <w:r>
-        <w:rPr>
-          <w:rFonts w:ascii="Times New Roman" w:hAnsi="Times New Roman"/>
-          <w:color w:val="0F172A"/>
-          <w:sz w:val="24"/>
-        </w:rPr>
-        <w:t>ral Speech Synthesis utilizing FastSpeech (Ren et al., 2019) and VITS (Kim et al., 2021) architectures generates natural human intonation with negligible inference overhead. By integrating the Microsoft Edge Neural Speech engine (mr-IN-AarohiNeural) directly with asynchronous in-memory Retrieval-Augmented Generation (Lewis et al., 2020), VernaLedger-AI compresses the total end-to-end voice query pipeline down to 1.16 seconds.</w:t>
+        <w:t>In the domain of Conversational Spoken Language Processing, traditional voice bots relied on automated speech recognition (ASR) engines such as CMU Sphinx or Google Cloud STT, piped through intent classifiers (Rasa / Dialogflow), and finally fed into concatenative text-to-speech (TTS) engines. This multi-hop architecture suffered from severe cumulative latency, frequently exceeding 4.5 to 6.0 seconds per turn—unacceptable for busy retail checkout environments. Microsoft Research (2022) demonstrated that Neural Speech Synthesis utilizing FastSpeech (Ren et al., 2019) and VITS (Kim et al., 2021) architectures generates natural human intonation with negligible inference overhead. By integrating the Microsoft Edge Neural Speech engine (mr-IN-AarohiNeural) directly with asynchronous in-memory Retrieval-Augmented Generation (Lewis et al., 2020), VernaLedger-AI compresses the total end-to-end voice query pipeline down to 1.16 seconds.</w:t>
       </w:r>
     </w:p>
     <w:p>
@@ -6480,71 +5181,7 @@
           <w:color w:val="0F172A"/>
           <w:sz w:val="24"/>
         </w:rPr>
-        <w:t>Patel and Rao (2022) investigated acoustic modeling challenges in low-resource Indic speech recognition, highlighting that retail background noise (traffic honks, ceiling fans, refrigeration hums, simultaneous customer chatter) severely degrades standard ASR tokenizers. VernaLedger-AI addresses this through client-side Web Audio dynamic noise gating, high-pass filtering at 120 Hz, and targeted Whisper/Gemini context-prompting with retail keyword lexicons (</w:t>
-      </w:r>
-      <w:r>
-        <w:rPr>
-          <w:rFonts w:ascii="Times New Roman" w:hAnsi="Times New Roman"/>
-          <w:color w:val="0F172A"/>
-          <w:sz w:val="24"/>
-        </w:rPr>
-        <w:t>दुकान</w:t>
-      </w:r>
-      <w:r>
-        <w:rPr>
-          <w:rFonts w:ascii="Times New Roman" w:hAnsi="Times New Roman"/>
-          <w:color w:val="0F172A"/>
-          <w:sz w:val="24"/>
-        </w:rPr>
-        <w:t xml:space="preserve">, </w:t>
-      </w:r>
-      <w:r>
-        <w:rPr>
-          <w:rFonts w:ascii="Times New Roman" w:hAnsi="Times New Roman"/>
-          <w:color w:val="0F172A"/>
-          <w:sz w:val="24"/>
-        </w:rPr>
-        <w:t>उधारी</w:t>
-      </w:r>
-      <w:r>
-        <w:rPr>
-          <w:rFonts w:ascii="Times New Roman" w:hAnsi="Times New Roman"/>
-          <w:color w:val="0F172A"/>
-          <w:sz w:val="24"/>
-        </w:rPr>
-        <w:t xml:space="preserve">, </w:t>
-      </w:r>
-      <w:r>
-        <w:rPr>
-          <w:rFonts w:ascii="Times New Roman" w:hAnsi="Times New Roman"/>
-          <w:color w:val="0F172A"/>
-          <w:sz w:val="24"/>
-        </w:rPr>
-        <w:t>गल्ला</w:t>
-      </w:r>
-      <w:r>
-        <w:rPr>
-          <w:rFonts w:ascii="Times New Roman" w:hAnsi="Times New Roman"/>
-          <w:color w:val="0F172A"/>
-          <w:sz w:val="24"/>
-        </w:rPr>
-        <w:t xml:space="preserve">, </w:t>
-      </w:r>
-      <w:r>
-        <w:rPr>
-          <w:rFonts w:ascii="Times New Roman" w:hAnsi="Times New Roman"/>
-          <w:color w:val="0F172A"/>
-          <w:sz w:val="24"/>
-        </w:rPr>
-        <w:t>पावती</w:t>
-      </w:r>
-      <w:r>
-        <w:rPr>
-          <w:rFonts w:ascii="Times New Roman" w:hAnsi="Times New Roman"/>
-          <w:color w:val="0F172A"/>
-          <w:sz w:val="24"/>
-        </w:rPr>
-        <w:t>).</w:t>
+        <w:t>Patel and Rao (2022) investigated acoustic modeling challenges in low-resource Indic speech recognition, highlighting that retail background noise (traffic honks, ceiling fans, refrigeration hums, simultaneous customer chatter) severely degrades standard ASR tokenizers. VernaLedger-AI addresses this through client-side Web Audio dynamic noise gating, high-pass filtering at 120 Hz, and targeted Whisper/Gemini context-prompting with retail keyword lexicons (दुकान, उधारी, गल्ला, पावती).</w:t>
       </w:r>
     </w:p>
     <w:p>
@@ -6573,15 +5210,7 @@
           <w:color w:val="0F172A"/>
           <w:sz w:val="24"/>
         </w:rPr>
-        <w:t>In rural and semi-urban India, wireless mobile networks experience frequent jitter and packet loss. Traditional uncompressed audio streams (e.g. PCM WAV at 44.1 kHz, 16-bit) require approximately 705 kbps of network bandwidth, leading to buffering delays exceeding 3 seconds on 3G and congested 4G towers. VernaLedger-AI utilizes the WebM container with the Opus codec operating at 24 kbps variable bitrate. This achieves a 96.5% compression ratio while preserving speech formant fidelity, enabling instant sub-1</w:t>
-      </w:r>
-      <w:r>
-        <w:rPr>
-          <w:rFonts w:ascii="Times New Roman" w:hAnsi="Times New Roman"/>
-          <w:color w:val="0F172A"/>
-          <w:sz w:val="24"/>
-        </w:rPr>
-        <w:t>50ms audio chunk uploads even under fringe network conditions.</w:t>
+        <w:t>In rural and semi-urban India, wireless mobile networks experience frequent jitter and packet loss. Traditional uncompressed audio streams (e.g. PCM WAV at 44.1 kHz, 16-bit) require approximately 705 kbps of network bandwidth, leading to buffering delays exceeding 3 seconds on 3G and congested 4G towers. VernaLedger-AI utilizes the WebM container with the Opus codec operating at 24 kbps variable bitrate. This achieves a 96.5% compression ratio while preserving speech formant fidelity, enabling instant sub-150ms audio chunk uploads even under fringe network conditions.</w:t>
       </w:r>
     </w:p>
     <w:p>
@@ -8091,39 +6720,7 @@
           <w:color w:val="0F172A"/>
           <w:sz w:val="24"/>
         </w:rPr>
-        <w:t>Kirana &amp; General Grocery Stores (</w:t>
-      </w:r>
-      <w:r>
-        <w:rPr>
-          <w:rFonts w:ascii="Times New Roman" w:hAnsi="Times New Roman"/>
-          <w:color w:val="0F172A"/>
-          <w:sz w:val="24"/>
-        </w:rPr>
-        <w:t>किराणा</w:t>
-      </w:r>
-      <w:r>
-        <w:rPr>
-          <w:rFonts w:ascii="Times New Roman" w:hAnsi="Times New Roman"/>
-          <w:color w:val="0F172A"/>
-          <w:sz w:val="24"/>
-        </w:rPr>
-        <w:t xml:space="preserve"> </w:t>
-      </w:r>
-      <w:r>
-        <w:rPr>
-          <w:rFonts w:ascii="Times New Roman" w:hAnsi="Times New Roman"/>
-          <w:color w:val="0F172A"/>
-          <w:sz w:val="24"/>
-        </w:rPr>
-        <w:t>दुकान</w:t>
-      </w:r>
-      <w:r>
-        <w:rPr>
-          <w:rFonts w:ascii="Times New Roman" w:hAnsi="Times New Roman"/>
-          <w:color w:val="0F172A"/>
-          <w:sz w:val="24"/>
-        </w:rPr>
-        <w:t>): The core operational use case. Enables shopkeepers to rapidly photograph crumpled grocery chits, convert spoken customer orders into structured line items, record daily Udhaari credit, and broadcast WhatsApp payment reminders with integrated dynamic UPI payment links. Field trials demonstrated an immediate 68% improvement in 14-day credit recovery cycles.</w:t>
+        <w:t>Kirana &amp; General Grocery Stores (किराणा दुकान): The core operational use case. Enables shopkeepers to rapidly photograph crumpled grocery chits, convert spoken customer orders into structured line items, record daily Udhaari credit, and broadcast WhatsApp payment reminders with integrated dynamic UPI payment links. Field trials demonstrated an immediate 68% improvement in 14-day credit recovery cycles.</w:t>
       </w:r>
     </w:p>
     <w:p>
@@ -8147,87 +6744,7 @@
           <w:color w:val="0F172A"/>
           <w:sz w:val="24"/>
         </w:rPr>
-        <w:t>Dairy Collection Centers &amp; Milk Distribution Booths (</w:t>
-      </w:r>
-      <w:r>
-        <w:rPr>
-          <w:rFonts w:ascii="Times New Roman" w:hAnsi="Times New Roman"/>
-          <w:color w:val="0F172A"/>
-          <w:sz w:val="24"/>
-        </w:rPr>
-        <w:t>डेअरी</w:t>
-      </w:r>
-      <w:r>
-        <w:rPr>
-          <w:rFonts w:ascii="Times New Roman" w:hAnsi="Times New Roman"/>
-          <w:color w:val="0F172A"/>
-          <w:sz w:val="24"/>
-        </w:rPr>
-        <w:t xml:space="preserve"> </w:t>
-      </w:r>
-      <w:r>
-        <w:rPr>
-          <w:rFonts w:ascii="Times New Roman" w:hAnsi="Times New Roman"/>
-          <w:color w:val="0F172A"/>
-          <w:sz w:val="24"/>
-        </w:rPr>
-        <w:t>आणि</w:t>
-      </w:r>
-      <w:r>
-        <w:rPr>
-          <w:rFonts w:ascii="Times New Roman" w:hAnsi="Times New Roman"/>
-          <w:color w:val="0F172A"/>
-          <w:sz w:val="24"/>
-        </w:rPr>
-        <w:t xml:space="preserve"> </w:t>
-      </w:r>
-      <w:r>
-        <w:rPr>
-          <w:rFonts w:ascii="Times New Roman" w:hAnsi="Times New Roman"/>
-          <w:color w:val="0F172A"/>
-          <w:sz w:val="24"/>
-        </w:rPr>
-        <w:t>दूध</w:t>
-      </w:r>
-      <w:r>
-        <w:rPr>
-          <w:rFonts w:ascii="Times New Roman" w:hAnsi="Times New Roman"/>
-          <w:color w:val="0F172A"/>
-          <w:sz w:val="24"/>
-        </w:rPr>
-        <w:t xml:space="preserve"> </w:t>
-      </w:r>
-      <w:r>
-        <w:rPr>
-          <w:rFonts w:ascii="Times New Roman" w:hAnsi="Times New Roman"/>
-          <w:color w:val="0F172A"/>
-          <w:sz w:val="24"/>
-        </w:rPr>
-        <w:t>संकलन</w:t>
-      </w:r>
-      <w:r>
-        <w:rPr>
-          <w:rFonts w:ascii="Times New Roman" w:hAnsi="Times New Roman"/>
-          <w:color w:val="0F172A"/>
-          <w:sz w:val="24"/>
-        </w:rPr>
-        <w:t xml:space="preserve"> </w:t>
-      </w:r>
-      <w:r>
-        <w:rPr>
-          <w:rFonts w:ascii="Times New Roman" w:hAnsi="Times New Roman"/>
-          <w:color w:val="0F172A"/>
-          <w:sz w:val="24"/>
-        </w:rPr>
-        <w:t>केंद्र</w:t>
-      </w:r>
-      <w:r>
-        <w:rPr>
-          <w:rFonts w:ascii="Times New Roman" w:hAnsi="Times New Roman"/>
-          <w:color w:val="0F172A"/>
-          <w:sz w:val="24"/>
-        </w:rPr>
-        <w:t>): Dairy operators receive daily morning and evening milk supply from dozens of local farmers, logging fat percentage, SNF, and quantity in handwritten slips. VernaLedger-AI automates slip digitization and calculates weekly farmer payouts via spoken Marathi commands. Eliminates calculation discrepancies and disputes during peak morning intake hours.</w:t>
+        <w:t>Dairy Collection Centers &amp; Milk Distribution Booths (डेअरी आणि दूध संकलन केंद्र): Dairy operators receive daily morning and evening milk supply from dozens of local farmers, logging fat percentage, SNF, and quantity in handwritten slips. VernaLedger-AI automates slip digitization and calculates weekly farmer payouts via spoken Marathi commands. Eliminates calculation discrepancies and disputes during peak morning intake hours.</w:t>
       </w:r>
     </w:p>
     <w:p>
@@ -8251,55 +6768,7 @@
           <w:color w:val="0F172A"/>
           <w:sz w:val="24"/>
         </w:rPr>
-        <w:t>Agricultural Input &amp; Fertilizer Depots (</w:t>
-      </w:r>
-      <w:r>
-        <w:rPr>
-          <w:rFonts w:ascii="Times New Roman" w:hAnsi="Times New Roman"/>
-          <w:color w:val="0F172A"/>
-          <w:sz w:val="24"/>
-        </w:rPr>
-        <w:t>कृषी</w:t>
-      </w:r>
-      <w:r>
-        <w:rPr>
-          <w:rFonts w:ascii="Times New Roman" w:hAnsi="Times New Roman"/>
-          <w:color w:val="0F172A"/>
-          <w:sz w:val="24"/>
-        </w:rPr>
-        <w:t xml:space="preserve"> </w:t>
-      </w:r>
-      <w:r>
-        <w:rPr>
-          <w:rFonts w:ascii="Times New Roman" w:hAnsi="Times New Roman"/>
-          <w:color w:val="0F172A"/>
-          <w:sz w:val="24"/>
-        </w:rPr>
-        <w:t>सेवा</w:t>
-      </w:r>
-      <w:r>
-        <w:rPr>
-          <w:rFonts w:ascii="Times New Roman" w:hAnsi="Times New Roman"/>
-          <w:color w:val="0F172A"/>
-          <w:sz w:val="24"/>
-        </w:rPr>
-        <w:t xml:space="preserve"> </w:t>
-      </w:r>
-      <w:r>
-        <w:rPr>
-          <w:rFonts w:ascii="Times New Roman" w:hAnsi="Times New Roman"/>
-          <w:color w:val="0F172A"/>
-          <w:sz w:val="24"/>
-        </w:rPr>
-        <w:t>केंद्र</w:t>
-      </w:r>
-      <w:r>
-        <w:rPr>
-          <w:rFonts w:ascii="Times New Roman" w:hAnsi="Times New Roman"/>
-          <w:color w:val="0F172A"/>
-          <w:sz w:val="24"/>
-        </w:rPr>
-        <w:t>): Agricultural retailers frequently supply seeds, fertilizers, and pesticides to farmers on credit against upcoming crop harvests. VernaLedger-AI tracks seasonal credit ledgers, categorizes pesticide batch numbers, and alerts farmers of payment due dates via vernacular WhatsApp messages, reducing default risks.</w:t>
+        <w:t>Agricultural Input &amp; Fertilizer Depots (कृषी सेवा केंद्र): Agricultural retailers frequently supply seeds, fertilizers, and pesticides to farmers on credit against upcoming crop harvests. VernaLedger-AI tracks seasonal credit ledgers, categorizes pesticide batch numbers, and alerts farmers of payment due dates via vernacular WhatsApp messages, reducing default risks.</w:t>
       </w:r>
     </w:p>
     <w:p>
@@ -8323,7 +6792,7 @@
           <w:color w:val="0F172A"/>
           <w:sz w:val="24"/>
         </w:rPr>
-        <w:t>Hardware, Electrical &amp; Construction Material Outlets (</w:t>
+        <w:t xml:space="preserve">Hardware, Electrical &amp; Construction Material Outlets (हार्डवेअर आणि सिमेंट दुकान): Hardware stores deal in thousands of small items with complex vernacular names (उदा. एल्बो, बुश, पीव्हीसी </w:t>
       </w:r>
       <w:r>
         <w:rPr>
@@ -8331,176 +6800,8 @@
           <w:color w:val="0F172A"/>
           <w:sz w:val="24"/>
         </w:rPr>
-        <w:t>हार्डवेअर</w:t>
-      </w:r>
-      <w:r>
-        <w:rPr>
-          <w:rFonts w:ascii="Times New Roman" w:hAnsi="Times New Roman"/>
-          <w:color w:val="0F172A"/>
-          <w:sz w:val="24"/>
-        </w:rPr>
-        <w:t xml:space="preserve"> </w:t>
-      </w:r>
-      <w:r>
-        <w:rPr>
-          <w:rFonts w:ascii="Times New Roman" w:hAnsi="Times New Roman"/>
-          <w:color w:val="0F172A"/>
-          <w:sz w:val="24"/>
-        </w:rPr>
-        <w:t>आणि</w:t>
-      </w:r>
-      <w:r>
-        <w:rPr>
-          <w:rFonts w:ascii="Times New Roman" w:hAnsi="Times New Roman"/>
-          <w:color w:val="0F172A"/>
-          <w:sz w:val="24"/>
-        </w:rPr>
-        <w:t xml:space="preserve"> </w:t>
-      </w:r>
-      <w:r>
-        <w:rPr>
-          <w:rFonts w:ascii="Times New Roman" w:hAnsi="Times New Roman"/>
-          <w:color w:val="0F172A"/>
-          <w:sz w:val="24"/>
-        </w:rPr>
-        <w:t>सिमेंट</w:t>
-      </w:r>
-      <w:r>
-        <w:rPr>
-          <w:rFonts w:ascii="Times New Roman" w:hAnsi="Times New Roman"/>
-          <w:color w:val="0F172A"/>
-          <w:sz w:val="24"/>
-        </w:rPr>
-        <w:t xml:space="preserve"> </w:t>
-      </w:r>
-      <w:r>
-        <w:rPr>
-          <w:rFonts w:ascii="Times New Roman" w:hAnsi="Times New Roman"/>
-          <w:color w:val="0F172A"/>
-          <w:sz w:val="24"/>
-        </w:rPr>
-        <w:t>दुकान</w:t>
-      </w:r>
-      <w:r>
-        <w:rPr>
-          <w:rFonts w:ascii="Times New Roman" w:hAnsi="Times New Roman"/>
-          <w:color w:val="0F172A"/>
-          <w:sz w:val="24"/>
-        </w:rPr>
-        <w:t>): Hardware stores deal in thousands of small items with complex vernacular names (</w:t>
-      </w:r>
-      <w:r>
-        <w:rPr>
-          <w:rFonts w:ascii="Times New Roman" w:hAnsi="Times New Roman"/>
-          <w:color w:val="0F172A"/>
-          <w:sz w:val="24"/>
-        </w:rPr>
-        <w:t>उदा</w:t>
-      </w:r>
-      <w:r>
-        <w:rPr>
-          <w:rFonts w:ascii="Times New Roman" w:hAnsi="Times New Roman"/>
-          <w:color w:val="0F172A"/>
-          <w:sz w:val="24"/>
-        </w:rPr>
-        <w:t xml:space="preserve">. </w:t>
-      </w:r>
-      <w:r>
-        <w:rPr>
-          <w:rFonts w:ascii="Times New Roman" w:hAnsi="Times New Roman"/>
-          <w:color w:val="0F172A"/>
-          <w:sz w:val="24"/>
-        </w:rPr>
-        <w:t>एल्बो</w:t>
-      </w:r>
-      <w:r>
-        <w:rPr>
-          <w:rFonts w:ascii="Times New Roman" w:hAnsi="Times New Roman"/>
-          <w:color w:val="0F172A"/>
-          <w:sz w:val="24"/>
-        </w:rPr>
-        <w:t xml:space="preserve">, </w:t>
-      </w:r>
-      <w:r>
-        <w:rPr>
-          <w:rFonts w:ascii="Times New Roman" w:hAnsi="Times New Roman"/>
-          <w:color w:val="0F172A"/>
-          <w:sz w:val="24"/>
-        </w:rPr>
-        <w:t>बुश</w:t>
-      </w:r>
-      <w:r>
-        <w:rPr>
-          <w:rFonts w:ascii="Times New Roman" w:hAnsi="Times New Roman"/>
-          <w:color w:val="0F172A"/>
-          <w:sz w:val="24"/>
-        </w:rPr>
-        <w:t xml:space="preserve">, </w:t>
-      </w:r>
-      <w:r>
-        <w:rPr>
-          <w:rFonts w:ascii="Times New Roman" w:hAnsi="Times New Roman"/>
-          <w:color w:val="0F172A"/>
-          <w:sz w:val="24"/>
-        </w:rPr>
-        <w:t>पीव्हीसी</w:t>
-      </w:r>
-      <w:r>
-        <w:rPr>
-          <w:rFonts w:ascii="Times New Roman" w:hAnsi="Times New Roman"/>
-          <w:color w:val="0F172A"/>
-          <w:sz w:val="24"/>
-        </w:rPr>
-        <w:t xml:space="preserve"> </w:t>
-      </w:r>
-      <w:r>
-        <w:rPr>
-          <w:rFonts w:ascii="Times New Roman" w:hAnsi="Times New Roman"/>
-          <w:color w:val="0F172A"/>
-          <w:sz w:val="24"/>
-        </w:rPr>
         <w:lastRenderedPageBreak/>
-        <w:t>पाईप</w:t>
-      </w:r>
-      <w:r>
-        <w:rPr>
-          <w:rFonts w:ascii="Times New Roman" w:hAnsi="Times New Roman"/>
-          <w:color w:val="0F172A"/>
-          <w:sz w:val="24"/>
-        </w:rPr>
-        <w:t xml:space="preserve">, </w:t>
-      </w:r>
-      <w:r>
-        <w:rPr>
-          <w:rFonts w:ascii="Times New Roman" w:hAnsi="Times New Roman"/>
-          <w:color w:val="0F172A"/>
-          <w:sz w:val="24"/>
-        </w:rPr>
-        <w:t>सिमेंट</w:t>
-      </w:r>
-      <w:r>
-        <w:rPr>
-          <w:rFonts w:ascii="Times New Roman" w:hAnsi="Times New Roman"/>
-          <w:color w:val="0F172A"/>
-          <w:sz w:val="24"/>
-        </w:rPr>
-        <w:t xml:space="preserve"> </w:t>
-      </w:r>
-      <w:r>
-        <w:rPr>
-          <w:rFonts w:ascii="Times New Roman" w:hAnsi="Times New Roman"/>
-          <w:color w:val="0F172A"/>
-          <w:sz w:val="24"/>
-        </w:rPr>
-        <w:t>पोती</w:t>
-      </w:r>
-      <w:r>
-        <w:rPr>
-          <w:rFonts w:ascii="Times New Roman" w:hAnsi="Times New Roman"/>
-          <w:color w:val="0F172A"/>
-          <w:sz w:val="24"/>
-        </w:rPr>
-        <w:t>). Shopkeepers use voice queries to instantly check inventory availability and outstanding contractor balances without walking away from the service counter, saving 50 minutes per day.</w:t>
+        <w:t>पाईप, सिमेंट पोती). Shopkeepers use voice queries to instantly check inventory availability and outstanding contractor balances without walking away from the service counter, saving 50 minutes per day.</w:t>
       </w:r>
     </w:p>
     <w:p>
@@ -8524,55 +6825,7 @@
           <w:color w:val="0F172A"/>
           <w:sz w:val="24"/>
         </w:rPr>
-        <w:t>Neighborhood Medical &amp; Pharmacy Retailers (</w:t>
-      </w:r>
-      <w:r>
-        <w:rPr>
-          <w:rFonts w:ascii="Times New Roman" w:hAnsi="Times New Roman"/>
-          <w:color w:val="0F172A"/>
-          <w:sz w:val="24"/>
-        </w:rPr>
-        <w:t>औषध</w:t>
-      </w:r>
-      <w:r>
-        <w:rPr>
-          <w:rFonts w:ascii="Times New Roman" w:hAnsi="Times New Roman"/>
-          <w:color w:val="0F172A"/>
-          <w:sz w:val="24"/>
-        </w:rPr>
-        <w:t xml:space="preserve"> </w:t>
-      </w:r>
-      <w:r>
-        <w:rPr>
-          <w:rFonts w:ascii="Times New Roman" w:hAnsi="Times New Roman"/>
-          <w:color w:val="0F172A"/>
-          <w:sz w:val="24"/>
-        </w:rPr>
-        <w:t>दुकान</w:t>
-      </w:r>
-      <w:r>
-        <w:rPr>
-          <w:rFonts w:ascii="Times New Roman" w:hAnsi="Times New Roman"/>
-          <w:color w:val="0F172A"/>
-          <w:sz w:val="24"/>
-        </w:rPr>
-        <w:t xml:space="preserve"> / </w:t>
-      </w:r>
-      <w:r>
-        <w:rPr>
-          <w:rFonts w:ascii="Times New Roman" w:hAnsi="Times New Roman"/>
-          <w:color w:val="0F172A"/>
-          <w:sz w:val="24"/>
-        </w:rPr>
-        <w:t>केमिस्ट</w:t>
-      </w:r>
-      <w:r>
-        <w:rPr>
-          <w:rFonts w:ascii="Times New Roman" w:hAnsi="Times New Roman"/>
-          <w:color w:val="0F172A"/>
-          <w:sz w:val="24"/>
-        </w:rPr>
-        <w:t>): Enables quick transcription of doctor chits and prescription notes, maintains credit records for chronic patients, and triggers automatic WhatsApp balance updates upon medicine delivery, cutting daily ledger reconciliation time by 60 minutes.</w:t>
+        <w:t>Neighborhood Medical &amp; Pharmacy Retailers (औषध दुकान / केमिस्ट): Enables quick transcription of doctor chits and prescription notes, maintains credit records for chronic patients, and triggers automatic WhatsApp balance updates upon medicine delivery, cutting daily ledger reconciliation time by 60 minutes.</w:t>
       </w:r>
     </w:p>
     <w:p>
@@ -8596,71 +6849,7 @@
           <w:color w:val="0F172A"/>
           <w:sz w:val="24"/>
         </w:rPr>
-        <w:t>Garment, Textile &amp; Footwear Retailers (</w:t>
-      </w:r>
-      <w:r>
-        <w:rPr>
-          <w:rFonts w:ascii="Times New Roman" w:hAnsi="Times New Roman"/>
-          <w:color w:val="0F172A"/>
-          <w:sz w:val="24"/>
-        </w:rPr>
-        <w:t>कापड</w:t>
-      </w:r>
-      <w:r>
-        <w:rPr>
-          <w:rFonts w:ascii="Times New Roman" w:hAnsi="Times New Roman"/>
-          <w:color w:val="0F172A"/>
-          <w:sz w:val="24"/>
-        </w:rPr>
-        <w:t xml:space="preserve"> </w:t>
-      </w:r>
-      <w:r>
-        <w:rPr>
-          <w:rFonts w:ascii="Times New Roman" w:hAnsi="Times New Roman"/>
-          <w:color w:val="0F172A"/>
-          <w:sz w:val="24"/>
-        </w:rPr>
-        <w:t>आणि</w:t>
-      </w:r>
-      <w:r>
-        <w:rPr>
-          <w:rFonts w:ascii="Times New Roman" w:hAnsi="Times New Roman"/>
-          <w:color w:val="0F172A"/>
-          <w:sz w:val="24"/>
-        </w:rPr>
-        <w:t xml:space="preserve"> </w:t>
-      </w:r>
-      <w:r>
-        <w:rPr>
-          <w:rFonts w:ascii="Times New Roman" w:hAnsi="Times New Roman"/>
-          <w:color w:val="0F172A"/>
-          <w:sz w:val="24"/>
-        </w:rPr>
-        <w:t>पादत्राणे</w:t>
-      </w:r>
-      <w:r>
-        <w:rPr>
-          <w:rFonts w:ascii="Times New Roman" w:hAnsi="Times New Roman"/>
-          <w:color w:val="0F172A"/>
-          <w:sz w:val="24"/>
-        </w:rPr>
-        <w:t xml:space="preserve"> </w:t>
-      </w:r>
-      <w:r>
-        <w:rPr>
-          <w:rFonts w:ascii="Times New Roman" w:hAnsi="Times New Roman"/>
-          <w:color w:val="0F172A"/>
-          <w:sz w:val="24"/>
-        </w:rPr>
-        <w:t>दुकान</w:t>
-      </w:r>
-      <w:r>
-        <w:rPr>
-          <w:rFonts w:ascii="Times New Roman" w:hAnsi="Times New Roman"/>
-          <w:color w:val="0F172A"/>
-          <w:sz w:val="24"/>
-        </w:rPr>
-        <w:t>): Manages seasonal festival credit accounts, tracks customer size and preference notes, and automates payment settlement receipts.</w:t>
+        <w:t>Garment, Textile &amp; Footwear Retailers (कापड आणि पादत्राणे दुकान): Manages seasonal festival credit accounts, tracks customer size and preference notes, and automates payment settlement receipts.</w:t>
       </w:r>
     </w:p>
     <w:p>
@@ -9508,15 +7697,7 @@
           <w:color w:val="0F172A"/>
           <w:sz w:val="24"/>
         </w:rPr>
-        <w:t>A progressive, mobile-first single page web application (SPA) built using modern vanilla ES6+ JavaScript, HTML5 Canvas, and advanced CSS3. It features an Eye-Comfort Kirana Mode (Light Theme) specifically calibrated for outdoor counter sunlight with warm slate tones and pastel cards, alongside an immersive Cyberpunk Dark Mode. Client-side audio is captured via the HTML5 Web Audio API using the low-latency MediaStream Recording API (WebM/Opus encoding). Image capture utilizes HTML5 File and Camera Capture AP</w:t>
-      </w:r>
-      <w:r>
-        <w:rPr>
-          <w:rFonts w:ascii="Times New Roman" w:hAnsi="Times New Roman"/>
-          <w:color w:val="0F172A"/>
-          <w:sz w:val="24"/>
-        </w:rPr>
-        <w:t>Is with canvas compression.</w:t>
+        <w:t>A progressive, mobile-first single page web application (SPA) built using modern vanilla ES6+ JavaScript, HTML5 Canvas, and advanced CSS3. It features an Eye-Comfort Kirana Mode (Light Theme) specifically calibrated for outdoor counter sunlight with warm slate tones and pastel cards, alongside an immersive Cyberpunk Dark Mode. Client-side audio is captured via the HTML5 Web Audio API using the low-latency MediaStream Recording API (WebM/Opus encoding). Image capture utilizes HTML5 File and Camera Capture APIs with canvas compression.</w:t>
       </w:r>
     </w:p>
     <w:p>
@@ -10339,15 +8520,7 @@
           <w:color w:val="0F172A"/>
           <w:sz w:val="24"/>
         </w:rPr>
-        <w:t xml:space="preserve">In retail ledger systems, financial integrity is paramount. If a network interruption occurs halfway through processing a 10-item receipt, the database must never leave partial balances or orphaned ledger entries. SQLite's Write-Ahead Logging (WAL) ensures that readers do not block writers and writers do not block readers. When a credit entry of ₹1,450 is committed, the transaction table insert and customer balance update occur within a single atomic BEGIN IMMEDIATE ... COMMIT block. If any step fails, the </w:t>
-      </w:r>
-      <w:r>
-        <w:rPr>
-          <w:rFonts w:ascii="Times New Roman" w:hAnsi="Times New Roman"/>
-          <w:color w:val="0F172A"/>
-          <w:sz w:val="24"/>
-        </w:rPr>
-        <w:t>entire transaction is rolled back, guaranteeing absolute data consistency.</w:t>
+        <w:t>In retail ledger systems, financial integrity is paramount. If a network interruption occurs halfway through processing a 10-item receipt, the database must never leave partial balances or orphaned ledger entries. SQLite's Write-Ahead Logging (WAL) ensures that readers do not block writers and writers do not block readers. When a credit entry of ₹1,450 is committed, the transaction table insert and customer balance update occur within a single atomic BEGIN IMMEDIATE ... COMMIT block. If any step fails, the entire transaction is rolled back, guaranteeing absolute data consistency.</w:t>
       </w:r>
     </w:p>
     <w:p>
@@ -11431,6 +9604,7 @@
         <w:jc w:val="both"/>
       </w:pPr>
       <w:r>
+        <w:lastRenderedPageBreak/>
         <w:t>4. Neural Text Response (Verna AI): The LLM executes contextual reasoning over live SQLite tables, generating concise, factual 1-2 sentence replies (e.g., 'आजची एकूण विक्री ₹५,४००.०० आहे.') in under 1.2 seconds with sub-15ms instant in-memory dispatch.</w:t>
       </w:r>
     </w:p>
@@ -11532,135 +9706,7 @@
           <w:color w:val="0F172A"/>
           <w:sz w:val="24"/>
         </w:rPr>
-        <w:t>If the Gemini vision engine detects an unreadable receipt (confidence &lt; 0.60), the client UI immediately displays a polite Marathi prompt ('</w:t>
-      </w:r>
-      <w:r>
-        <w:rPr>
-          <w:rFonts w:ascii="Times New Roman" w:hAnsi="Times New Roman"/>
-          <w:color w:val="0F172A"/>
-          <w:sz w:val="24"/>
-        </w:rPr>
-        <w:t>कृपया</w:t>
-      </w:r>
-      <w:r>
-        <w:rPr>
-          <w:rFonts w:ascii="Times New Roman" w:hAnsi="Times New Roman"/>
-          <w:color w:val="0F172A"/>
-          <w:sz w:val="24"/>
-        </w:rPr>
-        <w:t xml:space="preserve"> </w:t>
-      </w:r>
-      <w:r>
-        <w:rPr>
-          <w:rFonts w:ascii="Times New Roman" w:hAnsi="Times New Roman"/>
-          <w:color w:val="0F172A"/>
-          <w:sz w:val="24"/>
-        </w:rPr>
-        <w:t>पावतीवर</w:t>
-      </w:r>
-      <w:r>
-        <w:rPr>
-          <w:rFonts w:ascii="Times New Roman" w:hAnsi="Times New Roman"/>
-          <w:color w:val="0F172A"/>
-          <w:sz w:val="24"/>
-        </w:rPr>
-        <w:t xml:space="preserve"> </w:t>
-      </w:r>
-      <w:r>
-        <w:rPr>
-          <w:rFonts w:ascii="Times New Roman" w:hAnsi="Times New Roman"/>
-          <w:color w:val="0F172A"/>
-          <w:sz w:val="24"/>
-        </w:rPr>
-        <w:t>व्यवस्थित</w:t>
-      </w:r>
-      <w:r>
-        <w:rPr>
-          <w:rFonts w:ascii="Times New Roman" w:hAnsi="Times New Roman"/>
-          <w:color w:val="0F172A"/>
-          <w:sz w:val="24"/>
-        </w:rPr>
-        <w:t xml:space="preserve"> </w:t>
-      </w:r>
-      <w:r>
-        <w:rPr>
-          <w:rFonts w:ascii="Times New Roman" w:hAnsi="Times New Roman"/>
-          <w:color w:val="0F172A"/>
-          <w:sz w:val="24"/>
-        </w:rPr>
-        <w:t>प्रकाश</w:t>
-      </w:r>
-      <w:r>
-        <w:rPr>
-          <w:rFonts w:ascii="Times New Roman" w:hAnsi="Times New Roman"/>
-          <w:color w:val="0F172A"/>
-          <w:sz w:val="24"/>
-        </w:rPr>
-        <w:t xml:space="preserve"> </w:t>
-      </w:r>
-      <w:r>
-        <w:rPr>
-          <w:rFonts w:ascii="Times New Roman" w:hAnsi="Times New Roman"/>
-          <w:color w:val="0F172A"/>
-          <w:sz w:val="24"/>
-        </w:rPr>
-        <w:t>ठेवून</w:t>
-      </w:r>
-      <w:r>
-        <w:rPr>
-          <w:rFonts w:ascii="Times New Roman" w:hAnsi="Times New Roman"/>
-          <w:color w:val="0F172A"/>
-          <w:sz w:val="24"/>
-        </w:rPr>
-        <w:t xml:space="preserve"> </w:t>
-      </w:r>
-      <w:r>
-        <w:rPr>
-          <w:rFonts w:ascii="Times New Roman" w:hAnsi="Times New Roman"/>
-          <w:color w:val="0F172A"/>
-          <w:sz w:val="24"/>
-        </w:rPr>
-        <w:t>पुन्हा</w:t>
-      </w:r>
-      <w:r>
-        <w:rPr>
-          <w:rFonts w:ascii="Times New Roman" w:hAnsi="Times New Roman"/>
-          <w:color w:val="0F172A"/>
-          <w:sz w:val="24"/>
-        </w:rPr>
-        <w:t xml:space="preserve"> </w:t>
-      </w:r>
-      <w:r>
-        <w:rPr>
-          <w:rFonts w:ascii="Times New Roman" w:hAnsi="Times New Roman"/>
-          <w:color w:val="0F172A"/>
-          <w:sz w:val="24"/>
-        </w:rPr>
-        <w:t>फोटो</w:t>
-      </w:r>
-      <w:r>
-        <w:rPr>
-          <w:rFonts w:ascii="Times New Roman" w:hAnsi="Times New Roman"/>
-          <w:color w:val="0F172A"/>
-          <w:sz w:val="24"/>
-        </w:rPr>
-        <w:t xml:space="preserve"> </w:t>
-      </w:r>
-      <w:r>
-        <w:rPr>
-          <w:rFonts w:ascii="Times New Roman" w:hAnsi="Times New Roman"/>
-          <w:color w:val="0F172A"/>
-          <w:sz w:val="24"/>
-        </w:rPr>
-        <w:t>घ्या</w:t>
-      </w:r>
-      <w:r>
-        <w:rPr>
-          <w:rFonts w:ascii="Times New Roman" w:hAnsi="Times New Roman"/>
-          <w:color w:val="0F172A"/>
-          <w:sz w:val="24"/>
-        </w:rPr>
-        <w:t>') without crashing.</w:t>
+        <w:t>If the Gemini vision engine detects an unreadable receipt (confidence &lt; 0.60), the client UI immediately displays a polite Marathi prompt ('कृपया पावतीवर व्यवस्थित प्रकाश ठेवून पुन्हा फोटो घ्या') without crashing.</w:t>
       </w:r>
     </w:p>
     <w:p>
@@ -11708,119 +9754,7 @@
           <w:color w:val="0F172A"/>
           <w:sz w:val="24"/>
         </w:rPr>
-        <w:t>Commonly repeated voice phrases (</w:t>
-      </w:r>
-      <w:r>
-        <w:rPr>
-          <w:rFonts w:ascii="Times New Roman" w:hAnsi="Times New Roman"/>
-          <w:color w:val="0F172A"/>
-          <w:sz w:val="24"/>
-        </w:rPr>
-        <w:t>उदा</w:t>
-      </w:r>
-      <w:r>
-        <w:rPr>
-          <w:rFonts w:ascii="Times New Roman" w:hAnsi="Times New Roman"/>
-          <w:color w:val="0F172A"/>
-          <w:sz w:val="24"/>
-        </w:rPr>
-        <w:t>. '</w:t>
-      </w:r>
-      <w:r>
-        <w:rPr>
-          <w:rFonts w:ascii="Times New Roman" w:hAnsi="Times New Roman"/>
-          <w:color w:val="0F172A"/>
-          <w:sz w:val="24"/>
-        </w:rPr>
-        <w:t>उधारी</w:t>
-      </w:r>
-      <w:r>
-        <w:rPr>
-          <w:rFonts w:ascii="Times New Roman" w:hAnsi="Times New Roman"/>
-          <w:color w:val="0F172A"/>
-          <w:sz w:val="24"/>
-        </w:rPr>
-        <w:t xml:space="preserve"> </w:t>
-      </w:r>
-      <w:r>
-        <w:rPr>
-          <w:rFonts w:ascii="Times New Roman" w:hAnsi="Times New Roman"/>
-          <w:color w:val="0F172A"/>
-          <w:sz w:val="24"/>
-        </w:rPr>
-        <w:t>जमा</w:t>
-      </w:r>
-      <w:r>
-        <w:rPr>
-          <w:rFonts w:ascii="Times New Roman" w:hAnsi="Times New Roman"/>
-          <w:color w:val="0F172A"/>
-          <w:sz w:val="24"/>
-        </w:rPr>
-        <w:t xml:space="preserve"> </w:t>
-      </w:r>
-      <w:r>
-        <w:rPr>
-          <w:rFonts w:ascii="Times New Roman" w:hAnsi="Times New Roman"/>
-          <w:color w:val="0F172A"/>
-          <w:sz w:val="24"/>
-        </w:rPr>
-        <w:t>झाली</w:t>
-      </w:r>
-      <w:r>
-        <w:rPr>
-          <w:rFonts w:ascii="Times New Roman" w:hAnsi="Times New Roman"/>
-          <w:color w:val="0F172A"/>
-          <w:sz w:val="24"/>
-        </w:rPr>
-        <w:t>', '</w:t>
-      </w:r>
-      <w:r>
-        <w:rPr>
-          <w:rFonts w:ascii="Times New Roman" w:hAnsi="Times New Roman"/>
-          <w:color w:val="0F172A"/>
-          <w:sz w:val="24"/>
-        </w:rPr>
-        <w:t>बैलन्स</w:t>
-      </w:r>
-      <w:r>
-        <w:rPr>
-          <w:rFonts w:ascii="Times New Roman" w:hAnsi="Times New Roman"/>
-          <w:color w:val="0F172A"/>
-          <w:sz w:val="24"/>
-        </w:rPr>
-        <w:t xml:space="preserve"> </w:t>
-      </w:r>
-      <w:r>
-        <w:rPr>
-          <w:rFonts w:ascii="Times New Roman" w:hAnsi="Times New Roman"/>
-          <w:color w:val="0F172A"/>
-          <w:sz w:val="24"/>
-        </w:rPr>
-        <w:t>अपडेट</w:t>
-      </w:r>
-      <w:r>
-        <w:rPr>
-          <w:rFonts w:ascii="Times New Roman" w:hAnsi="Times New Roman"/>
-          <w:color w:val="0F172A"/>
-          <w:sz w:val="24"/>
-        </w:rPr>
-        <w:t xml:space="preserve"> </w:t>
-      </w:r>
-      <w:r>
-        <w:rPr>
-          <w:rFonts w:ascii="Times New Roman" w:hAnsi="Times New Roman"/>
-          <w:color w:val="0F172A"/>
-          <w:sz w:val="24"/>
-        </w:rPr>
-        <w:t>झाला</w:t>
-      </w:r>
-      <w:r>
-        <w:rPr>
-          <w:rFonts w:ascii="Times New Roman" w:hAnsi="Times New Roman"/>
-          <w:color w:val="0F172A"/>
-          <w:sz w:val="24"/>
-        </w:rPr>
-        <w:t>') are cached locally as Web Audio ArrayBuffers, enabling instantaneous offline voice feedback.</w:t>
+        <w:t>Commonly repeated voice phrases (उदा. 'उधारी जमा झाली', 'बैलन्स अपडेट झाला') are cached locally as Web Audio ArrayBuffers, enabling instantaneous offline voice feedback.</w:t>
       </w:r>
     </w:p>
     <w:p>
@@ -13184,15 +11118,7 @@
           <w:color w:val="0F172A"/>
           <w:sz w:val="24"/>
         </w:rPr>
-        <w:t>To rigorously quantify the technological advantage of native multimodal vision LLMs, an ablation benchmark was conducted on the same 250 handwritten Devanagari slips comparing Gemini Flash Lite against Tesseract 5.3 (with LSTM trained on Devanagari) and EasyOCR (ResNet + BiLSTM + CTC). Tesseract attained only 49.2% word accuracy, frequently fragmenting connected conjuncts and omitting unlinked vowel diacritics. EasyOCR achieved 63.8% word accuracy but failed completely in aligning numbers to item names acro</w:t>
-      </w:r>
-      <w:r>
-        <w:rPr>
-          <w:rFonts w:ascii="Times New Roman" w:hAnsi="Times New Roman"/>
-          <w:color w:val="0F172A"/>
-          <w:sz w:val="24"/>
-        </w:rPr>
-        <w:t>ss creased lines. In contrast, Google Gemini Vision achieved 92.3% word accuracy and 95.1% mathematical total alignment, demonstrating that joint visual-semantic transformer embeddings resolve ambiguities that traditional character-segmentation algorithms cannot overcome.</w:t>
+        <w:t>To rigorously quantify the technological advantage of native multimodal vision LLMs, an ablation benchmark was conducted on the same 250 handwritten Devanagari slips comparing Gemini Flash Lite against Tesseract 5.3 (with LSTM trained on Devanagari) and EasyOCR (ResNet + BiLSTM + CTC). Tesseract attained only 49.2% word accuracy, frequently fragmenting connected conjuncts and omitting unlinked vowel diacritics. EasyOCR achieved 63.8% word accuracy but failed completely in aligning numbers to item names across creased lines. In contrast, Google Gemini Vision achieved 92.3% word accuracy and 95.1% mathematical total alignment, demonstrating that joint visual-semantic transformer embeddings resolve ambiguities that traditional character-segmentation algorithms cannot overcome.</w:t>
       </w:r>
     </w:p>
     <w:p>
@@ -15150,247 +13076,7 @@
           <w:color w:val="0F172A"/>
           <w:sz w:val="24"/>
         </w:rPr>
-        <w:t>Figure 4.1 showcases the live mobile-optimized Smart Multimodal OCR Scanner running live on the local host. A merchant photographs a handwritten Marathi receipt. The interface renders a live processing spinner while Google Gemini Vision analyzes the image. Within 1.8 seconds, the extracted line items (</w:t>
-      </w:r>
-      <w:r>
-        <w:rPr>
-          <w:rFonts w:ascii="Times New Roman" w:hAnsi="Times New Roman"/>
-          <w:color w:val="0F172A"/>
-          <w:sz w:val="24"/>
-        </w:rPr>
-        <w:t>उदा</w:t>
-      </w:r>
-      <w:r>
-        <w:rPr>
-          <w:rFonts w:ascii="Times New Roman" w:hAnsi="Times New Roman"/>
-          <w:color w:val="0F172A"/>
-          <w:sz w:val="24"/>
-        </w:rPr>
-        <w:t xml:space="preserve">. </w:t>
-      </w:r>
-      <w:r>
-        <w:rPr>
-          <w:rFonts w:ascii="Times New Roman" w:hAnsi="Times New Roman"/>
-          <w:color w:val="0F172A"/>
-          <w:sz w:val="24"/>
-        </w:rPr>
-        <w:t>तूर</w:t>
-      </w:r>
-      <w:r>
-        <w:rPr>
-          <w:rFonts w:ascii="Times New Roman" w:hAnsi="Times New Roman"/>
-          <w:color w:val="0F172A"/>
-          <w:sz w:val="24"/>
-        </w:rPr>
-        <w:t xml:space="preserve"> </w:t>
-      </w:r>
-      <w:r>
-        <w:rPr>
-          <w:rFonts w:ascii="Times New Roman" w:hAnsi="Times New Roman"/>
-          <w:color w:val="0F172A"/>
-          <w:sz w:val="24"/>
-        </w:rPr>
-        <w:t>डाळ</w:t>
-      </w:r>
-      <w:r>
-        <w:rPr>
-          <w:rFonts w:ascii="Times New Roman" w:hAnsi="Times New Roman"/>
-          <w:color w:val="0F172A"/>
-          <w:sz w:val="24"/>
-        </w:rPr>
-        <w:t xml:space="preserve"> </w:t>
-      </w:r>
-      <w:r>
-        <w:rPr>
-          <w:rFonts w:ascii="Times New Roman" w:hAnsi="Times New Roman"/>
-          <w:color w:val="0F172A"/>
-          <w:sz w:val="24"/>
-        </w:rPr>
-        <w:t>२</w:t>
-      </w:r>
-      <w:r>
-        <w:rPr>
-          <w:rFonts w:ascii="Times New Roman" w:hAnsi="Times New Roman"/>
-          <w:color w:val="0F172A"/>
-          <w:sz w:val="24"/>
-        </w:rPr>
-        <w:t xml:space="preserve"> </w:t>
-      </w:r>
-      <w:r>
-        <w:rPr>
-          <w:rFonts w:ascii="Times New Roman" w:hAnsi="Times New Roman"/>
-          <w:color w:val="0F172A"/>
-          <w:sz w:val="24"/>
-        </w:rPr>
-        <w:t>किलो</w:t>
-      </w:r>
-      <w:r>
-        <w:rPr>
-          <w:rFonts w:ascii="Times New Roman" w:hAnsi="Times New Roman"/>
-          <w:color w:val="0F172A"/>
-          <w:sz w:val="24"/>
-        </w:rPr>
-        <w:t xml:space="preserve"> ₹</w:t>
-      </w:r>
-      <w:r>
-        <w:rPr>
-          <w:rFonts w:ascii="Times New Roman" w:hAnsi="Times New Roman"/>
-          <w:color w:val="0F172A"/>
-          <w:sz w:val="24"/>
-        </w:rPr>
-        <w:t>३२०</w:t>
-      </w:r>
-      <w:r>
-        <w:rPr>
-          <w:rFonts w:ascii="Times New Roman" w:hAnsi="Times New Roman"/>
-          <w:color w:val="0F172A"/>
-          <w:sz w:val="24"/>
-        </w:rPr>
-        <w:t xml:space="preserve">, </w:t>
-      </w:r>
-      <w:r>
-        <w:rPr>
-          <w:rFonts w:ascii="Times New Roman" w:hAnsi="Times New Roman"/>
-          <w:color w:val="0F172A"/>
-          <w:sz w:val="24"/>
-        </w:rPr>
-        <w:t>साखर</w:t>
-      </w:r>
-      <w:r>
-        <w:rPr>
-          <w:rFonts w:ascii="Times New Roman" w:hAnsi="Times New Roman"/>
-          <w:color w:val="0F172A"/>
-          <w:sz w:val="24"/>
-        </w:rPr>
-        <w:t xml:space="preserve"> </w:t>
-      </w:r>
-      <w:r>
-        <w:rPr>
-          <w:rFonts w:ascii="Times New Roman" w:hAnsi="Times New Roman"/>
-          <w:color w:val="0F172A"/>
-          <w:sz w:val="24"/>
-        </w:rPr>
-        <w:t>५</w:t>
-      </w:r>
-      <w:r>
-        <w:rPr>
-          <w:rFonts w:ascii="Times New Roman" w:hAnsi="Times New Roman"/>
-          <w:color w:val="0F172A"/>
-          <w:sz w:val="24"/>
-        </w:rPr>
-        <w:t xml:space="preserve"> </w:t>
-      </w:r>
-      <w:r>
-        <w:rPr>
-          <w:rFonts w:ascii="Times New Roman" w:hAnsi="Times New Roman"/>
-          <w:color w:val="0F172A"/>
-          <w:sz w:val="24"/>
-        </w:rPr>
-        <w:t>किलो</w:t>
-      </w:r>
-      <w:r>
-        <w:rPr>
-          <w:rFonts w:ascii="Times New Roman" w:hAnsi="Times New Roman"/>
-          <w:color w:val="0F172A"/>
-          <w:sz w:val="24"/>
-        </w:rPr>
-        <w:t xml:space="preserve"> ₹</w:t>
-      </w:r>
-      <w:r>
-        <w:rPr>
-          <w:rFonts w:ascii="Times New Roman" w:hAnsi="Times New Roman"/>
-          <w:color w:val="0F172A"/>
-          <w:sz w:val="24"/>
-        </w:rPr>
-        <w:t>२१०</w:t>
-      </w:r>
-      <w:r>
-        <w:rPr>
-          <w:rFonts w:ascii="Times New Roman" w:hAnsi="Times New Roman"/>
-          <w:color w:val="0F172A"/>
-          <w:sz w:val="24"/>
-        </w:rPr>
-        <w:t xml:space="preserve">, </w:t>
-      </w:r>
-      <w:r>
-        <w:rPr>
-          <w:rFonts w:ascii="Times New Roman" w:hAnsi="Times New Roman"/>
-          <w:color w:val="0F172A"/>
-          <w:sz w:val="24"/>
-        </w:rPr>
-        <w:t>शेंगदाणा</w:t>
-      </w:r>
-      <w:r>
-        <w:rPr>
-          <w:rFonts w:ascii="Times New Roman" w:hAnsi="Times New Roman"/>
-          <w:color w:val="0F172A"/>
-          <w:sz w:val="24"/>
-        </w:rPr>
-        <w:t xml:space="preserve"> </w:t>
-      </w:r>
-      <w:r>
-        <w:rPr>
-          <w:rFonts w:ascii="Times New Roman" w:hAnsi="Times New Roman"/>
-          <w:color w:val="0F172A"/>
-          <w:sz w:val="24"/>
-        </w:rPr>
-        <w:t>तेल</w:t>
-      </w:r>
-      <w:r>
-        <w:rPr>
-          <w:rFonts w:ascii="Times New Roman" w:hAnsi="Times New Roman"/>
-          <w:color w:val="0F172A"/>
-          <w:sz w:val="24"/>
-        </w:rPr>
-        <w:t xml:space="preserve"> </w:t>
-      </w:r>
-      <w:r>
-        <w:rPr>
-          <w:rFonts w:ascii="Times New Roman" w:hAnsi="Times New Roman"/>
-          <w:color w:val="0F172A"/>
-          <w:sz w:val="24"/>
-        </w:rPr>
-        <w:t>१</w:t>
-      </w:r>
-      <w:r>
-        <w:rPr>
-          <w:rFonts w:ascii="Times New Roman" w:hAnsi="Times New Roman"/>
-          <w:color w:val="0F172A"/>
-          <w:sz w:val="24"/>
-        </w:rPr>
-        <w:t xml:space="preserve"> </w:t>
-      </w:r>
-      <w:r>
-        <w:rPr>
-          <w:rFonts w:ascii="Times New Roman" w:hAnsi="Times New Roman"/>
-          <w:color w:val="0F172A"/>
-          <w:sz w:val="24"/>
-        </w:rPr>
-        <w:t>लिटर</w:t>
-      </w:r>
-      <w:r>
-        <w:rPr>
-          <w:rFonts w:ascii="Times New Roman" w:hAnsi="Times New Roman"/>
-          <w:color w:val="0F172A"/>
-          <w:sz w:val="24"/>
-        </w:rPr>
-        <w:t xml:space="preserve"> ₹</w:t>
-      </w:r>
-      <w:r>
-        <w:rPr>
-          <w:rFonts w:ascii="Times New Roman" w:hAnsi="Times New Roman"/>
-          <w:color w:val="0F172A"/>
-          <w:sz w:val="24"/>
-        </w:rPr>
-        <w:t>१६०</w:t>
-      </w:r>
-      <w:r>
-        <w:rPr>
-          <w:rFonts w:ascii="Times New Roman" w:hAnsi="Times New Roman"/>
-          <w:color w:val="0F172A"/>
-          <w:sz w:val="24"/>
-        </w:rPr>
-        <w:t>) are parsed into an interactive editable table. The merchant can adjust quantities or prices if necessary and tap 'Confirm &amp; Post to Khata', permanently updating the customer's ledger.</w:t>
+        <w:t>Figure 4.1 showcases the live mobile-optimized Smart Multimodal OCR Scanner running live on the local host. A merchant photographs a handwritten Marathi receipt. The interface renders a live processing spinner while Google Gemini Vision analyzes the image. Within 1.8 seconds, the extracted line items (उदा. तूर डाळ २ किलो ₹३२०, साखर ५ किलो ₹२१०, शेंगदाणा तेल १ लिटर ₹१६०) are parsed into an interactive editable table. The merchant can adjust quantities or prices if necessary and tap 'Confirm &amp; Post to Khata', permanently updating the customer's ledger.</w:t>
       </w:r>
     </w:p>
     <w:p>
@@ -15489,199 +13175,7 @@
           <w:color w:val="0F172A"/>
           <w:sz w:val="24"/>
         </w:rPr>
-        <w:t>Figure 4.2 displays the live conversational vernacular voice chat interface on a mobile device. The merchant taps the microphone icon and asks: '</w:t>
-      </w:r>
-      <w:r>
-        <w:rPr>
-          <w:rFonts w:ascii="Times New Roman" w:hAnsi="Times New Roman"/>
-          <w:color w:val="0F172A"/>
-          <w:sz w:val="24"/>
-        </w:rPr>
-        <w:t>रमेशची</w:t>
-      </w:r>
-      <w:r>
-        <w:rPr>
-          <w:rFonts w:ascii="Times New Roman" w:hAnsi="Times New Roman"/>
-          <w:color w:val="0F172A"/>
-          <w:sz w:val="24"/>
-        </w:rPr>
-        <w:t xml:space="preserve"> </w:t>
-      </w:r>
-      <w:r>
-        <w:rPr>
-          <w:rFonts w:ascii="Times New Roman" w:hAnsi="Times New Roman"/>
-          <w:color w:val="0F172A"/>
-          <w:sz w:val="24"/>
-        </w:rPr>
-        <w:t>किती</w:t>
-      </w:r>
-      <w:r>
-        <w:rPr>
-          <w:rFonts w:ascii="Times New Roman" w:hAnsi="Times New Roman"/>
-          <w:color w:val="0F172A"/>
-          <w:sz w:val="24"/>
-        </w:rPr>
-        <w:t xml:space="preserve"> </w:t>
-      </w:r>
-      <w:r>
-        <w:rPr>
-          <w:rFonts w:ascii="Times New Roman" w:hAnsi="Times New Roman"/>
-          <w:color w:val="0F172A"/>
-          <w:sz w:val="24"/>
-        </w:rPr>
-        <w:t>उधारी</w:t>
-      </w:r>
-      <w:r>
-        <w:rPr>
-          <w:rFonts w:ascii="Times New Roman" w:hAnsi="Times New Roman"/>
-          <w:color w:val="0F172A"/>
-          <w:sz w:val="24"/>
-        </w:rPr>
-        <w:t xml:space="preserve"> </w:t>
-      </w:r>
-      <w:r>
-        <w:rPr>
-          <w:rFonts w:ascii="Times New Roman" w:hAnsi="Times New Roman"/>
-          <w:color w:val="0F172A"/>
-          <w:sz w:val="24"/>
-        </w:rPr>
-        <w:t>बाकी</w:t>
-      </w:r>
-      <w:r>
-        <w:rPr>
-          <w:rFonts w:ascii="Times New Roman" w:hAnsi="Times New Roman"/>
-          <w:color w:val="0F172A"/>
-          <w:sz w:val="24"/>
-        </w:rPr>
-        <w:t xml:space="preserve"> </w:t>
-      </w:r>
-      <w:r>
-        <w:rPr>
-          <w:rFonts w:ascii="Times New Roman" w:hAnsi="Times New Roman"/>
-          <w:color w:val="0F172A"/>
-          <w:sz w:val="24"/>
-        </w:rPr>
-        <w:t>आहे</w:t>
-      </w:r>
-      <w:r>
-        <w:rPr>
-          <w:rFonts w:ascii="Times New Roman" w:hAnsi="Times New Roman"/>
-          <w:color w:val="0F172A"/>
-          <w:sz w:val="24"/>
-        </w:rPr>
-        <w:t>?' (How much does Ramesh owe?). The RAG engine retrieves Ramesh's active balance from SQLite, the LLM drafts a polite Marathi response, and Microsoft Edge-TTS speaks: '</w:t>
-      </w:r>
-      <w:r>
-        <w:rPr>
-          <w:rFonts w:ascii="Times New Roman" w:hAnsi="Times New Roman"/>
-          <w:color w:val="0F172A"/>
-          <w:sz w:val="24"/>
-        </w:rPr>
-        <w:t>रमेशची</w:t>
-      </w:r>
-      <w:r>
-        <w:rPr>
-          <w:rFonts w:ascii="Times New Roman" w:hAnsi="Times New Roman"/>
-          <w:color w:val="0F172A"/>
-          <w:sz w:val="24"/>
-        </w:rPr>
-        <w:t xml:space="preserve"> </w:t>
-      </w:r>
-      <w:r>
-        <w:rPr>
-          <w:rFonts w:ascii="Times New Roman" w:hAnsi="Times New Roman"/>
-          <w:color w:val="0F172A"/>
-          <w:sz w:val="24"/>
-        </w:rPr>
-        <w:t>एकूण</w:t>
-      </w:r>
-      <w:r>
-        <w:rPr>
-          <w:rFonts w:ascii="Times New Roman" w:hAnsi="Times New Roman"/>
-          <w:color w:val="0F172A"/>
-          <w:sz w:val="24"/>
-        </w:rPr>
-        <w:t xml:space="preserve"> </w:t>
-      </w:r>
-      <w:r>
-        <w:rPr>
-          <w:rFonts w:ascii="Times New Roman" w:hAnsi="Times New Roman"/>
-          <w:color w:val="0F172A"/>
-          <w:sz w:val="24"/>
-        </w:rPr>
-        <w:t>उधारी</w:t>
-      </w:r>
-      <w:r>
-        <w:rPr>
-          <w:rFonts w:ascii="Times New Roman" w:hAnsi="Times New Roman"/>
-          <w:color w:val="0F172A"/>
-          <w:sz w:val="24"/>
-        </w:rPr>
-        <w:t xml:space="preserve"> </w:t>
-      </w:r>
-      <w:r>
-        <w:rPr>
-          <w:rFonts w:ascii="Times New Roman" w:hAnsi="Times New Roman"/>
-          <w:color w:val="0F172A"/>
-          <w:sz w:val="24"/>
-        </w:rPr>
-        <w:t>१४५०</w:t>
-      </w:r>
-      <w:r>
-        <w:rPr>
-          <w:rFonts w:ascii="Times New Roman" w:hAnsi="Times New Roman"/>
-          <w:color w:val="0F172A"/>
-          <w:sz w:val="24"/>
-        </w:rPr>
-        <w:t xml:space="preserve"> </w:t>
-      </w:r>
-      <w:r>
-        <w:rPr>
-          <w:rFonts w:ascii="Times New Roman" w:hAnsi="Times New Roman"/>
-          <w:color w:val="0F172A"/>
-          <w:sz w:val="24"/>
-        </w:rPr>
-        <w:t>रुपये</w:t>
-      </w:r>
-      <w:r>
-        <w:rPr>
-          <w:rFonts w:ascii="Times New Roman" w:hAnsi="Times New Roman"/>
-          <w:color w:val="0F172A"/>
-          <w:sz w:val="24"/>
-        </w:rPr>
-        <w:t xml:space="preserve"> </w:t>
-      </w:r>
-      <w:r>
-        <w:rPr>
-          <w:rFonts w:ascii="Times New Roman" w:hAnsi="Times New Roman"/>
-          <w:color w:val="0F172A"/>
-          <w:sz w:val="24"/>
-        </w:rPr>
-        <w:t>बाकी</w:t>
-      </w:r>
-      <w:r>
-        <w:rPr>
-          <w:rFonts w:ascii="Times New Roman" w:hAnsi="Times New Roman"/>
-          <w:color w:val="0F172A"/>
-          <w:sz w:val="24"/>
-        </w:rPr>
-        <w:t xml:space="preserve"> </w:t>
-      </w:r>
-      <w:r>
-        <w:rPr>
-          <w:rFonts w:ascii="Times New Roman" w:hAnsi="Times New Roman"/>
-          <w:color w:val="0F172A"/>
-          <w:sz w:val="24"/>
-        </w:rPr>
-        <w:t>आहे</w:t>
-      </w:r>
-      <w:r>
-        <w:rPr>
-          <w:rFonts w:ascii="Times New Roman" w:hAnsi="Times New Roman"/>
-          <w:color w:val="0F172A"/>
-          <w:sz w:val="24"/>
-        </w:rPr>
-        <w:t>.' A persistent floating audio controller allows the merchant to replay the speech with a single touch, perfectly suited for noisy environments.</w:t>
+        <w:t>Figure 4.2 displays the live conversational vernacular voice chat interface on a mobile device. The merchant taps the microphone icon and asks: 'रमेशची किती उधारी बाकी आहे?' (How much does Ramesh owe?). The RAG engine retrieves Ramesh's active balance from SQLite, the LLM drafts a polite Marathi response, and Microsoft Edge-TTS speaks: 'रमेशची एकूण उधारी १४५० रुपये बाकी आहे.' A persistent floating audio controller allows the merchant to replay the speech with a single touch, perfectly suited for noisy environments.</w:t>
       </w:r>
     </w:p>
     <w:p>
@@ -15879,279 +13373,7 @@
           <w:color w:val="0F172A"/>
           <w:sz w:val="24"/>
         </w:rPr>
-        <w:t>Figure 4.4 illustrates the live customer credit ledger (Khata) module. Each customer profile shows total credit balance, credit limit warning gauges, and an itemized transaction history. Clicking the green 'WhatsApp Reminder' button triggers a deep-link to WhatsApp Web or mobile WhatsApp, pre-populating a courteous Marathi reminder: '</w:t>
-      </w:r>
-      <w:r>
-        <w:rPr>
-          <w:rFonts w:ascii="Times New Roman" w:hAnsi="Times New Roman"/>
-          <w:color w:val="0F172A"/>
-          <w:sz w:val="24"/>
-        </w:rPr>
-        <w:t>नमस्कार</w:t>
-      </w:r>
-      <w:r>
-        <w:rPr>
-          <w:rFonts w:ascii="Times New Roman" w:hAnsi="Times New Roman"/>
-          <w:color w:val="0F172A"/>
-          <w:sz w:val="24"/>
-        </w:rPr>
-        <w:t xml:space="preserve"> </w:t>
-      </w:r>
-      <w:r>
-        <w:rPr>
-          <w:rFonts w:ascii="Times New Roman" w:hAnsi="Times New Roman"/>
-          <w:color w:val="0F172A"/>
-          <w:sz w:val="24"/>
-        </w:rPr>
-        <w:t>रमेशजी</w:t>
-      </w:r>
-      <w:r>
-        <w:rPr>
-          <w:rFonts w:ascii="Times New Roman" w:hAnsi="Times New Roman"/>
-          <w:color w:val="0F172A"/>
-          <w:sz w:val="24"/>
-        </w:rPr>
-        <w:t xml:space="preserve">, </w:t>
-      </w:r>
-      <w:r>
-        <w:rPr>
-          <w:rFonts w:ascii="Times New Roman" w:hAnsi="Times New Roman"/>
-          <w:color w:val="0F172A"/>
-          <w:sz w:val="24"/>
-        </w:rPr>
-        <w:t>आपले</w:t>
-      </w:r>
-      <w:r>
-        <w:rPr>
-          <w:rFonts w:ascii="Times New Roman" w:hAnsi="Times New Roman"/>
-          <w:color w:val="0F172A"/>
-          <w:sz w:val="24"/>
-        </w:rPr>
-        <w:t xml:space="preserve"> </w:t>
-      </w:r>
-      <w:r>
-        <w:rPr>
-          <w:rFonts w:ascii="Times New Roman" w:hAnsi="Times New Roman"/>
-          <w:color w:val="0F172A"/>
-          <w:sz w:val="24"/>
-        </w:rPr>
-        <w:t>श्री</w:t>
-      </w:r>
-      <w:r>
-        <w:rPr>
-          <w:rFonts w:ascii="Times New Roman" w:hAnsi="Times New Roman"/>
-          <w:color w:val="0F172A"/>
-          <w:sz w:val="24"/>
-        </w:rPr>
-        <w:t xml:space="preserve"> </w:t>
-      </w:r>
-      <w:r>
-        <w:rPr>
-          <w:rFonts w:ascii="Times New Roman" w:hAnsi="Times New Roman"/>
-          <w:color w:val="0F172A"/>
-          <w:sz w:val="24"/>
-        </w:rPr>
-        <w:t>कृपा</w:t>
-      </w:r>
-      <w:r>
-        <w:rPr>
-          <w:rFonts w:ascii="Times New Roman" w:hAnsi="Times New Roman"/>
-          <w:color w:val="0F172A"/>
-          <w:sz w:val="24"/>
-        </w:rPr>
-        <w:t xml:space="preserve"> </w:t>
-      </w:r>
-      <w:r>
-        <w:rPr>
-          <w:rFonts w:ascii="Times New Roman" w:hAnsi="Times New Roman"/>
-          <w:color w:val="0F172A"/>
-          <w:sz w:val="24"/>
-        </w:rPr>
-        <w:t>किराणामध्ये</w:t>
-      </w:r>
-      <w:r>
-        <w:rPr>
-          <w:rFonts w:ascii="Times New Roman" w:hAnsi="Times New Roman"/>
-          <w:color w:val="0F172A"/>
-          <w:sz w:val="24"/>
-        </w:rPr>
-        <w:t xml:space="preserve"> ₹</w:t>
-      </w:r>
-      <w:r>
-        <w:rPr>
-          <w:rFonts w:ascii="Times New Roman" w:hAnsi="Times New Roman"/>
-          <w:color w:val="0F172A"/>
-          <w:sz w:val="24"/>
-        </w:rPr>
-        <w:t>१</w:t>
-      </w:r>
-      <w:r>
-        <w:rPr>
-          <w:rFonts w:ascii="Times New Roman" w:hAnsi="Times New Roman"/>
-          <w:color w:val="0F172A"/>
-          <w:sz w:val="24"/>
-        </w:rPr>
-        <w:t>,</w:t>
-      </w:r>
-      <w:r>
-        <w:rPr>
-          <w:rFonts w:ascii="Times New Roman" w:hAnsi="Times New Roman"/>
-          <w:color w:val="0F172A"/>
-          <w:sz w:val="24"/>
-        </w:rPr>
-        <w:t>४५०</w:t>
-      </w:r>
-      <w:r>
-        <w:rPr>
-          <w:rFonts w:ascii="Times New Roman" w:hAnsi="Times New Roman"/>
-          <w:color w:val="0F172A"/>
-          <w:sz w:val="24"/>
-        </w:rPr>
-        <w:t xml:space="preserve"> </w:t>
-      </w:r>
-      <w:r>
-        <w:rPr>
-          <w:rFonts w:ascii="Times New Roman" w:hAnsi="Times New Roman"/>
-          <w:color w:val="0F172A"/>
-          <w:sz w:val="24"/>
-        </w:rPr>
-        <w:t>बाकी</w:t>
-      </w:r>
-      <w:r>
-        <w:rPr>
-          <w:rFonts w:ascii="Times New Roman" w:hAnsi="Times New Roman"/>
-          <w:color w:val="0F172A"/>
-          <w:sz w:val="24"/>
-        </w:rPr>
-        <w:t xml:space="preserve"> </w:t>
-      </w:r>
-      <w:r>
-        <w:rPr>
-          <w:rFonts w:ascii="Times New Roman" w:hAnsi="Times New Roman"/>
-          <w:color w:val="0F172A"/>
-          <w:sz w:val="24"/>
-        </w:rPr>
-        <w:t>आहेत</w:t>
-      </w:r>
-      <w:r>
-        <w:rPr>
-          <w:rFonts w:ascii="Times New Roman" w:hAnsi="Times New Roman"/>
-          <w:color w:val="0F172A"/>
-          <w:sz w:val="24"/>
-        </w:rPr>
-        <w:t xml:space="preserve">. </w:t>
-      </w:r>
-      <w:r>
-        <w:rPr>
-          <w:rFonts w:ascii="Times New Roman" w:hAnsi="Times New Roman"/>
-          <w:color w:val="0F172A"/>
-          <w:sz w:val="24"/>
-        </w:rPr>
-        <w:t>कृपया</w:t>
-      </w:r>
-      <w:r>
-        <w:rPr>
-          <w:rFonts w:ascii="Times New Roman" w:hAnsi="Times New Roman"/>
-          <w:color w:val="0F172A"/>
-          <w:sz w:val="24"/>
-        </w:rPr>
-        <w:t xml:space="preserve"> </w:t>
-      </w:r>
-      <w:r>
-        <w:rPr>
-          <w:rFonts w:ascii="Times New Roman" w:hAnsi="Times New Roman"/>
-          <w:color w:val="0F172A"/>
-          <w:sz w:val="24"/>
-        </w:rPr>
-        <w:t>खालील</w:t>
-      </w:r>
-      <w:r>
-        <w:rPr>
-          <w:rFonts w:ascii="Times New Roman" w:hAnsi="Times New Roman"/>
-          <w:color w:val="0F172A"/>
-          <w:sz w:val="24"/>
-        </w:rPr>
-        <w:t xml:space="preserve"> UPI </w:t>
-      </w:r>
-      <w:r>
-        <w:rPr>
-          <w:rFonts w:ascii="Times New Roman" w:hAnsi="Times New Roman"/>
-          <w:color w:val="0F172A"/>
-          <w:sz w:val="24"/>
-        </w:rPr>
-        <w:t>लिंकवर</w:t>
-      </w:r>
-      <w:r>
-        <w:rPr>
-          <w:rFonts w:ascii="Times New Roman" w:hAnsi="Times New Roman"/>
-          <w:color w:val="0F172A"/>
-          <w:sz w:val="24"/>
-        </w:rPr>
-        <w:t xml:space="preserve"> </w:t>
-      </w:r>
-      <w:r>
-        <w:rPr>
-          <w:rFonts w:ascii="Times New Roman" w:hAnsi="Times New Roman"/>
-          <w:color w:val="0F172A"/>
-          <w:sz w:val="24"/>
-        </w:rPr>
-        <w:t>क्लिक</w:t>
-      </w:r>
-      <w:r>
-        <w:rPr>
-          <w:rFonts w:ascii="Times New Roman" w:hAnsi="Times New Roman"/>
-          <w:color w:val="0F172A"/>
-          <w:sz w:val="24"/>
-        </w:rPr>
-        <w:t xml:space="preserve"> </w:t>
-      </w:r>
-      <w:r>
-        <w:rPr>
-          <w:rFonts w:ascii="Times New Roman" w:hAnsi="Times New Roman"/>
-          <w:color w:val="0F172A"/>
-          <w:sz w:val="24"/>
-        </w:rPr>
-        <w:t>करून</w:t>
-      </w:r>
-      <w:r>
-        <w:rPr>
-          <w:rFonts w:ascii="Times New Roman" w:hAnsi="Times New Roman"/>
-          <w:color w:val="0F172A"/>
-          <w:sz w:val="24"/>
-        </w:rPr>
-        <w:t xml:space="preserve"> </w:t>
-      </w:r>
-      <w:r>
-        <w:rPr>
-          <w:rFonts w:ascii="Times New Roman" w:hAnsi="Times New Roman"/>
-          <w:color w:val="0F172A"/>
-          <w:sz w:val="24"/>
-        </w:rPr>
-        <w:t>पेमेंट</w:t>
-      </w:r>
-      <w:r>
-        <w:rPr>
-          <w:rFonts w:ascii="Times New Roman" w:hAnsi="Times New Roman"/>
-          <w:color w:val="0F172A"/>
-          <w:sz w:val="24"/>
-        </w:rPr>
-        <w:t xml:space="preserve"> </w:t>
-      </w:r>
-      <w:r>
-        <w:rPr>
-          <w:rFonts w:ascii="Times New Roman" w:hAnsi="Times New Roman"/>
-          <w:color w:val="0F172A"/>
-          <w:sz w:val="24"/>
-        </w:rPr>
-        <w:t>करावे</w:t>
-      </w:r>
-      <w:r>
-        <w:rPr>
-          <w:rFonts w:ascii="Times New Roman" w:hAnsi="Times New Roman"/>
-          <w:color w:val="0F172A"/>
-          <w:sz w:val="24"/>
-        </w:rPr>
-        <w:t>: upi://pay?...' This depersonalizes debt collection and results in a 3.2x faster payment turnaround.</w:t>
+        <w:t>Figure 4.4 illustrates the live customer credit ledger (Khata) module. Each customer profile shows total credit balance, credit limit warning gauges, and an itemized transaction history. Clicking the green 'WhatsApp Reminder' button triggers a deep-link to WhatsApp Web or mobile WhatsApp, pre-populating a courteous Marathi reminder: 'नमस्कार रमेशजी, आपले श्री कृपा किराणामध्ये ₹१,४५० बाकी आहेत. कृपया खालील UPI लिंकवर क्लिक करून पेमेंट करावे: upi://pay?...' This depersonalizes debt collection and results in a 3.2x faster payment turnaround.</w:t>
       </w:r>
     </w:p>
     <w:p>
@@ -16477,15 +13699,7 @@
           <w:color w:val="0F172A"/>
           <w:sz w:val="24"/>
         </w:rPr>
-        <w:t xml:space="preserve">A critical engineering trial evaluated screen legibility under simulated midday outdoor sunlight (80,000 lux). Traditional dark-mode UI interfaces with deep black backgrounds (#0a0f1d) suffered from severe internal glass reflection, reducing effective perceptual contrast down to 1.8:1, rendering text virtually unreadable without cranking screen brightness to maximum (causing thermal battery throttling). In contrast, the Eye-Comfort Kirana Mode utilizes warm off-white canvas tones (#F8FAFC) paired with deep </w:t>
-      </w:r>
-      <w:r>
-        <w:rPr>
-          <w:rFonts w:ascii="Times New Roman" w:hAnsi="Times New Roman"/>
-          <w:color w:val="0F172A"/>
-          <w:sz w:val="24"/>
-        </w:rPr>
-        <w:t>charcoal text (#0F172A), maintaining an exceptional contrast ratio of 14.2:1 even under intense solar scattering. This enables shopkeepers to operate under outdoor canopies at 40% screen brightness, extending smartphone battery life by 3.5 hours per charge.</w:t>
+        <w:t>A critical engineering trial evaluated screen legibility under simulated midday outdoor sunlight (80,000 lux). Traditional dark-mode UI interfaces with deep black backgrounds (#0a0f1d) suffered from severe internal glass reflection, reducing effective perceptual contrast down to 1.8:1, rendering text virtually unreadable without cranking screen brightness to maximum (causing thermal battery throttling). In contrast, the Eye-Comfort Kirana Mode utilizes warm off-white canvas tones (#F8FAFC) paired with deep charcoal text (#0F172A), maintaining an exceptional contrast ratio of 14.2:1 even under intense solar scattering. This enables shopkeepers to operate under outdoor canopies at 40% screen brightness, extending smartphone battery life by 3.5 hours per charge.</w:t>
       </w:r>
     </w:p>
     <w:p>
@@ -16717,87 +13931,7 @@
           <w:color w:val="0F172A"/>
           <w:sz w:val="24"/>
         </w:rPr>
-        <w:t>Pan-India Vernacular Expansion: Expanding linguistic support beyond Marathi and Hindi to include Kannada, Telugu, Tamil, Gujarati, Bengali, and Punjabi, incorporating regional dialectal nuances and local units of measurement (</w:t>
-      </w:r>
-      <w:r>
-        <w:rPr>
-          <w:rFonts w:ascii="Times New Roman" w:hAnsi="Times New Roman"/>
-          <w:color w:val="0F172A"/>
-          <w:sz w:val="24"/>
-        </w:rPr>
-        <w:t>उदा</w:t>
-      </w:r>
-      <w:r>
-        <w:rPr>
-          <w:rFonts w:ascii="Times New Roman" w:hAnsi="Times New Roman"/>
-          <w:color w:val="0F172A"/>
-          <w:sz w:val="24"/>
-        </w:rPr>
-        <w:t xml:space="preserve">. </w:t>
-      </w:r>
-      <w:r>
-        <w:rPr>
-          <w:rFonts w:ascii="Times New Roman" w:hAnsi="Times New Roman"/>
-          <w:color w:val="0F172A"/>
-          <w:sz w:val="24"/>
-        </w:rPr>
-        <w:t>तोळा</w:t>
-      </w:r>
-      <w:r>
-        <w:rPr>
-          <w:rFonts w:ascii="Times New Roman" w:hAnsi="Times New Roman"/>
-          <w:color w:val="0F172A"/>
-          <w:sz w:val="24"/>
-        </w:rPr>
-        <w:t xml:space="preserve">, </w:t>
-      </w:r>
-      <w:r>
-        <w:rPr>
-          <w:rFonts w:ascii="Times New Roman" w:hAnsi="Times New Roman"/>
-          <w:color w:val="0F172A"/>
-          <w:sz w:val="24"/>
-        </w:rPr>
-        <w:t>गुंठा</w:t>
-      </w:r>
-      <w:r>
-        <w:rPr>
-          <w:rFonts w:ascii="Times New Roman" w:hAnsi="Times New Roman"/>
-          <w:color w:val="0F172A"/>
-          <w:sz w:val="24"/>
-        </w:rPr>
-        <w:t xml:space="preserve">, </w:t>
-      </w:r>
-      <w:r>
-        <w:rPr>
-          <w:rFonts w:ascii="Times New Roman" w:hAnsi="Times New Roman"/>
-          <w:color w:val="0F172A"/>
-          <w:sz w:val="24"/>
-        </w:rPr>
-        <w:t>शेर</w:t>
-      </w:r>
-      <w:r>
-        <w:rPr>
-          <w:rFonts w:ascii="Times New Roman" w:hAnsi="Times New Roman"/>
-          <w:color w:val="0F172A"/>
-          <w:sz w:val="24"/>
-        </w:rPr>
-        <w:t xml:space="preserve">, </w:t>
-      </w:r>
-      <w:r>
-        <w:rPr>
-          <w:rFonts w:ascii="Times New Roman" w:hAnsi="Times New Roman"/>
-          <w:color w:val="0F172A"/>
-          <w:sz w:val="24"/>
-        </w:rPr>
-        <w:t>पाव</w:t>
-      </w:r>
-      <w:r>
-        <w:rPr>
-          <w:rFonts w:ascii="Times New Roman" w:hAnsi="Times New Roman"/>
-          <w:color w:val="0F172A"/>
-          <w:sz w:val="24"/>
-        </w:rPr>
-        <w:t>).</w:t>
+        <w:t>Pan-India Vernacular Expansion: Expanding linguistic support beyond Marathi and Hindi to include Kannada, Telugu, Tamil, Gujarati, Bengali, and Punjabi, incorporating regional dialectal nuances and local units of measurement (उदा. तोळा, गुंठा, शेर, पाव).</w:t>
       </w:r>
     </w:p>
     <w:p>
@@ -17603,15 +14737,7 @@
           <w:b/>
           <w:color w:val="0F172A"/>
         </w:rPr>
-        <w:t xml:space="preserve">[4] </w:t>
-      </w:r>
-      <w:r>
-        <w:rPr>
-          <w:rFonts w:ascii="Times New Roman" w:hAnsi="Times New Roman"/>
-          <w:b/>
-          <w:color w:val="0F172A"/>
-        </w:rPr>
-        <w:t xml:space="preserve">FastAPI High-Performance Python Web Framework. </w:t>
+        <w:t xml:space="preserve">[4] FastAPI High-Performance Python Web Framework. </w:t>
       </w:r>
       <w:r>
         <w:rPr>
@@ -17761,15 +14887,7 @@
           <w:b/>
           <w:color w:val="0F172A"/>
         </w:rPr>
-        <w:t xml:space="preserve">[9] </w:t>
-      </w:r>
-      <w:r>
-        <w:rPr>
-          <w:rFonts w:ascii="Times New Roman" w:hAnsi="Times New Roman"/>
-          <w:b/>
-          <w:color w:val="0F172A"/>
-        </w:rPr>
-        <w:t xml:space="preserve">Open Network for Digital Commerce (ONDC) Official Specifications. </w:t>
+        <w:t xml:space="preserve">[9] Open Network for Digital Commerce (ONDC) Official Specifications. </w:t>
       </w:r>
       <w:r>
         <w:rPr>
@@ -17832,6 +14950,11 @@
           <w:b/>
         </w:rPr>
         <w:t>VernaLedger.AI incorporates state-of-the-art multimodal machine learning and resilient storage design:</w:t>
+      </w:r>
+      <w:r>
+        <w:rPr>
+          <w:b/>
+        </w:rPr>
         <w:br/>
       </w:r>
     </w:p>
@@ -17869,11 +14992,11 @@
       </w:r>
     </w:p>
     <w:p>
-      <w:pPr/>
       <w:r>
         <w:rPr>
           <w:b/>
         </w:rPr>
+        <w:lastRenderedPageBreak/>
         <w:t>4. Trilingual Natural Language &amp; Speech Architecture (Marathi-First, Hindi, English):</w:t>
       </w:r>
     </w:p>

</xml_diff>

<commit_message>
feat(ai-studio): upgrade all AI calls (Chatbot, Voice Billing, ASR) to Gemini 3.5 Flash with precise RAG routing and smart date guards
</commit_message>
<xml_diff>
--- a/VernaLedger_AI_Final_Year_Project_Report.docx
+++ b/VernaLedger_AI_Final_Year_Project_Report.docx
@@ -72,8 +72,8 @@
           <w:noProof/>
         </w:rPr>
         <w:drawing>
-          <wp:inline distT="0" distB="0" distL="0" distR="0" wp14:anchorId="677DEB3F" wp14:editId="64B6C466">
-            <wp:extent cx="1645920" cy="1272433"/>
+          <wp:inline distT="0" distB="0" distL="0" distR="0" wp14:anchorId="677DEB3F" wp14:editId="53D3BDC7">
+            <wp:extent cx="1644650" cy="1510145"/>
             <wp:effectExtent l="0" t="0" r="0" b="0"/>
             <wp:docPr id="1" name="Picture 1"/>
             <wp:cNvGraphicFramePr>
@@ -95,7 +95,7 @@
                   <pic:spPr>
                     <a:xfrm>
                       <a:off x="0" y="0"/>
-                      <a:ext cx="1645920" cy="1272433"/>
+                      <a:ext cx="1670916" cy="1534263"/>
                     </a:xfrm>
                     <a:prstGeom prst="rect">
                       <a:avLst/>
@@ -752,6 +752,54 @@
         <w:t>In partial fulfillment of the requirements for the award of Bachelor of Technology (B.Tech) in Artificial Intelligence &amp; Data Science (AI &amp; DS) under the Maharashtra State Board of Technical Education (MSBTE) during the academic year 2026-2027. The project report has been approved as satisfying the academic standards of the institution.</w:t>
       </w:r>
     </w:p>
+    <w:p>
+      <w:pPr>
+        <w:spacing w:after="320"/>
+        <w:jc w:val="both"/>
+      </w:pPr>
+    </w:p>
+    <w:p>
+      <w:pPr>
+        <w:spacing w:after="320"/>
+        <w:jc w:val="both"/>
+      </w:pPr>
+    </w:p>
+    <w:p>
+      <w:pPr>
+        <w:spacing w:after="320"/>
+        <w:jc w:val="both"/>
+      </w:pPr>
+    </w:p>
+    <w:p>
+      <w:pPr>
+        <w:spacing w:after="320"/>
+        <w:jc w:val="both"/>
+      </w:pPr>
+    </w:p>
+    <w:p>
+      <w:pPr>
+        <w:spacing w:after="320"/>
+        <w:jc w:val="both"/>
+      </w:pPr>
+    </w:p>
+    <w:p>
+      <w:pPr>
+        <w:spacing w:after="320"/>
+        <w:jc w:val="both"/>
+      </w:pPr>
+    </w:p>
+    <w:p>
+      <w:pPr>
+        <w:spacing w:after="320"/>
+        <w:jc w:val="both"/>
+      </w:pPr>
+    </w:p>
+    <w:p>
+      <w:pPr>
+        <w:spacing w:after="320"/>
+        <w:jc w:val="both"/>
+      </w:pPr>
+    </w:p>
     <w:tbl>
       <w:tblPr>
         <w:tblW w:w="0" w:type="auto"/>
@@ -815,25 +863,24 @@
               <w:spacing w:before="160" w:after="160"/>
               <w:jc w:val="center"/>
             </w:pPr>
-            <w:r/>
             <w:r>
               <w:rPr>
                 <w:b/>
               </w:rPr>
               <w:t>_________________________</w:t>
+            </w:r>
+            <w:r>
+              <w:rPr>
+                <w:b/>
+              </w:rPr>
               <w:br/>
+              <w:t>Dr. S. Y. Mulla</w:t>
             </w:r>
             <w:r>
               <w:rPr>
                 <w:b/>
               </w:rPr>
-              <w:t>Dr. S. Y. Mulla</w:t>
               <w:br/>
-            </w:r>
-            <w:r>
-              <w:rPr>
-                <w:b/>
-              </w:rPr>
               <w:t>Head of Department</w:t>
             </w:r>
           </w:p>
@@ -913,15 +960,26 @@
       <w:pPr>
         <w:spacing w:after="280"/>
         <w:jc w:val="center"/>
-      </w:pPr>
-      <w:r>
         <w:rPr>
           <w:rFonts w:ascii="Times New Roman" w:hAnsi="Times New Roman"/>
           <w:b/>
           <w:color w:val="0F172A"/>
           <w:sz w:val="36"/>
         </w:rPr>
-        <w:lastRenderedPageBreak/>
+      </w:pPr>
+    </w:p>
+    <w:p>
+      <w:pPr>
+        <w:spacing w:after="280"/>
+        <w:jc w:val="center"/>
+      </w:pPr>
+      <w:r>
+        <w:rPr>
+          <w:rFonts w:ascii="Times New Roman" w:hAnsi="Times New Roman"/>
+          <w:b/>
+          <w:color w:val="0F172A"/>
+          <w:sz w:val="36"/>
+        </w:rPr>
         <w:t>DECLARATION</w:t>
       </w:r>
     </w:p>
@@ -1306,15 +1364,26 @@
       <w:pPr>
         <w:spacing w:after="280"/>
         <w:jc w:val="center"/>
-      </w:pPr>
-      <w:r>
         <w:rPr>
           <w:rFonts w:ascii="Times New Roman" w:hAnsi="Times New Roman"/>
           <w:b/>
           <w:color w:val="0F172A"/>
           <w:sz w:val="36"/>
         </w:rPr>
-        <w:lastRenderedPageBreak/>
+      </w:pPr>
+    </w:p>
+    <w:p>
+      <w:pPr>
+        <w:spacing w:after="280"/>
+        <w:jc w:val="center"/>
+      </w:pPr>
+      <w:r>
+        <w:rPr>
+          <w:rFonts w:ascii="Times New Roman" w:hAnsi="Times New Roman"/>
+          <w:b/>
+          <w:color w:val="0F172A"/>
+          <w:sz w:val="36"/>
+        </w:rPr>
         <w:t>ACKNOWLEDGEMENT</w:t>
       </w:r>
     </w:p>
@@ -1434,15 +1503,26 @@
       <w:pPr>
         <w:spacing w:after="280"/>
         <w:jc w:val="center"/>
-      </w:pPr>
-      <w:r>
         <w:rPr>
           <w:rFonts w:ascii="Times New Roman" w:hAnsi="Times New Roman"/>
           <w:b/>
           <w:color w:val="0F172A"/>
           <w:sz w:val="36"/>
         </w:rPr>
-        <w:lastRenderedPageBreak/>
+      </w:pPr>
+    </w:p>
+    <w:p>
+      <w:pPr>
+        <w:spacing w:after="280"/>
+        <w:jc w:val="center"/>
+      </w:pPr>
+      <w:r>
+        <w:rPr>
+          <w:rFonts w:ascii="Times New Roman" w:hAnsi="Times New Roman"/>
+          <w:b/>
+          <w:color w:val="0F172A"/>
+          <w:sz w:val="36"/>
+        </w:rPr>
         <w:t>ABSTRACT</w:t>
       </w:r>
     </w:p>
@@ -1497,15 +1577,26 @@
       <w:pPr>
         <w:spacing w:after="280"/>
         <w:jc w:val="center"/>
-      </w:pPr>
-      <w:r>
         <w:rPr>
           <w:rFonts w:ascii="Times New Roman" w:hAnsi="Times New Roman"/>
           <w:b/>
           <w:color w:val="0F172A"/>
           <w:sz w:val="36"/>
         </w:rPr>
-        <w:lastRenderedPageBreak/>
+      </w:pPr>
+    </w:p>
+    <w:p>
+      <w:pPr>
+        <w:spacing w:after="280"/>
+        <w:jc w:val="center"/>
+      </w:pPr>
+      <w:r>
+        <w:rPr>
+          <w:rFonts w:ascii="Times New Roman" w:hAnsi="Times New Roman"/>
+          <w:b/>
+          <w:color w:val="0F172A"/>
+          <w:sz w:val="36"/>
+        </w:rPr>
         <w:t>INDEX / CONTENT</w:t>
       </w:r>
     </w:p>
@@ -2883,15 +2974,26 @@
       <w:pPr>
         <w:spacing w:after="240"/>
         <w:jc w:val="center"/>
-      </w:pPr>
-      <w:r>
         <w:rPr>
           <w:rFonts w:ascii="Times New Roman" w:hAnsi="Times New Roman"/>
           <w:b/>
           <w:color w:val="0F172A"/>
           <w:sz w:val="32"/>
         </w:rPr>
-        <w:lastRenderedPageBreak/>
+      </w:pPr>
+    </w:p>
+    <w:p>
+      <w:pPr>
+        <w:spacing w:after="240"/>
+        <w:jc w:val="center"/>
+      </w:pPr>
+      <w:r>
+        <w:rPr>
+          <w:rFonts w:ascii="Times New Roman" w:hAnsi="Times New Roman"/>
+          <w:b/>
+          <w:color w:val="0F172A"/>
+          <w:sz w:val="32"/>
+        </w:rPr>
         <w:t>LIST OF FIGURES &amp; TABLES</w:t>
       </w:r>
     </w:p>
@@ -4134,15 +4236,26 @@
       <w:pPr>
         <w:keepNext/>
         <w:spacing w:before="320" w:after="120"/>
-      </w:pPr>
-      <w:r>
         <w:rPr>
           <w:rFonts w:ascii="Times New Roman" w:hAnsi="Times New Roman"/>
           <w:b/>
           <w:color w:val="0F172A"/>
           <w:sz w:val="30"/>
         </w:rPr>
-        <w:lastRenderedPageBreak/>
+      </w:pPr>
+    </w:p>
+    <w:p>
+      <w:pPr>
+        <w:keepNext/>
+        <w:spacing w:before="320" w:after="120"/>
+      </w:pPr>
+      <w:r>
+        <w:rPr>
+          <w:rFonts w:ascii="Times New Roman" w:hAnsi="Times New Roman"/>
+          <w:b/>
+          <w:color w:val="0F172A"/>
+          <w:sz w:val="30"/>
+        </w:rPr>
         <w:t>1. INTRODUCTION</w:t>
       </w:r>
     </w:p>
@@ -4273,7 +4386,6 @@
           <w:b/>
           <w:bCs/>
         </w:rPr>
-        <w:lastRenderedPageBreak/>
         <w:t>Physical Environmental Stressors in Grassroots Indian Commerce:</w:t>
       </w:r>
     </w:p>
@@ -4430,16 +4542,8 @@
           <w:color w:val="0F172A"/>
           <w:sz w:val="24"/>
         </w:rPr>
-        <w:t xml:space="preserve">The project architecture additionally incorporates automated debt recovery via WhatsApp deep-linking. Instead of awkward manual confrontation, merchants trigger automated, polite WhatsApp </w:t>
-      </w:r>
-      <w:r>
-        <w:rPr>
-          <w:rFonts w:ascii="Times New Roman" w:hAnsi="Times New Roman"/>
-          <w:color w:val="0F172A"/>
-          <w:sz w:val="24"/>
-        </w:rPr>
         <w:lastRenderedPageBreak/>
-        <w:t>balance reminders with a single tap, embedding dynamic NPCI Unified Payments Interface (UPI) payment links. Customers can settle their outstanding balance instantly through any UPI app (Google Pay, PhonePe, Paytm, BHIM), reconciling the merchant's ledger in real time.</w:t>
+        <w:t>The project architecture additionally incorporates automated debt recovery via WhatsApp deep-linking. Instead of awkward manual confrontation, merchants trigger automated, polite WhatsApp balance reminders with a single tap, embedding dynamic NPCI Unified Payments Interface (UPI) payment links. Customers can settle their outstanding balance instantly through any UPI app (Google Pay, PhonePe, Paytm, BHIM), reconciling the merchant's ledger in real time.</w:t>
       </w:r>
     </w:p>
     <w:p>
@@ -4645,8 +4749,6 @@
     </w:p>
     <w:p>
       <w:pPr>
-        <w:keepNext/>
-        <w:spacing w:before="160" w:after="60"/>
         <w:rPr>
           <w:rFonts w:ascii="Times New Roman" w:hAnsi="Times New Roman"/>
           <w:b/>
@@ -4655,7 +4757,16 @@
         </w:rPr>
       </w:pPr>
     </w:p>
-    <w:p/>
+    <w:p>
+      <w:pPr>
+        <w:rPr>
+          <w:rFonts w:ascii="Times New Roman" w:hAnsi="Times New Roman"/>
+          <w:b/>
+          <w:color w:val="1E293B"/>
+          <w:sz w:val="24"/>
+        </w:rPr>
+      </w:pPr>
+    </w:p>
     <w:p>
       <w:pPr>
         <w:rPr>
@@ -4668,7 +4779,6 @@
           <w:b/>
           <w:bCs/>
         </w:rPr>
-        <w:lastRenderedPageBreak/>
         <w:t>Comparative Case Analysis: Paper Register vs. VernaLedger-AI Audit Trail:</w:t>
       </w:r>
     </w:p>
@@ -4822,6 +4932,39 @@
     </w:p>
     <w:p>
       <w:pPr>
+        <w:spacing w:after="120"/>
+        <w:jc w:val="both"/>
+        <w:rPr>
+          <w:rFonts w:ascii="Times New Roman" w:hAnsi="Times New Roman"/>
+          <w:color w:val="0F172A"/>
+          <w:sz w:val="24"/>
+        </w:rPr>
+      </w:pPr>
+    </w:p>
+    <w:p>
+      <w:pPr>
+        <w:spacing w:after="120"/>
+        <w:jc w:val="both"/>
+        <w:rPr>
+          <w:rFonts w:ascii="Times New Roman" w:hAnsi="Times New Roman"/>
+          <w:color w:val="0F172A"/>
+          <w:sz w:val="24"/>
+        </w:rPr>
+      </w:pPr>
+    </w:p>
+    <w:p>
+      <w:pPr>
+        <w:spacing w:after="120"/>
+        <w:jc w:val="both"/>
+        <w:rPr>
+          <w:rFonts w:ascii="Times New Roman" w:hAnsi="Times New Roman"/>
+          <w:color w:val="0F172A"/>
+          <w:sz w:val="24"/>
+        </w:rPr>
+      </w:pPr>
+    </w:p>
+    <w:p>
+      <w:pPr>
         <w:keepNext/>
         <w:spacing w:before="240" w:after="80"/>
         <w:rPr>
@@ -4831,50 +4974,14 @@
           <w:sz w:val="27"/>
         </w:rPr>
       </w:pPr>
-    </w:p>
-    <w:p>
-      <w:pPr>
-        <w:keepNext/>
-        <w:spacing w:before="240" w:after="80"/>
+      <w:r>
         <w:rPr>
           <w:rFonts w:ascii="Times New Roman" w:hAnsi="Times New Roman"/>
           <w:b/>
           <w:color w:val="0284C7"/>
           <w:sz w:val="27"/>
         </w:rPr>
-      </w:pPr>
-    </w:p>
-    <w:p/>
-    <w:p>
-      <w:pPr>
-        <w:keepNext/>
-        <w:spacing w:before="240" w:after="80"/>
-        <w:rPr>
-          <w:rFonts w:ascii="Times New Roman" w:hAnsi="Times New Roman"/>
-          <w:b/>
-          <w:color w:val="0284C7"/>
-          <w:sz w:val="27"/>
-        </w:rPr>
-      </w:pPr>
-    </w:p>
-    <w:p>
-      <w:pPr>
-        <w:keepNext/>
-        <w:spacing w:before="240" w:after="80"/>
-        <w:rPr>
-          <w:rFonts w:ascii="Times New Roman" w:hAnsi="Times New Roman"/>
-          <w:b/>
-          <w:color w:val="0284C7"/>
-          <w:sz w:val="27"/>
-        </w:rPr>
-      </w:pPr>
-      <w:r>
-        <w:rPr>
-          <w:rFonts w:ascii="Times New Roman" w:hAnsi="Times New Roman"/>
-          <w:b/>
-          <w:color w:val="0284C7"/>
-          <w:sz w:val="27"/>
-        </w:rPr>
+        <w:lastRenderedPageBreak/>
         <w:t>1.3 Need</w:t>
       </w:r>
     </w:p>
@@ -4889,7 +4996,25 @@
           <w:color w:val="0F172A"/>
           <w:sz w:val="24"/>
         </w:rPr>
-        <w:t>The necessity of VernaLedger-AI is established through five indispensable operational requirements of Indian micro-commerce:</w:t>
+        <w:t xml:space="preserve">The necessity of </w:t>
+      </w:r>
+      <w:proofErr w:type="spellStart"/>
+      <w:r>
+        <w:rPr>
+          <w:rFonts w:ascii="Times New Roman" w:hAnsi="Times New Roman"/>
+          <w:color w:val="0F172A"/>
+          <w:sz w:val="24"/>
+        </w:rPr>
+        <w:t>VernaLedger</w:t>
+      </w:r>
+      <w:proofErr w:type="spellEnd"/>
+      <w:r>
+        <w:rPr>
+          <w:rFonts w:ascii="Times New Roman" w:hAnsi="Times New Roman"/>
+          <w:color w:val="0F172A"/>
+          <w:sz w:val="24"/>
+        </w:rPr>
+        <w:t>-AI is established through five indispensable operational requirements of Indian micro-commerce:</w:t>
       </w:r>
     </w:p>
     <w:p>
@@ -5356,12 +5481,12 @@
       <w:tblGrid>
         <w:gridCol w:w="1488"/>
         <w:gridCol w:w="1511"/>
-        <w:gridCol w:w="1268"/>
-        <w:gridCol w:w="1285"/>
-        <w:gridCol w:w="1009"/>
-        <w:gridCol w:w="906"/>
-        <w:gridCol w:w="1254"/>
-        <w:gridCol w:w="1244"/>
+        <w:gridCol w:w="1269"/>
+        <w:gridCol w:w="1286"/>
+        <w:gridCol w:w="1010"/>
+        <w:gridCol w:w="907"/>
+        <w:gridCol w:w="1255"/>
+        <w:gridCol w:w="1245"/>
       </w:tblGrid>
       <w:tr>
         <w:trPr>
@@ -6883,10 +7008,10 @@
       </w:tblPr>
       <w:tblGrid>
         <w:gridCol w:w="1928"/>
-        <w:gridCol w:w="2467"/>
-        <w:gridCol w:w="2487"/>
-        <w:gridCol w:w="1384"/>
-        <w:gridCol w:w="1699"/>
+        <w:gridCol w:w="2469"/>
+        <w:gridCol w:w="2489"/>
+        <w:gridCol w:w="1385"/>
+        <w:gridCol w:w="1700"/>
       </w:tblGrid>
       <w:tr>
         <w:trPr>
@@ -7867,11 +7992,11 @@
         <w:tblLook w:val="04A0" w:firstRow="1" w:lastRow="0" w:firstColumn="1" w:lastColumn="0" w:noHBand="0" w:noVBand="1"/>
       </w:tblPr>
       <w:tblGrid>
-        <w:gridCol w:w="1570"/>
-        <w:gridCol w:w="1706"/>
-        <w:gridCol w:w="1708"/>
-        <w:gridCol w:w="2827"/>
-        <w:gridCol w:w="2154"/>
+        <w:gridCol w:w="1571"/>
+        <w:gridCol w:w="1707"/>
+        <w:gridCol w:w="1709"/>
+        <w:gridCol w:w="2829"/>
+        <w:gridCol w:w="2155"/>
       </w:tblGrid>
       <w:tr>
         <w:trPr>
@@ -8567,10 +8692,10 @@
       </w:tblPr>
       <w:tblGrid>
         <w:gridCol w:w="2375"/>
-        <w:gridCol w:w="1229"/>
-        <w:gridCol w:w="2092"/>
-        <w:gridCol w:w="2126"/>
-        <w:gridCol w:w="2143"/>
+        <w:gridCol w:w="1230"/>
+        <w:gridCol w:w="2094"/>
+        <w:gridCol w:w="2127"/>
+        <w:gridCol w:w="2145"/>
       </w:tblGrid>
       <w:tr>
         <w:trPr>
@@ -10334,12 +10459,12 @@
         <w:tblLook w:val="04A0" w:firstRow="1" w:lastRow="0" w:firstColumn="1" w:lastColumn="0" w:noHBand="0" w:noVBand="1"/>
       </w:tblPr>
       <w:tblGrid>
-        <w:gridCol w:w="2556"/>
+        <w:gridCol w:w="2558"/>
         <w:gridCol w:w="1145"/>
-        <w:gridCol w:w="1572"/>
-        <w:gridCol w:w="1570"/>
-        <w:gridCol w:w="1700"/>
-        <w:gridCol w:w="1422"/>
+        <w:gridCol w:w="1573"/>
+        <w:gridCol w:w="1571"/>
+        <w:gridCol w:w="1701"/>
+        <w:gridCol w:w="1423"/>
       </w:tblGrid>
       <w:tr>
         <w:trPr>
@@ -11201,11 +11326,11 @@
         <w:tblLook w:val="04A0" w:firstRow="1" w:lastRow="0" w:firstColumn="1" w:lastColumn="0" w:noHBand="0" w:noVBand="1"/>
       </w:tblPr>
       <w:tblGrid>
-        <w:gridCol w:w="2561"/>
-        <w:gridCol w:w="1567"/>
-        <w:gridCol w:w="1567"/>
-        <w:gridCol w:w="1567"/>
-        <w:gridCol w:w="2703"/>
+        <w:gridCol w:w="2563"/>
+        <w:gridCol w:w="1568"/>
+        <w:gridCol w:w="1568"/>
+        <w:gridCol w:w="1568"/>
+        <w:gridCol w:w="2704"/>
       </w:tblGrid>
       <w:tr>
         <w:trPr>
@@ -12236,11 +12361,11 @@
         <w:tblLook w:val="04A0" w:firstRow="1" w:lastRow="0" w:firstColumn="1" w:lastColumn="0" w:noHBand="0" w:noVBand="1"/>
       </w:tblPr>
       <w:tblGrid>
-        <w:gridCol w:w="2073"/>
-        <w:gridCol w:w="2483"/>
-        <w:gridCol w:w="1501"/>
+        <w:gridCol w:w="2075"/>
+        <w:gridCol w:w="2485"/>
+        <w:gridCol w:w="1502"/>
         <w:gridCol w:w="1687"/>
-        <w:gridCol w:w="2221"/>
+        <w:gridCol w:w="2222"/>
       </w:tblGrid>
       <w:tr>
         <w:trPr>
@@ -15002,7 +15127,10 @@
     </w:p>
     <w:p>
       <w:r>
-        <w:t>VernaLedger.AI features a native trilingual operating model enabling dynamic language switching between Marathi, Hindi, and English. The vernacular ASR system accurately handles localized accents (Satari, Kolhapuri, Puneri) and converts spoken sentences into structured billing items within 1.2 seconds. The backend implements dual Studio Neural TTS (Microsoft Edge Neural TTS: mr-IN-AarohiNeural for Marathi, hi-IN-SwaraNeural for Hindi, and en-IN-NeerjaNeural for English) with a high-speed chunked Google Neural TTS fallback, eliminating Windows robotic speech and latency.</w:t>
+        <w:t>VernaLedger.AI features a native trilingual operating model enabling dynamic language switching between Marathi, Hindi, and English. The vernacular ASR system accurately handles localized accents (Satari, Kolhapuri, Puneri) and converts spoken sentences into structured billing items within 1.2 seconds. The backend implements dual Studio Neural TTS (Microsoft Edge Neural TTS: mr-IN-AarohiNeural for Marathi, hi-IN-SwaraNeural for Hindi, and en-IN-NeerjaNeural for English) with a high-speed chunked Google Neur</w:t>
+      </w:r>
+      <w:r>
+        <w:t>al TTS fallback, eliminating Windows robotic speech and latency.</w:t>
       </w:r>
     </w:p>
     <w:p>
@@ -15035,7 +15163,7 @@
       <w:headerReference w:type="default" r:id="rId18"/>
       <w:footerReference w:type="default" r:id="rId19"/>
       <w:pgSz w:w="11909" w:h="16834"/>
-      <w:pgMar w:top="1008" w:right="1080" w:bottom="1008" w:left="1080" w:header="720" w:footer="720" w:gutter="0"/>
+      <w:pgMar w:top="1009" w:right="1077" w:bottom="1009" w:left="1077" w:header="567" w:footer="720" w:gutter="0"/>
       <w:pgBorders w:offsetFrom="page">
         <w:top w:val="double" w:sz="12" w:space="20" w:color="000000"/>
         <w:left w:val="double" w:sz="12" w:space="20" w:color="000000"/>

</xml_diff>